<commit_message>
docs: estructura del repositorio corregida en la documentacion
</commit_message>
<xml_diff>
--- a/docs/Reporte-landing-page.docx
+++ b/docs/Reporte-landing-page.docx
@@ -5954,14 +5954,7 @@
           <w:rFonts w:ascii="Cambria" w:hAnsi="Cambria"/>
           <w:lang w:val="en-US"/>
         </w:rPr>
-        <w:t>docs</w:t>
-      </w:r>
-      <w:r>
-        <w:rPr>
-          <w:rFonts w:ascii="Cambria" w:hAnsi="Cambria"/>
-          <w:lang w:val="en-US"/>
-        </w:rPr>
-        <w:t>/</w:t>
+        <w:t>left-sidebar.html</w:t>
       </w:r>
     </w:p>
     <w:p>
@@ -5970,16 +5963,40 @@
         <w:ind w:left="708"/>
         <w:rPr>
           <w:rFonts w:ascii="Cambria" w:hAnsi="Cambria"/>
+          <w:lang w:val="es-MX"/>
+        </w:rPr>
+      </w:pPr>
+      <w:r>
+        <w:rPr>
+          <w:rFonts w:ascii="Cambria" w:hAnsi="Cambria" w:cs="Calibri"/>
+          <w:lang w:val="es-MX"/>
+        </w:rPr>
+        <w:t>─</w:t>
+      </w:r>
+      <w:r>
+        <w:rPr>
+          <w:rFonts w:ascii="Cambria" w:hAnsi="Cambria"/>
+          <w:lang w:val="es-MX"/>
+        </w:rPr>
+        <w:t xml:space="preserve"> </w:t>
+      </w:r>
+      <w:r>
+        <w:rPr>
+          <w:rFonts w:ascii="Cambria" w:hAnsi="Cambria"/>
+          <w:lang w:val="es-MX"/>
+        </w:rPr>
+        <w:t>no-sidebar.html</w:t>
+      </w:r>
+    </w:p>
+    <w:p>
+      <w:pPr>
+        <w:spacing w:line="180" w:lineRule="auto"/>
+        <w:ind w:left="708"/>
+        <w:rPr>
+          <w:rFonts w:ascii="Cambria" w:hAnsi="Cambria"/>
           <w:lang w:val="en-US"/>
         </w:rPr>
       </w:pPr>
-      <w:r>
-        <w:rPr>
-          <w:rFonts w:ascii="Cambria" w:hAnsi="Cambria"/>
-          <w:lang w:val="en-US"/>
-        </w:rPr>
-        <w:t xml:space="preserve"> </w:t>
-      </w:r>
       <w:r>
         <w:rPr>
           <w:rFonts w:ascii="Cambria" w:hAnsi="Cambria" w:cs="Calibri"/>
@@ -5992,7 +6009,14 @@
           <w:rFonts w:ascii="Cambria" w:hAnsi="Cambria"/>
           <w:lang w:val="en-US"/>
         </w:rPr>
-        <w:t xml:space="preserve"> css/</w:t>
+        <w:t xml:space="preserve"> </w:t>
+      </w:r>
+      <w:r>
+        <w:rPr>
+          <w:rFonts w:ascii="Cambria" w:hAnsi="Cambria"/>
+          <w:lang w:val="en-US"/>
+        </w:rPr>
+        <w:t>right-sidebar.html</w:t>
       </w:r>
     </w:p>
     <w:p>
@@ -6006,20 +6030,232 @@
       </w:pPr>
       <w:r>
         <w:rPr>
-          <w:rFonts w:ascii="Cambria" w:hAnsi="Cambria"/>
+          <w:rFonts w:ascii="Cambria" w:hAnsi="Cambria" w:cs="Calibri"/>
           <w:lang w:val="en-US"/>
         </w:rPr>
+        <w:t>─</w:t>
+      </w:r>
+      <w:r>
+        <w:rPr>
+          <w:rFonts w:ascii="Cambria" w:hAnsi="Cambria"/>
+          <w:lang w:val="en-US"/>
+        </w:rPr>
+        <w:t xml:space="preserve"> docs/</w:t>
+      </w:r>
+    </w:p>
+    <w:p>
+      <w:pPr>
+        <w:spacing w:line="180" w:lineRule="auto"/>
+        <w:rPr>
+          <w:rFonts w:ascii="Cambria" w:hAnsi="Cambria"/>
+          <w:lang w:val="en-US"/>
+        </w:rPr>
+      </w:pPr>
+      <w:r>
+        <w:rPr>
+          <w:rFonts w:ascii="Cambria" w:hAnsi="Cambria"/>
+          <w:lang w:val="en-US"/>
+        </w:rPr>
+        <w:t xml:space="preserve"> </w:t>
+      </w:r>
+      <w:r>
+        <w:rPr>
+          <w:rFonts w:ascii="Cambria" w:hAnsi="Cambria"/>
+          <w:lang w:val="en-US"/>
+        </w:rPr>
+        <w:tab/>
+      </w:r>
+      <w:r>
+        <w:rPr>
+          <w:rFonts w:ascii="Cambria" w:hAnsi="Cambria" w:cs="Calibri"/>
+          <w:lang w:val="en-US"/>
+        </w:rPr>
+        <w:t>─</w:t>
+      </w:r>
+      <w:r>
+        <w:rPr>
+          <w:rFonts w:ascii="Cambria" w:hAnsi="Cambria"/>
+          <w:lang w:val="en-US"/>
+        </w:rPr>
+        <w:t xml:space="preserve"> </w:t>
+      </w:r>
+      <w:r>
+        <w:rPr>
+          <w:rFonts w:ascii="Cambria" w:hAnsi="Cambria"/>
+          <w:lang w:val="en-US"/>
+        </w:rPr>
+        <w:t>assets/</w:t>
+      </w:r>
+    </w:p>
+    <w:p>
+      <w:pPr>
+        <w:spacing w:line="180" w:lineRule="auto"/>
+        <w:rPr>
+          <w:rFonts w:ascii="Cambria" w:hAnsi="Cambria"/>
+          <w:lang w:val="en-US"/>
+        </w:rPr>
+      </w:pPr>
+      <w:r>
+        <w:rPr>
+          <w:rFonts w:ascii="Cambria" w:hAnsi="Cambria"/>
+          <w:lang w:val="en-US"/>
+        </w:rPr>
+        <w:tab/>
+      </w:r>
+      <w:r>
+        <w:rPr>
+          <w:rFonts w:ascii="Cambria" w:hAnsi="Cambria"/>
+          <w:lang w:val="en-US"/>
+        </w:rPr>
+        <w:tab/>
+      </w:r>
+      <w:r>
+        <w:rPr>
+          <w:rFonts w:ascii="Cambria" w:hAnsi="Cambria" w:cs="Calibri"/>
+          <w:lang w:val="en-US"/>
+        </w:rPr>
+        <w:t>─</w:t>
+      </w:r>
+      <w:r>
+        <w:rPr>
+          <w:rFonts w:ascii="Cambria" w:hAnsi="Cambria"/>
+          <w:lang w:val="en-US"/>
+        </w:rPr>
+        <w:t xml:space="preserve"> </w:t>
+      </w:r>
+      <w:r>
+        <w:rPr>
+          <w:rFonts w:ascii="Cambria" w:hAnsi="Cambria"/>
+          <w:lang w:val="en-US"/>
+        </w:rPr>
+        <w:t>css</w:t>
+      </w:r>
+      <w:r>
+        <w:rPr>
+          <w:rFonts w:ascii="Cambria" w:hAnsi="Cambria"/>
+          <w:lang w:val="en-US"/>
+        </w:rPr>
+        <w:t>/</w:t>
+      </w:r>
+    </w:p>
+    <w:p>
+      <w:pPr>
+        <w:spacing w:line="180" w:lineRule="auto"/>
+        <w:rPr>
+          <w:rFonts w:ascii="Cambria" w:hAnsi="Cambria"/>
+          <w:lang w:val="en-US"/>
+        </w:rPr>
+      </w:pPr>
+      <w:r>
+        <w:rPr>
+          <w:rFonts w:ascii="Cambria" w:hAnsi="Cambria"/>
+          <w:lang w:val="en-US"/>
+        </w:rPr>
+        <w:tab/>
+      </w:r>
+      <w:r>
+        <w:rPr>
+          <w:rFonts w:ascii="Cambria" w:hAnsi="Cambria"/>
+          <w:lang w:val="en-US"/>
+        </w:rPr>
+        <w:tab/>
+      </w:r>
+      <w:r>
+        <w:rPr>
+          <w:rFonts w:ascii="Cambria" w:hAnsi="Cambria" w:cs="Calibri"/>
+          <w:lang w:val="en-US"/>
+        </w:rPr>
+        <w:t>─</w:t>
+      </w:r>
+      <w:r>
+        <w:rPr>
+          <w:rFonts w:ascii="Cambria" w:hAnsi="Cambria"/>
+          <w:lang w:val="en-US"/>
+        </w:rPr>
+        <w:t xml:space="preserve"> </w:t>
+      </w:r>
+      <w:r>
+        <w:rPr>
+          <w:rFonts w:ascii="Cambria" w:hAnsi="Cambria"/>
+          <w:lang w:val="en-US"/>
+        </w:rPr>
+        <w:t>js</w:t>
+      </w:r>
+      <w:r>
+        <w:rPr>
+          <w:rFonts w:ascii="Cambria" w:hAnsi="Cambria"/>
+          <w:lang w:val="en-US"/>
+        </w:rPr>
+        <w:t>/</w:t>
+      </w:r>
+    </w:p>
+    <w:p>
+      <w:pPr>
+        <w:spacing w:line="180" w:lineRule="auto"/>
+        <w:rPr>
+          <w:rFonts w:ascii="Cambria" w:hAnsi="Cambria"/>
+          <w:lang w:val="en-US"/>
+        </w:rPr>
+      </w:pPr>
+      <w:r>
+        <w:rPr>
+          <w:rFonts w:ascii="Cambria" w:hAnsi="Cambria"/>
+          <w:lang w:val="en-US"/>
+        </w:rPr>
+        <w:tab/>
+      </w:r>
+      <w:r>
+        <w:rPr>
+          <w:rFonts w:ascii="Cambria" w:hAnsi="Cambria"/>
+          <w:lang w:val="en-US"/>
+        </w:rPr>
+        <w:tab/>
+      </w:r>
+      <w:r>
+        <w:rPr>
+          <w:rFonts w:ascii="Cambria" w:hAnsi="Cambria" w:cs="Calibri"/>
+          <w:lang w:val="en-US"/>
+        </w:rPr>
+        <w:t>─</w:t>
+      </w:r>
+      <w:r>
+        <w:rPr>
+          <w:rFonts w:ascii="Cambria" w:hAnsi="Cambria"/>
+          <w:lang w:val="en-US"/>
+        </w:rPr>
+        <w:t xml:space="preserve"> </w:t>
+      </w:r>
+      <w:r>
+        <w:rPr>
+          <w:rFonts w:ascii="Cambria" w:hAnsi="Cambria"/>
+          <w:lang w:val="en-US"/>
+        </w:rPr>
+        <w:t>webfonts</w:t>
+      </w:r>
+      <w:r>
+        <w:rPr>
+          <w:rFonts w:ascii="Cambria" w:hAnsi="Cambria"/>
+          <w:lang w:val="en-US"/>
+        </w:rPr>
+        <w:t>/</w:t>
+      </w:r>
+    </w:p>
+    <w:p>
+      <w:pPr>
+        <w:spacing w:line="180" w:lineRule="auto"/>
+        <w:ind w:left="708"/>
+        <w:rPr>
+          <w:rFonts w:ascii="Cambria" w:hAnsi="Cambria"/>
+          <w:lang w:val="en-US"/>
+        </w:rPr>
+      </w:pPr>
+      <w:r>
+        <w:rPr>
+          <w:rFonts w:ascii="Cambria" w:hAnsi="Cambria"/>
+          <w:lang w:val="en-US"/>
+        </w:rPr>
         <w:t>─ images/</w:t>
       </w:r>
-    </w:p>
-    <w:p>
-      <w:pPr>
-        <w:spacing w:line="180" w:lineRule="auto"/>
-        <w:rPr>
-          <w:rFonts w:ascii="Cambria" w:hAnsi="Cambria"/>
-          <w:lang w:val="en-US"/>
-        </w:rPr>
-      </w:pPr>
     </w:p>
     <w:p>
       <w:pPr>
@@ -6385,6 +6621,7 @@
         <w:rPr>
           <w:lang w:val="es-EC"/>
         </w:rPr>
+        <w:lastRenderedPageBreak/>
         <w:t>Despliegue</w:t>
       </w:r>
       <w:bookmarkEnd w:id="17"/>
@@ -6463,7 +6700,6 @@
           <w:rFonts w:ascii="Cambria" w:hAnsi="Cambria"/>
           <w:lang w:val="es-EC"/>
         </w:rPr>
-        <w:lastRenderedPageBreak/>
         <w:t>URL de la landing page: ________________</w:t>
       </w:r>
     </w:p>
@@ -7655,6 +7891,118 @@
     </w:lvl>
   </w:abstractNum>
   <w:abstractNum w:abstractNumId="6" w15:restartNumberingAfterBreak="0">
+    <w:nsid w:val="35C80A94"/>
+    <w:multiLevelType w:val="hybridMultilevel"/>
+    <w:tmpl w:val="68D665BA"/>
+    <w:lvl w:ilvl="0" w:tplc="99BC3486">
+      <w:numFmt w:val="bullet"/>
+      <w:lvlText w:val="-"/>
+      <w:lvlJc w:val="left"/>
+      <w:pPr>
+        <w:ind w:left="1773" w:hanging="360"/>
+      </w:pPr>
+      <w:rPr>
+        <w:rFonts w:ascii="Cambria" w:eastAsiaTheme="minorHAnsi" w:hAnsi="Cambria" w:cstheme="minorBidi" w:hint="default"/>
+      </w:rPr>
+    </w:lvl>
+    <w:lvl w:ilvl="1" w:tplc="080A0003" w:tentative="1">
+      <w:start w:val="1"/>
+      <w:numFmt w:val="bullet"/>
+      <w:lvlText w:val="o"/>
+      <w:lvlJc w:val="left"/>
+      <w:pPr>
+        <w:ind w:left="2493" w:hanging="360"/>
+      </w:pPr>
+      <w:rPr>
+        <w:rFonts w:ascii="Courier New" w:hAnsi="Courier New" w:cs="Courier New" w:hint="default"/>
+      </w:rPr>
+    </w:lvl>
+    <w:lvl w:ilvl="2" w:tplc="080A0005" w:tentative="1">
+      <w:start w:val="1"/>
+      <w:numFmt w:val="bullet"/>
+      <w:lvlText w:val=""/>
+      <w:lvlJc w:val="left"/>
+      <w:pPr>
+        <w:ind w:left="3213" w:hanging="360"/>
+      </w:pPr>
+      <w:rPr>
+        <w:rFonts w:ascii="Wingdings" w:hAnsi="Wingdings" w:hint="default"/>
+      </w:rPr>
+    </w:lvl>
+    <w:lvl w:ilvl="3" w:tplc="080A0001" w:tentative="1">
+      <w:start w:val="1"/>
+      <w:numFmt w:val="bullet"/>
+      <w:lvlText w:val=""/>
+      <w:lvlJc w:val="left"/>
+      <w:pPr>
+        <w:ind w:left="3933" w:hanging="360"/>
+      </w:pPr>
+      <w:rPr>
+        <w:rFonts w:ascii="Symbol" w:hAnsi="Symbol" w:hint="default"/>
+      </w:rPr>
+    </w:lvl>
+    <w:lvl w:ilvl="4" w:tplc="080A0003" w:tentative="1">
+      <w:start w:val="1"/>
+      <w:numFmt w:val="bullet"/>
+      <w:lvlText w:val="o"/>
+      <w:lvlJc w:val="left"/>
+      <w:pPr>
+        <w:ind w:left="4653" w:hanging="360"/>
+      </w:pPr>
+      <w:rPr>
+        <w:rFonts w:ascii="Courier New" w:hAnsi="Courier New" w:cs="Courier New" w:hint="default"/>
+      </w:rPr>
+    </w:lvl>
+    <w:lvl w:ilvl="5" w:tplc="080A0005" w:tentative="1">
+      <w:start w:val="1"/>
+      <w:numFmt w:val="bullet"/>
+      <w:lvlText w:val=""/>
+      <w:lvlJc w:val="left"/>
+      <w:pPr>
+        <w:ind w:left="5373" w:hanging="360"/>
+      </w:pPr>
+      <w:rPr>
+        <w:rFonts w:ascii="Wingdings" w:hAnsi="Wingdings" w:hint="default"/>
+      </w:rPr>
+    </w:lvl>
+    <w:lvl w:ilvl="6" w:tplc="080A0001" w:tentative="1">
+      <w:start w:val="1"/>
+      <w:numFmt w:val="bullet"/>
+      <w:lvlText w:val=""/>
+      <w:lvlJc w:val="left"/>
+      <w:pPr>
+        <w:ind w:left="6093" w:hanging="360"/>
+      </w:pPr>
+      <w:rPr>
+        <w:rFonts w:ascii="Symbol" w:hAnsi="Symbol" w:hint="default"/>
+      </w:rPr>
+    </w:lvl>
+    <w:lvl w:ilvl="7" w:tplc="080A0003" w:tentative="1">
+      <w:start w:val="1"/>
+      <w:numFmt w:val="bullet"/>
+      <w:lvlText w:val="o"/>
+      <w:lvlJc w:val="left"/>
+      <w:pPr>
+        <w:ind w:left="6813" w:hanging="360"/>
+      </w:pPr>
+      <w:rPr>
+        <w:rFonts w:ascii="Courier New" w:hAnsi="Courier New" w:cs="Courier New" w:hint="default"/>
+      </w:rPr>
+    </w:lvl>
+    <w:lvl w:ilvl="8" w:tplc="080A0005" w:tentative="1">
+      <w:start w:val="1"/>
+      <w:numFmt w:val="bullet"/>
+      <w:lvlText w:val=""/>
+      <w:lvlJc w:val="left"/>
+      <w:pPr>
+        <w:ind w:left="7533" w:hanging="360"/>
+      </w:pPr>
+      <w:rPr>
+        <w:rFonts w:ascii="Wingdings" w:hAnsi="Wingdings" w:hint="default"/>
+      </w:rPr>
+    </w:lvl>
+  </w:abstractNum>
+  <w:abstractNum w:abstractNumId="7" w15:restartNumberingAfterBreak="0">
     <w:nsid w:val="389266E5"/>
     <w:multiLevelType w:val="multilevel"/>
     <w:tmpl w:val="5C549F0E"/>
@@ -7803,7 +8151,7 @@
       </w:rPr>
     </w:lvl>
   </w:abstractNum>
-  <w:abstractNum w:abstractNumId="7" w15:restartNumberingAfterBreak="0">
+  <w:abstractNum w:abstractNumId="8" w15:restartNumberingAfterBreak="0">
     <w:nsid w:val="3F944F3E"/>
     <w:multiLevelType w:val="hybridMultilevel"/>
     <w:tmpl w:val="030AFD6C"/>
@@ -7916,7 +8264,7 @@
       </w:rPr>
     </w:lvl>
   </w:abstractNum>
-  <w:abstractNum w:abstractNumId="8" w15:restartNumberingAfterBreak="0">
+  <w:abstractNum w:abstractNumId="9" w15:restartNumberingAfterBreak="0">
     <w:nsid w:val="451029D3"/>
     <w:multiLevelType w:val="multilevel"/>
     <w:tmpl w:val="625268B0"/>
@@ -8029,7 +8377,7 @@
       </w:rPr>
     </w:lvl>
   </w:abstractNum>
-  <w:abstractNum w:abstractNumId="9" w15:restartNumberingAfterBreak="0">
+  <w:abstractNum w:abstractNumId="10" w15:restartNumberingAfterBreak="0">
     <w:nsid w:val="458E0E2F"/>
     <w:multiLevelType w:val="hybridMultilevel"/>
     <w:tmpl w:val="C8E0DD8E"/>
@@ -8142,7 +8490,7 @@
       </w:rPr>
     </w:lvl>
   </w:abstractNum>
-  <w:abstractNum w:abstractNumId="10" w15:restartNumberingAfterBreak="0">
+  <w:abstractNum w:abstractNumId="11" w15:restartNumberingAfterBreak="0">
     <w:nsid w:val="45D24FC6"/>
     <w:multiLevelType w:val="hybridMultilevel"/>
     <w:tmpl w:val="45704E28"/>
@@ -8255,7 +8603,7 @@
       </w:rPr>
     </w:lvl>
   </w:abstractNum>
-  <w:abstractNum w:abstractNumId="11" w15:restartNumberingAfterBreak="0">
+  <w:abstractNum w:abstractNumId="12" w15:restartNumberingAfterBreak="0">
     <w:nsid w:val="4C644F72"/>
     <w:multiLevelType w:val="hybridMultilevel"/>
     <w:tmpl w:val="1D28D420"/>
@@ -8367,7 +8715,7 @@
       </w:rPr>
     </w:lvl>
   </w:abstractNum>
-  <w:abstractNum w:abstractNumId="12" w15:restartNumberingAfterBreak="0">
+  <w:abstractNum w:abstractNumId="13" w15:restartNumberingAfterBreak="0">
     <w:nsid w:val="7FE72621"/>
     <w:multiLevelType w:val="hybridMultilevel"/>
     <w:tmpl w:val="182A86E6"/>
@@ -8496,28 +8844,31 @@
     <w:abstractNumId w:val="5"/>
   </w:num>
   <w:num w:numId="6">
-    <w:abstractNumId w:val="6"/>
+    <w:abstractNumId w:val="7"/>
   </w:num>
   <w:num w:numId="7">
+    <w:abstractNumId w:val="9"/>
+  </w:num>
+  <w:num w:numId="8">
     <w:abstractNumId w:val="8"/>
   </w:num>
-  <w:num w:numId="8">
-    <w:abstractNumId w:val="7"/>
-  </w:num>
   <w:num w:numId="9">
-    <w:abstractNumId w:val="9"/>
+    <w:abstractNumId w:val="10"/>
   </w:num>
   <w:num w:numId="10">
-    <w:abstractNumId w:val="12"/>
+    <w:abstractNumId w:val="13"/>
   </w:num>
   <w:num w:numId="11">
     <w:abstractNumId w:val="2"/>
   </w:num>
   <w:num w:numId="12">
-    <w:abstractNumId w:val="10"/>
+    <w:abstractNumId w:val="11"/>
   </w:num>
   <w:num w:numId="13">
-    <w:abstractNumId w:val="11"/>
+    <w:abstractNumId w:val="12"/>
+  </w:num>
+  <w:num w:numId="14">
+    <w:abstractNumId w:val="6"/>
   </w:num>
 </w:numbering>
 </file>

</xml_diff>

<commit_message>
docs: Implementar enlace de GitHub´Pages en el documento de reporte
</commit_message>
<xml_diff>
--- a/docs/Reporte-landing-page.docx
+++ b/docs/Reporte-landing-page.docx
@@ -1,6 +1,6 @@
 
 <file path=word/document.xml><?xml version="1.0" encoding="utf-8"?>
-<w:document xmlns:wpc="http://schemas.microsoft.com/office/word/2010/wordprocessingCanvas" xmlns:cx="http://schemas.microsoft.com/office/drawing/2014/chartex" xmlns:cx1="http://schemas.microsoft.com/office/drawing/2015/9/8/chartex" xmlns:cx2="http://schemas.microsoft.com/office/drawing/2015/10/21/chartex" xmlns:cx3="http://schemas.microsoft.com/office/drawing/2016/5/9/chartex" xmlns:cx4="http://schemas.microsoft.com/office/drawing/2016/5/10/chartex" xmlns:cx5="http://schemas.microsoft.com/office/drawing/2016/5/11/chartex" xmlns:cx6="http://schemas.microsoft.com/office/drawing/2016/5/12/chartex" xmlns:cx7="http://schemas.microsoft.com/office/drawing/2016/5/13/chartex" xmlns:cx8="http://schemas.microsoft.com/office/drawing/2016/5/14/chartex" xmlns:mc="http://schemas.openxmlformats.org/markup-compatibility/2006" xmlns:aink="http://schemas.microsoft.com/office/drawing/2016/ink" xmlns:am3d="http://schemas.microsoft.com/office/drawing/2017/model3d" xmlns:o="urn:schemas-microsoft-com:office:office" xmlns:r="http://schemas.openxmlformats.org/officeDocument/2006/relationships" xmlns:m="http://schemas.openxmlformats.org/officeDocument/2006/math" xmlns:v="urn:schemas-microsoft-com:vml" xmlns:wp14="http://schemas.microsoft.com/office/word/2010/wordprocessingDrawing" xmlns:wp="http://schemas.openxmlformats.org/drawingml/2006/wordprocessingDrawing" xmlns:w10="urn:schemas-microsoft-com:office:word" xmlns:w="http://schemas.openxmlformats.org/wordprocessingml/2006/main" xmlns:w14="http://schemas.microsoft.com/office/word/2010/wordml" xmlns:w15="http://schemas.microsoft.com/office/word/2012/wordml" xmlns:w16cex="http://schemas.microsoft.com/office/word/2018/wordml/cex" xmlns:w16cid="http://schemas.microsoft.com/office/word/2016/wordml/cid" xmlns:w16="http://schemas.microsoft.com/office/word/2018/wordml" xmlns:w16sdtdh="http://schemas.microsoft.com/office/word/2020/wordml/sdtdatahash" xmlns:w16se="http://schemas.microsoft.com/office/word/2015/wordml/symex" xmlns:wpg="http://schemas.microsoft.com/office/word/2010/wordprocessingGroup" xmlns:wpi="http://schemas.microsoft.com/office/word/2010/wordprocessingInk" xmlns:wne="http://schemas.microsoft.com/office/word/2006/wordml" xmlns:wps="http://schemas.microsoft.com/office/word/2010/wordprocessingShape" mc:Ignorable="w14 w15 w16se w16cid w16 w16cex w16sdtdh wp14">
+<w:document xmlns:wpc="http://schemas.microsoft.com/office/word/2010/wordprocessingCanvas" xmlns:cx="http://schemas.microsoft.com/office/drawing/2014/chartex" xmlns:cx1="http://schemas.microsoft.com/office/drawing/2015/9/8/chartex" xmlns:cx2="http://schemas.microsoft.com/office/drawing/2015/10/21/chartex" xmlns:cx3="http://schemas.microsoft.com/office/drawing/2016/5/9/chartex" xmlns:cx4="http://schemas.microsoft.com/office/drawing/2016/5/10/chartex" xmlns:cx5="http://schemas.microsoft.com/office/drawing/2016/5/11/chartex" xmlns:cx6="http://schemas.microsoft.com/office/drawing/2016/5/12/chartex" xmlns:cx7="http://schemas.microsoft.com/office/drawing/2016/5/13/chartex" xmlns:cx8="http://schemas.microsoft.com/office/drawing/2016/5/14/chartex" xmlns:mc="http://schemas.openxmlformats.org/markup-compatibility/2006" xmlns:aink="http://schemas.microsoft.com/office/drawing/2016/ink" xmlns:am3d="http://schemas.microsoft.com/office/drawing/2017/model3d" xmlns:o="urn:schemas-microsoft-com:office:office" xmlns:oel="http://schemas.microsoft.com/office/2019/extlst" xmlns:r="http://schemas.openxmlformats.org/officeDocument/2006/relationships" xmlns:m="http://schemas.openxmlformats.org/officeDocument/2006/math" xmlns:v="urn:schemas-microsoft-com:vml" xmlns:wp14="http://schemas.microsoft.com/office/word/2010/wordprocessingDrawing" xmlns:wp="http://schemas.openxmlformats.org/drawingml/2006/wordprocessingDrawing" xmlns:w10="urn:schemas-microsoft-com:office:word" xmlns:w="http://schemas.openxmlformats.org/wordprocessingml/2006/main" xmlns:w14="http://schemas.microsoft.com/office/word/2010/wordml" xmlns:w15="http://schemas.microsoft.com/office/word/2012/wordml" xmlns:w16cex="http://schemas.microsoft.com/office/word/2018/wordml/cex" xmlns:w16cid="http://schemas.microsoft.com/office/word/2016/wordml/cid" xmlns:w16="http://schemas.microsoft.com/office/word/2018/wordml" xmlns:w16du="http://schemas.microsoft.com/office/word/2023/wordml/word16du" xmlns:w16sdtdh="http://schemas.microsoft.com/office/word/2020/wordml/sdtdatahash" xmlns:w16sdtfl="http://schemas.microsoft.com/office/word/2024/wordml/sdtformatlock" xmlns:w16se="http://schemas.microsoft.com/office/word/2015/wordml/symex" xmlns:wpg="http://schemas.microsoft.com/office/word/2010/wordprocessingGroup" xmlns:wpi="http://schemas.microsoft.com/office/word/2010/wordprocessingInk" xmlns:wne="http://schemas.microsoft.com/office/word/2006/wordml" xmlns:wps="http://schemas.microsoft.com/office/word/2010/wordprocessingShape" mc:Ignorable="w14 w15 w16se w16cid w16 w16cex w16sdtdh w16sdtfl w16du wp14">
   <w:body>
     <w:sdt>
       <w:sdtPr>
@@ -165,7 +165,6 @@
                                     <w:calendar w:val="gregorian"/>
                                   </w:date>
                                 </w:sdtPr>
-                                <w:sdtEndPr/>
                                 <w:sdtContent>
                                   <w:p>
                                     <w:pPr>
@@ -363,7 +362,6 @@
                                   <w:dataBinding w:prefixMappings="xmlns:ns0='http://purl.org/dc/elements/1.1/' xmlns:ns1='http://schemas.openxmlformats.org/package/2006/metadata/core-properties' " w:xpath="/ns1:coreProperties[1]/ns0:creator[1]" w:storeItemID="{6C3C8BC8-F283-45AE-878A-BAB7291924A1}"/>
                                   <w:text/>
                                 </w:sdtPr>
-                                <w:sdtEndPr/>
                                 <w:sdtContent>
                                   <w:p>
                                     <w:pPr>
@@ -414,7 +412,6 @@
                                     <w:dataBinding w:prefixMappings="xmlns:ns0='http://schemas.openxmlformats.org/officeDocument/2006/extended-properties' " w:xpath="/ns0:Properties[1]/ns0:Company[1]" w:storeItemID="{6668398D-A668-4E3E-A5EB-62B293D839F1}"/>
                                     <w:text/>
                                   </w:sdtPr>
-                                  <w:sdtEndPr/>
                                   <w:sdtContent>
                                     <w:r>
                                       <w:rPr>
@@ -659,7 +656,6 @@
                                     <w:dataBinding w:prefixMappings="xmlns:ns0='http://purl.org/dc/elements/1.1/' xmlns:ns1='http://schemas.openxmlformats.org/package/2006/metadata/core-properties' " w:xpath="/ns1:coreProperties[1]/ns0:title[1]" w:storeItemID="{6C3C8BC8-F283-45AE-878A-BAB7291924A1}"/>
                                     <w:text w:multiLine="1"/>
                                   </w:sdtPr>
-                                  <w:sdtEndPr/>
                                   <w:sdtContent>
                                     <w:r>
                                       <w:rPr>
@@ -688,7 +684,6 @@
                                   <w:dataBinding w:prefixMappings="xmlns:ns0='http://purl.org/dc/elements/1.1/' xmlns:ns1='http://schemas.openxmlformats.org/package/2006/metadata/core-properties' " w:xpath="/ns1:coreProperties[1]/ns0:subject[1]" w:storeItemID="{6C3C8BC8-F283-45AE-878A-BAB7291924A1}"/>
                                   <w:text/>
                                 </w:sdtPr>
-                                <w:sdtEndPr/>
                                 <w:sdtContent>
                                   <w:p>
                                     <w:pPr>
@@ -5963,29 +5958,22 @@
         <w:ind w:left="708"/>
         <w:rPr>
           <w:rFonts w:ascii="Cambria" w:hAnsi="Cambria"/>
-          <w:lang w:val="es-MX"/>
+          <w:lang w:val="en-US"/>
         </w:rPr>
       </w:pPr>
       <w:r>
         <w:rPr>
           <w:rFonts w:ascii="Cambria" w:hAnsi="Cambria" w:cs="Calibri"/>
-          <w:lang w:val="es-MX"/>
+          <w:lang w:val="en-US"/>
         </w:rPr>
         <w:t>─</w:t>
       </w:r>
       <w:r>
         <w:rPr>
           <w:rFonts w:ascii="Cambria" w:hAnsi="Cambria"/>
-          <w:lang w:val="es-MX"/>
-        </w:rPr>
-        <w:t xml:space="preserve"> </w:t>
-      </w:r>
-      <w:r>
-        <w:rPr>
-          <w:rFonts w:ascii="Cambria" w:hAnsi="Cambria"/>
-          <w:lang w:val="es-MX"/>
-        </w:rPr>
-        <w:t>no-sidebar.html</w:t>
+          <w:lang w:val="en-US"/>
+        </w:rPr>
+        <w:t xml:space="preserve"> no-sidebar.html</w:t>
       </w:r>
     </w:p>
     <w:p>
@@ -6009,14 +5997,7 @@
           <w:rFonts w:ascii="Cambria" w:hAnsi="Cambria"/>
           <w:lang w:val="en-US"/>
         </w:rPr>
-        <w:t xml:space="preserve"> </w:t>
-      </w:r>
-      <w:r>
-        <w:rPr>
-          <w:rFonts w:ascii="Cambria" w:hAnsi="Cambria"/>
-          <w:lang w:val="en-US"/>
-        </w:rPr>
-        <w:t>right-sidebar.html</w:t>
+        <w:t xml:space="preserve"> right-sidebar.html</w:t>
       </w:r>
     </w:p>
     <w:p>
@@ -6092,9 +6073,16 @@
         <w:spacing w:line="180" w:lineRule="auto"/>
         <w:rPr>
           <w:rFonts w:ascii="Cambria" w:hAnsi="Cambria"/>
+          <w:lang w:val="es-EC"/>
+        </w:rPr>
+      </w:pPr>
+      <w:r>
+        <w:rPr>
+          <w:rFonts w:ascii="Cambria" w:hAnsi="Cambria"/>
           <w:lang w:val="en-US"/>
         </w:rPr>
-      </w:pPr>
+        <w:tab/>
+      </w:r>
       <w:r>
         <w:rPr>
           <w:rFonts w:ascii="Cambria" w:hAnsi="Cambria"/>
@@ -6104,36 +6092,84 @@
       </w:r>
       <w:r>
         <w:rPr>
-          <w:rFonts w:ascii="Cambria" w:hAnsi="Cambria"/>
-          <w:lang w:val="en-US"/>
+          <w:rFonts w:ascii="Cambria" w:hAnsi="Cambria" w:cs="Calibri"/>
+          <w:lang w:val="es-EC"/>
+        </w:rPr>
+        <w:t>─</w:t>
+      </w:r>
+      <w:r>
+        <w:rPr>
+          <w:rFonts w:ascii="Cambria" w:hAnsi="Cambria"/>
+          <w:lang w:val="es-EC"/>
+        </w:rPr>
+        <w:t xml:space="preserve"> </w:t>
+      </w:r>
+      <w:proofErr w:type="spellStart"/>
+      <w:r>
+        <w:rPr>
+          <w:rFonts w:ascii="Cambria" w:hAnsi="Cambria"/>
+          <w:lang w:val="es-EC"/>
+        </w:rPr>
+        <w:t>css</w:t>
+      </w:r>
+      <w:proofErr w:type="spellEnd"/>
+      <w:r>
+        <w:rPr>
+          <w:rFonts w:ascii="Cambria" w:hAnsi="Cambria"/>
+          <w:lang w:val="es-EC"/>
+        </w:rPr>
+        <w:t>/</w:t>
+      </w:r>
+    </w:p>
+    <w:p>
+      <w:pPr>
+        <w:spacing w:line="180" w:lineRule="auto"/>
+        <w:rPr>
+          <w:rFonts w:ascii="Cambria" w:hAnsi="Cambria"/>
+          <w:lang w:val="es-EC"/>
+        </w:rPr>
+      </w:pPr>
+      <w:r>
+        <w:rPr>
+          <w:rFonts w:ascii="Cambria" w:hAnsi="Cambria"/>
+          <w:lang w:val="es-EC"/>
         </w:rPr>
         <w:tab/>
       </w:r>
       <w:r>
         <w:rPr>
+          <w:rFonts w:ascii="Cambria" w:hAnsi="Cambria"/>
+          <w:lang w:val="es-EC"/>
+        </w:rPr>
+        <w:tab/>
+      </w:r>
+      <w:r>
+        <w:rPr>
           <w:rFonts w:ascii="Cambria" w:hAnsi="Cambria" w:cs="Calibri"/>
-          <w:lang w:val="en-US"/>
+          <w:lang w:val="es-EC"/>
         </w:rPr>
         <w:t>─</w:t>
       </w:r>
       <w:r>
         <w:rPr>
           <w:rFonts w:ascii="Cambria" w:hAnsi="Cambria"/>
-          <w:lang w:val="en-US"/>
+          <w:lang w:val="es-EC"/>
         </w:rPr>
         <w:t xml:space="preserve"> </w:t>
       </w:r>
-      <w:r>
-        <w:rPr>
-          <w:rFonts w:ascii="Cambria" w:hAnsi="Cambria"/>
-          <w:lang w:val="en-US"/>
-        </w:rPr>
-        <w:t>css</w:t>
-      </w:r>
-      <w:r>
-        <w:rPr>
-          <w:rFonts w:ascii="Cambria" w:hAnsi="Cambria"/>
-          <w:lang w:val="en-US"/>
+      <w:proofErr w:type="spellStart"/>
+      <w:r>
+        <w:rPr>
+          <w:rFonts w:ascii="Cambria" w:hAnsi="Cambria"/>
+          <w:lang w:val="es-EC"/>
+        </w:rPr>
+        <w:t>js</w:t>
+      </w:r>
+      <w:proofErr w:type="spellEnd"/>
+      <w:r>
+        <w:rPr>
+          <w:rFonts w:ascii="Cambria" w:hAnsi="Cambria"/>
+          <w:lang w:val="es-EC"/>
         </w:rPr>
         <w:t>/</w:t>
       </w:r>
@@ -6143,99 +6179,50 @@
         <w:spacing w:line="180" w:lineRule="auto"/>
         <w:rPr>
           <w:rFonts w:ascii="Cambria" w:hAnsi="Cambria"/>
-          <w:lang w:val="en-US"/>
-        </w:rPr>
-      </w:pPr>
-      <w:r>
-        <w:rPr>
-          <w:rFonts w:ascii="Cambria" w:hAnsi="Cambria"/>
-          <w:lang w:val="en-US"/>
+          <w:lang w:val="es-EC"/>
+        </w:rPr>
+      </w:pPr>
+      <w:r>
+        <w:rPr>
+          <w:rFonts w:ascii="Cambria" w:hAnsi="Cambria"/>
+          <w:lang w:val="es-EC"/>
         </w:rPr>
         <w:tab/>
       </w:r>
       <w:r>
         <w:rPr>
           <w:rFonts w:ascii="Cambria" w:hAnsi="Cambria"/>
-          <w:lang w:val="en-US"/>
+          <w:lang w:val="es-EC"/>
         </w:rPr>
         <w:tab/>
       </w:r>
       <w:r>
         <w:rPr>
           <w:rFonts w:ascii="Cambria" w:hAnsi="Cambria" w:cs="Calibri"/>
-          <w:lang w:val="en-US"/>
+          <w:lang w:val="es-EC"/>
         </w:rPr>
         <w:t>─</w:t>
       </w:r>
       <w:r>
         <w:rPr>
           <w:rFonts w:ascii="Cambria" w:hAnsi="Cambria"/>
-          <w:lang w:val="en-US"/>
+          <w:lang w:val="es-EC"/>
         </w:rPr>
         <w:t xml:space="preserve"> </w:t>
       </w:r>
-      <w:r>
-        <w:rPr>
-          <w:rFonts w:ascii="Cambria" w:hAnsi="Cambria"/>
-          <w:lang w:val="en-US"/>
-        </w:rPr>
-        <w:t>js</w:t>
-      </w:r>
-      <w:r>
-        <w:rPr>
-          <w:rFonts w:ascii="Cambria" w:hAnsi="Cambria"/>
-          <w:lang w:val="en-US"/>
-        </w:rPr>
-        <w:t>/</w:t>
-      </w:r>
-    </w:p>
-    <w:p>
-      <w:pPr>
-        <w:spacing w:line="180" w:lineRule="auto"/>
-        <w:rPr>
-          <w:rFonts w:ascii="Cambria" w:hAnsi="Cambria"/>
-          <w:lang w:val="en-US"/>
-        </w:rPr>
-      </w:pPr>
-      <w:r>
-        <w:rPr>
-          <w:rFonts w:ascii="Cambria" w:hAnsi="Cambria"/>
-          <w:lang w:val="en-US"/>
-        </w:rPr>
-        <w:tab/>
-      </w:r>
-      <w:r>
-        <w:rPr>
-          <w:rFonts w:ascii="Cambria" w:hAnsi="Cambria"/>
-          <w:lang w:val="en-US"/>
-        </w:rPr>
-        <w:tab/>
-      </w:r>
-      <w:r>
-        <w:rPr>
-          <w:rFonts w:ascii="Cambria" w:hAnsi="Cambria" w:cs="Calibri"/>
-          <w:lang w:val="en-US"/>
-        </w:rPr>
-        <w:t>─</w:t>
-      </w:r>
-      <w:r>
-        <w:rPr>
-          <w:rFonts w:ascii="Cambria" w:hAnsi="Cambria"/>
-          <w:lang w:val="en-US"/>
-        </w:rPr>
-        <w:t xml:space="preserve"> </w:t>
-      </w:r>
-      <w:r>
-        <w:rPr>
-          <w:rFonts w:ascii="Cambria" w:hAnsi="Cambria"/>
-          <w:lang w:val="en-US"/>
+      <w:proofErr w:type="spellStart"/>
+      <w:r>
+        <w:rPr>
+          <w:rFonts w:ascii="Cambria" w:hAnsi="Cambria"/>
+          <w:lang w:val="es-EC"/>
         </w:rPr>
         <w:t>webfonts</w:t>
       </w:r>
-      <w:r>
-        <w:rPr>
-          <w:rFonts w:ascii="Cambria" w:hAnsi="Cambria"/>
-          <w:lang w:val="en-US"/>
+      <w:proofErr w:type="spellEnd"/>
+      <w:r>
+        <w:rPr>
+          <w:rFonts w:ascii="Cambria" w:hAnsi="Cambria"/>
+          <w:lang w:val="es-EC"/>
         </w:rPr>
         <w:t>/</w:t>
       </w:r>
@@ -6246,15 +6233,31 @@
         <w:ind w:left="708"/>
         <w:rPr>
           <w:rFonts w:ascii="Cambria" w:hAnsi="Cambria"/>
-          <w:lang w:val="en-US"/>
-        </w:rPr>
-      </w:pPr>
-      <w:r>
-        <w:rPr>
-          <w:rFonts w:ascii="Cambria" w:hAnsi="Cambria"/>
-          <w:lang w:val="en-US"/>
-        </w:rPr>
-        <w:t>─ images/</w:t>
+          <w:lang w:val="es-EC"/>
+        </w:rPr>
+      </w:pPr>
+      <w:r>
+        <w:rPr>
+          <w:rFonts w:ascii="Cambria" w:hAnsi="Cambria"/>
+          <w:lang w:val="es-EC"/>
+        </w:rPr>
+        <w:t xml:space="preserve">─ </w:t>
+      </w:r>
+      <w:proofErr w:type="spellStart"/>
+      <w:r>
+        <w:rPr>
+          <w:rFonts w:ascii="Cambria" w:hAnsi="Cambria"/>
+          <w:lang w:val="es-EC"/>
+        </w:rPr>
+        <w:t>images</w:t>
+      </w:r>
+      <w:proofErr w:type="spellEnd"/>
+      <w:r>
+        <w:rPr>
+          <w:rFonts w:ascii="Cambria" w:hAnsi="Cambria"/>
+          <w:lang w:val="es-EC"/>
+        </w:rPr>
+        <w:t>/</w:t>
       </w:r>
     </w:p>
     <w:p>
@@ -6700,8 +6703,34 @@
           <w:rFonts w:ascii="Cambria" w:hAnsi="Cambria"/>
           <w:lang w:val="es-EC"/>
         </w:rPr>
-        <w:t>URL de la landing page: ________________</w:t>
-      </w:r>
+        <w:t xml:space="preserve">URL de la </w:t>
+      </w:r>
+      <w:proofErr w:type="spellStart"/>
+      <w:r>
+        <w:rPr>
+          <w:rFonts w:ascii="Cambria" w:hAnsi="Cambria"/>
+          <w:lang w:val="es-EC"/>
+        </w:rPr>
+        <w:t>landing</w:t>
+      </w:r>
+      <w:proofErr w:type="spellEnd"/>
+      <w:r>
+        <w:rPr>
+          <w:rFonts w:ascii="Cambria" w:hAnsi="Cambria"/>
+          <w:lang w:val="es-EC"/>
+        </w:rPr>
+        <w:t xml:space="preserve"> page: </w:t>
+      </w:r>
+      <w:hyperlink r:id="rId16" w:history="1">
+        <w:r>
+          <w:rPr>
+            <w:rStyle w:val="Hipervnculo"/>
+            <w:rFonts w:ascii="Cambria" w:hAnsi="Cambria"/>
+            <w:lang w:val="es-EC"/>
+          </w:rPr>
+          <w:t>https://john0487.github.io/landing-page-arte-en-el-cerro/</w:t>
+        </w:r>
+      </w:hyperlink>
     </w:p>
     <w:p>
       <w:pPr>
@@ -6781,7 +6810,7 @@
         </w:rPr>
         <w:t xml:space="preserve">. </w:t>
       </w:r>
-      <w:hyperlink r:id="rId16" w:history="1">
+      <w:hyperlink r:id="rId17" w:history="1">
         <w:r>
           <w:rPr>
             <w:rStyle w:val="Hipervnculo"/>
@@ -6810,7 +6839,7 @@
         </w:rPr>
         <w:t xml:space="preserve">HTML5 UP. (s. f.). Alpha. </w:t>
       </w:r>
-      <w:hyperlink r:id="rId17" w:history="1">
+      <w:hyperlink r:id="rId18" w:history="1">
         <w:r>
           <w:rPr>
             <w:rStyle w:val="Hipervnculo"/>
@@ -6839,7 +6868,7 @@
         </w:rPr>
         <w:t xml:space="preserve">HTML5 UP. (s. f.). Prologue. </w:t>
       </w:r>
-      <w:hyperlink r:id="rId18" w:history="1">
+      <w:hyperlink r:id="rId19" w:history="1">
         <w:r>
           <w:rPr>
             <w:rStyle w:val="Hipervnculo"/>
@@ -6868,7 +6897,7 @@
         </w:rPr>
         <w:t xml:space="preserve">HTML5 UP. (s. f.). Responsive HTML5 and CSS3 site templates. </w:t>
       </w:r>
-      <w:hyperlink r:id="rId19" w:history="1">
+      <w:hyperlink r:id="rId20" w:history="1">
         <w:r>
           <w:rPr>
             <w:rStyle w:val="Hipervnculo"/>
@@ -6897,7 +6926,7 @@
         </w:rPr>
         <w:t xml:space="preserve">GitHub Docs. (s. f.). GitHub Pages. </w:t>
       </w:r>
-      <w:hyperlink r:id="rId20" w:history="1">
+      <w:hyperlink r:id="rId21" w:history="1">
         <w:r>
           <w:rPr>
             <w:rStyle w:val="Hipervnculo"/>
@@ -6940,7 +6969,7 @@
       </w:r>
     </w:p>
     <w:sectPr>
-      <w:headerReference w:type="default" r:id="rId21"/>
+      <w:headerReference w:type="default" r:id="rId22"/>
       <w:pgSz w:w="11906" w:h="16838"/>
       <w:pgMar w:top="2650" w:right="1701" w:bottom="1417" w:left="1701" w:header="708" w:footer="708" w:gutter="0"/>
       <w:pgNumType w:start="0"/>
@@ -6953,7 +6982,7 @@
 </file>
 
 <file path=word/endnotes.xml><?xml version="1.0" encoding="utf-8"?>
-<w:endnotes xmlns:wpc="http://schemas.microsoft.com/office/word/2010/wordprocessingCanvas" xmlns:cx="http://schemas.microsoft.com/office/drawing/2014/chartex" xmlns:cx1="http://schemas.microsoft.com/office/drawing/2015/9/8/chartex" xmlns:cx2="http://schemas.microsoft.com/office/drawing/2015/10/21/chartex" xmlns:cx3="http://schemas.microsoft.com/office/drawing/2016/5/9/chartex" xmlns:cx4="http://schemas.microsoft.com/office/drawing/2016/5/10/chartex" xmlns:cx5="http://schemas.microsoft.com/office/drawing/2016/5/11/chartex" xmlns:cx6="http://schemas.microsoft.com/office/drawing/2016/5/12/chartex" xmlns:cx7="http://schemas.microsoft.com/office/drawing/2016/5/13/chartex" xmlns:cx8="http://schemas.microsoft.com/office/drawing/2016/5/14/chartex" xmlns:mc="http://schemas.openxmlformats.org/markup-compatibility/2006" xmlns:aink="http://schemas.microsoft.com/office/drawing/2016/ink" xmlns:am3d="http://schemas.microsoft.com/office/drawing/2017/model3d" xmlns:o="urn:schemas-microsoft-com:office:office" xmlns:r="http://schemas.openxmlformats.org/officeDocument/2006/relationships" xmlns:m="http://schemas.openxmlformats.org/officeDocument/2006/math" xmlns:v="urn:schemas-microsoft-com:vml" xmlns:wp14="http://schemas.microsoft.com/office/word/2010/wordprocessingDrawing" xmlns:wp="http://schemas.openxmlformats.org/drawingml/2006/wordprocessingDrawing" xmlns:w10="urn:schemas-microsoft-com:office:word" xmlns:w="http://schemas.openxmlformats.org/wordprocessingml/2006/main" xmlns:w14="http://schemas.microsoft.com/office/word/2010/wordml" xmlns:w15="http://schemas.microsoft.com/office/word/2012/wordml" xmlns:w16cex="http://schemas.microsoft.com/office/word/2018/wordml/cex" xmlns:w16cid="http://schemas.microsoft.com/office/word/2016/wordml/cid" xmlns:w16="http://schemas.microsoft.com/office/word/2018/wordml" xmlns:w16sdtdh="http://schemas.microsoft.com/office/word/2020/wordml/sdtdatahash" xmlns:w16se="http://schemas.microsoft.com/office/word/2015/wordml/symex" xmlns:wpg="http://schemas.microsoft.com/office/word/2010/wordprocessingGroup" xmlns:wpi="http://schemas.microsoft.com/office/word/2010/wordprocessingInk" xmlns:wne="http://schemas.microsoft.com/office/word/2006/wordml" xmlns:wps="http://schemas.microsoft.com/office/word/2010/wordprocessingShape" mc:Ignorable="w14 w15 w16se w16cid w16 w16cex w16sdtdh wp14">
+<w:endnotes xmlns:wpc="http://schemas.microsoft.com/office/word/2010/wordprocessingCanvas" xmlns:cx="http://schemas.microsoft.com/office/drawing/2014/chartex" xmlns:cx1="http://schemas.microsoft.com/office/drawing/2015/9/8/chartex" xmlns:cx2="http://schemas.microsoft.com/office/drawing/2015/10/21/chartex" xmlns:cx3="http://schemas.microsoft.com/office/drawing/2016/5/9/chartex" xmlns:cx4="http://schemas.microsoft.com/office/drawing/2016/5/10/chartex" xmlns:cx5="http://schemas.microsoft.com/office/drawing/2016/5/11/chartex" xmlns:cx6="http://schemas.microsoft.com/office/drawing/2016/5/12/chartex" xmlns:cx7="http://schemas.microsoft.com/office/drawing/2016/5/13/chartex" xmlns:cx8="http://schemas.microsoft.com/office/drawing/2016/5/14/chartex" xmlns:mc="http://schemas.openxmlformats.org/markup-compatibility/2006" xmlns:aink="http://schemas.microsoft.com/office/drawing/2016/ink" xmlns:am3d="http://schemas.microsoft.com/office/drawing/2017/model3d" xmlns:o="urn:schemas-microsoft-com:office:office" xmlns:oel="http://schemas.microsoft.com/office/2019/extlst" xmlns:r="http://schemas.openxmlformats.org/officeDocument/2006/relationships" xmlns:m="http://schemas.openxmlformats.org/officeDocument/2006/math" xmlns:v="urn:schemas-microsoft-com:vml" xmlns:wp14="http://schemas.microsoft.com/office/word/2010/wordprocessingDrawing" xmlns:wp="http://schemas.openxmlformats.org/drawingml/2006/wordprocessingDrawing" xmlns:w10="urn:schemas-microsoft-com:office:word" xmlns:w="http://schemas.openxmlformats.org/wordprocessingml/2006/main" xmlns:w14="http://schemas.microsoft.com/office/word/2010/wordml" xmlns:w15="http://schemas.microsoft.com/office/word/2012/wordml" xmlns:w16cex="http://schemas.microsoft.com/office/word/2018/wordml/cex" xmlns:w16cid="http://schemas.microsoft.com/office/word/2016/wordml/cid" xmlns:w16="http://schemas.microsoft.com/office/word/2018/wordml" xmlns:w16du="http://schemas.microsoft.com/office/word/2023/wordml/word16du" xmlns:w16sdtdh="http://schemas.microsoft.com/office/word/2020/wordml/sdtdatahash" xmlns:w16sdtfl="http://schemas.microsoft.com/office/word/2024/wordml/sdtformatlock" xmlns:w16se="http://schemas.microsoft.com/office/word/2015/wordml/symex" xmlns:wpg="http://schemas.microsoft.com/office/word/2010/wordprocessingGroup" xmlns:wpi="http://schemas.microsoft.com/office/word/2010/wordprocessingInk" xmlns:wne="http://schemas.microsoft.com/office/word/2006/wordml" xmlns:wps="http://schemas.microsoft.com/office/word/2010/wordprocessingShape" mc:Ignorable="w14 w15 w16se w16cid w16 w16cex w16sdtdh w16sdtfl w16du wp14">
   <w:endnote w:type="separator" w:id="-1">
     <w:p>
       <w:pPr>
@@ -6978,7 +7007,7 @@
 </file>
 
 <file path=word/footnotes.xml><?xml version="1.0" encoding="utf-8"?>
-<w:footnotes xmlns:wpc="http://schemas.microsoft.com/office/word/2010/wordprocessingCanvas" xmlns:cx="http://schemas.microsoft.com/office/drawing/2014/chartex" xmlns:cx1="http://schemas.microsoft.com/office/drawing/2015/9/8/chartex" xmlns:cx2="http://schemas.microsoft.com/office/drawing/2015/10/21/chartex" xmlns:cx3="http://schemas.microsoft.com/office/drawing/2016/5/9/chartex" xmlns:cx4="http://schemas.microsoft.com/office/drawing/2016/5/10/chartex" xmlns:cx5="http://schemas.microsoft.com/office/drawing/2016/5/11/chartex" xmlns:cx6="http://schemas.microsoft.com/office/drawing/2016/5/12/chartex" xmlns:cx7="http://schemas.microsoft.com/office/drawing/2016/5/13/chartex" xmlns:cx8="http://schemas.microsoft.com/office/drawing/2016/5/14/chartex" xmlns:mc="http://schemas.openxmlformats.org/markup-compatibility/2006" xmlns:aink="http://schemas.microsoft.com/office/drawing/2016/ink" xmlns:am3d="http://schemas.microsoft.com/office/drawing/2017/model3d" xmlns:o="urn:schemas-microsoft-com:office:office" xmlns:r="http://schemas.openxmlformats.org/officeDocument/2006/relationships" xmlns:m="http://schemas.openxmlformats.org/officeDocument/2006/math" xmlns:v="urn:schemas-microsoft-com:vml" xmlns:wp14="http://schemas.microsoft.com/office/word/2010/wordprocessingDrawing" xmlns:wp="http://schemas.openxmlformats.org/drawingml/2006/wordprocessingDrawing" xmlns:w10="urn:schemas-microsoft-com:office:word" xmlns:w="http://schemas.openxmlformats.org/wordprocessingml/2006/main" xmlns:w14="http://schemas.microsoft.com/office/word/2010/wordml" xmlns:w15="http://schemas.microsoft.com/office/word/2012/wordml" xmlns:w16cex="http://schemas.microsoft.com/office/word/2018/wordml/cex" xmlns:w16cid="http://schemas.microsoft.com/office/word/2016/wordml/cid" xmlns:w16="http://schemas.microsoft.com/office/word/2018/wordml" xmlns:w16sdtdh="http://schemas.microsoft.com/office/word/2020/wordml/sdtdatahash" xmlns:w16se="http://schemas.microsoft.com/office/word/2015/wordml/symex" xmlns:wpg="http://schemas.microsoft.com/office/word/2010/wordprocessingGroup" xmlns:wpi="http://schemas.microsoft.com/office/word/2010/wordprocessingInk" xmlns:wne="http://schemas.microsoft.com/office/word/2006/wordml" xmlns:wps="http://schemas.microsoft.com/office/word/2010/wordprocessingShape" mc:Ignorable="w14 w15 w16se w16cid w16 w16cex w16sdtdh wp14">
+<w:footnotes xmlns:wpc="http://schemas.microsoft.com/office/word/2010/wordprocessingCanvas" xmlns:cx="http://schemas.microsoft.com/office/drawing/2014/chartex" xmlns:cx1="http://schemas.microsoft.com/office/drawing/2015/9/8/chartex" xmlns:cx2="http://schemas.microsoft.com/office/drawing/2015/10/21/chartex" xmlns:cx3="http://schemas.microsoft.com/office/drawing/2016/5/9/chartex" xmlns:cx4="http://schemas.microsoft.com/office/drawing/2016/5/10/chartex" xmlns:cx5="http://schemas.microsoft.com/office/drawing/2016/5/11/chartex" xmlns:cx6="http://schemas.microsoft.com/office/drawing/2016/5/12/chartex" xmlns:cx7="http://schemas.microsoft.com/office/drawing/2016/5/13/chartex" xmlns:cx8="http://schemas.microsoft.com/office/drawing/2016/5/14/chartex" xmlns:mc="http://schemas.openxmlformats.org/markup-compatibility/2006" xmlns:aink="http://schemas.microsoft.com/office/drawing/2016/ink" xmlns:am3d="http://schemas.microsoft.com/office/drawing/2017/model3d" xmlns:o="urn:schemas-microsoft-com:office:office" xmlns:oel="http://schemas.microsoft.com/office/2019/extlst" xmlns:r="http://schemas.openxmlformats.org/officeDocument/2006/relationships" xmlns:m="http://schemas.openxmlformats.org/officeDocument/2006/math" xmlns:v="urn:schemas-microsoft-com:vml" xmlns:wp14="http://schemas.microsoft.com/office/word/2010/wordprocessingDrawing" xmlns:wp="http://schemas.openxmlformats.org/drawingml/2006/wordprocessingDrawing" xmlns:w10="urn:schemas-microsoft-com:office:word" xmlns:w="http://schemas.openxmlformats.org/wordprocessingml/2006/main" xmlns:w14="http://schemas.microsoft.com/office/word/2010/wordml" xmlns:w15="http://schemas.microsoft.com/office/word/2012/wordml" xmlns:w16cex="http://schemas.microsoft.com/office/word/2018/wordml/cex" xmlns:w16cid="http://schemas.microsoft.com/office/word/2016/wordml/cid" xmlns:w16="http://schemas.microsoft.com/office/word/2018/wordml" xmlns:w16du="http://schemas.microsoft.com/office/word/2023/wordml/word16du" xmlns:w16sdtdh="http://schemas.microsoft.com/office/word/2020/wordml/sdtdatahash" xmlns:w16sdtfl="http://schemas.microsoft.com/office/word/2024/wordml/sdtformatlock" xmlns:w16se="http://schemas.microsoft.com/office/word/2015/wordml/symex" xmlns:wpg="http://schemas.microsoft.com/office/word/2010/wordprocessingGroup" xmlns:wpi="http://schemas.microsoft.com/office/word/2010/wordprocessingInk" xmlns:wne="http://schemas.microsoft.com/office/word/2006/wordml" xmlns:wps="http://schemas.microsoft.com/office/word/2010/wordprocessingShape" mc:Ignorable="w14 w15 w16se w16cid w16 w16cex w16sdtdh w16sdtfl w16du wp14">
   <w:footnote w:type="separator" w:id="-1">
     <w:p>
       <w:pPr>
@@ -7003,7 +7032,7 @@
 </file>
 
 <file path=word/header1.xml><?xml version="1.0" encoding="utf-8"?>
-<w:hdr xmlns:wpc="http://schemas.microsoft.com/office/word/2010/wordprocessingCanvas" xmlns:cx="http://schemas.microsoft.com/office/drawing/2014/chartex" xmlns:cx1="http://schemas.microsoft.com/office/drawing/2015/9/8/chartex" xmlns:cx2="http://schemas.microsoft.com/office/drawing/2015/10/21/chartex" xmlns:cx3="http://schemas.microsoft.com/office/drawing/2016/5/9/chartex" xmlns:cx4="http://schemas.microsoft.com/office/drawing/2016/5/10/chartex" xmlns:cx5="http://schemas.microsoft.com/office/drawing/2016/5/11/chartex" xmlns:cx6="http://schemas.microsoft.com/office/drawing/2016/5/12/chartex" xmlns:cx7="http://schemas.microsoft.com/office/drawing/2016/5/13/chartex" xmlns:cx8="http://schemas.microsoft.com/office/drawing/2016/5/14/chartex" xmlns:mc="http://schemas.openxmlformats.org/markup-compatibility/2006" xmlns:aink="http://schemas.microsoft.com/office/drawing/2016/ink" xmlns:am3d="http://schemas.microsoft.com/office/drawing/2017/model3d" xmlns:o="urn:schemas-microsoft-com:office:office" xmlns:r="http://schemas.openxmlformats.org/officeDocument/2006/relationships" xmlns:m="http://schemas.openxmlformats.org/officeDocument/2006/math" xmlns:v="urn:schemas-microsoft-com:vml" xmlns:wp14="http://schemas.microsoft.com/office/word/2010/wordprocessingDrawing" xmlns:wp="http://schemas.openxmlformats.org/drawingml/2006/wordprocessingDrawing" xmlns:w10="urn:schemas-microsoft-com:office:word" xmlns:w="http://schemas.openxmlformats.org/wordprocessingml/2006/main" xmlns:w14="http://schemas.microsoft.com/office/word/2010/wordml" xmlns:w15="http://schemas.microsoft.com/office/word/2012/wordml" xmlns:w16cex="http://schemas.microsoft.com/office/word/2018/wordml/cex" xmlns:w16cid="http://schemas.microsoft.com/office/word/2016/wordml/cid" xmlns:w16="http://schemas.microsoft.com/office/word/2018/wordml" xmlns:w16sdtdh="http://schemas.microsoft.com/office/word/2020/wordml/sdtdatahash" xmlns:w16se="http://schemas.microsoft.com/office/word/2015/wordml/symex" xmlns:wpg="http://schemas.microsoft.com/office/word/2010/wordprocessingGroup" xmlns:wpi="http://schemas.microsoft.com/office/word/2010/wordprocessingInk" xmlns:wne="http://schemas.microsoft.com/office/word/2006/wordml" xmlns:wps="http://schemas.microsoft.com/office/word/2010/wordprocessingShape" mc:Ignorable="w14 w15 w16se w16cid w16 w16cex w16sdtdh wp14">
+<w:hdr xmlns:wpc="http://schemas.microsoft.com/office/word/2010/wordprocessingCanvas" xmlns:cx="http://schemas.microsoft.com/office/drawing/2014/chartex" xmlns:cx1="http://schemas.microsoft.com/office/drawing/2015/9/8/chartex" xmlns:cx2="http://schemas.microsoft.com/office/drawing/2015/10/21/chartex" xmlns:cx3="http://schemas.microsoft.com/office/drawing/2016/5/9/chartex" xmlns:cx4="http://schemas.microsoft.com/office/drawing/2016/5/10/chartex" xmlns:cx5="http://schemas.microsoft.com/office/drawing/2016/5/11/chartex" xmlns:cx6="http://schemas.microsoft.com/office/drawing/2016/5/12/chartex" xmlns:cx7="http://schemas.microsoft.com/office/drawing/2016/5/13/chartex" xmlns:cx8="http://schemas.microsoft.com/office/drawing/2016/5/14/chartex" xmlns:mc="http://schemas.openxmlformats.org/markup-compatibility/2006" xmlns:aink="http://schemas.microsoft.com/office/drawing/2016/ink" xmlns:am3d="http://schemas.microsoft.com/office/drawing/2017/model3d" xmlns:o="urn:schemas-microsoft-com:office:office" xmlns:oel="http://schemas.microsoft.com/office/2019/extlst" xmlns:r="http://schemas.openxmlformats.org/officeDocument/2006/relationships" xmlns:m="http://schemas.openxmlformats.org/officeDocument/2006/math" xmlns:v="urn:schemas-microsoft-com:vml" xmlns:wp14="http://schemas.microsoft.com/office/word/2010/wordprocessingDrawing" xmlns:wp="http://schemas.openxmlformats.org/drawingml/2006/wordprocessingDrawing" xmlns:w10="urn:schemas-microsoft-com:office:word" xmlns:w="http://schemas.openxmlformats.org/wordprocessingml/2006/main" xmlns:w14="http://schemas.microsoft.com/office/word/2010/wordml" xmlns:w15="http://schemas.microsoft.com/office/word/2012/wordml" xmlns:w16cex="http://schemas.microsoft.com/office/word/2018/wordml/cex" xmlns:w16cid="http://schemas.microsoft.com/office/word/2016/wordml/cid" xmlns:w16="http://schemas.microsoft.com/office/word/2018/wordml" xmlns:w16du="http://schemas.microsoft.com/office/word/2023/wordml/word16du" xmlns:w16sdtdh="http://schemas.microsoft.com/office/word/2020/wordml/sdtdatahash" xmlns:w16sdtfl="http://schemas.microsoft.com/office/word/2024/wordml/sdtformatlock" xmlns:w16se="http://schemas.microsoft.com/office/word/2015/wordml/symex" xmlns:wpg="http://schemas.microsoft.com/office/word/2010/wordprocessingGroup" xmlns:wpi="http://schemas.microsoft.com/office/word/2010/wordprocessingInk" xmlns:wne="http://schemas.microsoft.com/office/word/2006/wordml" xmlns:wps="http://schemas.microsoft.com/office/word/2010/wordprocessingShape" mc:Ignorable="w14 w15 w16se w16cid w16 w16cex w16sdtdh w16sdtfl w16du wp14">
   <w:p>
     <w:pPr>
       <w:pStyle w:val="Encabezado"/>
@@ -7031,7 +7060,7 @@
 </file>
 
 <file path=word/numbering.xml><?xml version="1.0" encoding="utf-8"?>
-<w:numbering xmlns:wpc="http://schemas.microsoft.com/office/word/2010/wordprocessingCanvas" xmlns:cx="http://schemas.microsoft.com/office/drawing/2014/chartex" xmlns:cx1="http://schemas.microsoft.com/office/drawing/2015/9/8/chartex" xmlns:cx2="http://schemas.microsoft.com/office/drawing/2015/10/21/chartex" xmlns:cx3="http://schemas.microsoft.com/office/drawing/2016/5/9/chartex" xmlns:cx4="http://schemas.microsoft.com/office/drawing/2016/5/10/chartex" xmlns:cx5="http://schemas.microsoft.com/office/drawing/2016/5/11/chartex" xmlns:cx6="http://schemas.microsoft.com/office/drawing/2016/5/12/chartex" xmlns:cx7="http://schemas.microsoft.com/office/drawing/2016/5/13/chartex" xmlns:cx8="http://schemas.microsoft.com/office/drawing/2016/5/14/chartex" xmlns:mc="http://schemas.openxmlformats.org/markup-compatibility/2006" xmlns:aink="http://schemas.microsoft.com/office/drawing/2016/ink" xmlns:am3d="http://schemas.microsoft.com/office/drawing/2017/model3d" xmlns:o="urn:schemas-microsoft-com:office:office" xmlns:r="http://schemas.openxmlformats.org/officeDocument/2006/relationships" xmlns:m="http://schemas.openxmlformats.org/officeDocument/2006/math" xmlns:v="urn:schemas-microsoft-com:vml" xmlns:wp14="http://schemas.microsoft.com/office/word/2010/wordprocessingDrawing" xmlns:wp="http://schemas.openxmlformats.org/drawingml/2006/wordprocessingDrawing" xmlns:w10="urn:schemas-microsoft-com:office:word" xmlns:w="http://schemas.openxmlformats.org/wordprocessingml/2006/main" xmlns:w14="http://schemas.microsoft.com/office/word/2010/wordml" xmlns:w15="http://schemas.microsoft.com/office/word/2012/wordml" xmlns:w16cex="http://schemas.microsoft.com/office/word/2018/wordml/cex" xmlns:w16cid="http://schemas.microsoft.com/office/word/2016/wordml/cid" xmlns:w16="http://schemas.microsoft.com/office/word/2018/wordml" xmlns:w16sdtdh="http://schemas.microsoft.com/office/word/2020/wordml/sdtdatahash" xmlns:w16se="http://schemas.microsoft.com/office/word/2015/wordml/symex" xmlns:wpg="http://schemas.microsoft.com/office/word/2010/wordprocessingGroup" xmlns:wpi="http://schemas.microsoft.com/office/word/2010/wordprocessingInk" xmlns:wne="http://schemas.microsoft.com/office/word/2006/wordml" xmlns:wps="http://schemas.microsoft.com/office/word/2010/wordprocessingShape" mc:Ignorable="w14 w15 w16se w16cid w16 w16cex w16sdtdh wp14">
+<w:numbering xmlns:wpc="http://schemas.microsoft.com/office/word/2010/wordprocessingCanvas" xmlns:cx="http://schemas.microsoft.com/office/drawing/2014/chartex" xmlns:cx1="http://schemas.microsoft.com/office/drawing/2015/9/8/chartex" xmlns:cx2="http://schemas.microsoft.com/office/drawing/2015/10/21/chartex" xmlns:cx3="http://schemas.microsoft.com/office/drawing/2016/5/9/chartex" xmlns:cx4="http://schemas.microsoft.com/office/drawing/2016/5/10/chartex" xmlns:cx5="http://schemas.microsoft.com/office/drawing/2016/5/11/chartex" xmlns:cx6="http://schemas.microsoft.com/office/drawing/2016/5/12/chartex" xmlns:cx7="http://schemas.microsoft.com/office/drawing/2016/5/13/chartex" xmlns:cx8="http://schemas.microsoft.com/office/drawing/2016/5/14/chartex" xmlns:mc="http://schemas.openxmlformats.org/markup-compatibility/2006" xmlns:aink="http://schemas.microsoft.com/office/drawing/2016/ink" xmlns:am3d="http://schemas.microsoft.com/office/drawing/2017/model3d" xmlns:o="urn:schemas-microsoft-com:office:office" xmlns:oel="http://schemas.microsoft.com/office/2019/extlst" xmlns:r="http://schemas.openxmlformats.org/officeDocument/2006/relationships" xmlns:m="http://schemas.openxmlformats.org/officeDocument/2006/math" xmlns:v="urn:schemas-microsoft-com:vml" xmlns:wp14="http://schemas.microsoft.com/office/word/2010/wordprocessingDrawing" xmlns:wp="http://schemas.openxmlformats.org/drawingml/2006/wordprocessingDrawing" xmlns:w10="urn:schemas-microsoft-com:office:word" xmlns:w="http://schemas.openxmlformats.org/wordprocessingml/2006/main" xmlns:w14="http://schemas.microsoft.com/office/word/2010/wordml" xmlns:w15="http://schemas.microsoft.com/office/word/2012/wordml" xmlns:w16cex="http://schemas.microsoft.com/office/word/2018/wordml/cex" xmlns:w16cid="http://schemas.microsoft.com/office/word/2016/wordml/cid" xmlns:w16="http://schemas.microsoft.com/office/word/2018/wordml" xmlns:w16du="http://schemas.microsoft.com/office/word/2023/wordml/word16du" xmlns:w16sdtdh="http://schemas.microsoft.com/office/word/2020/wordml/sdtdatahash" xmlns:w16sdtfl="http://schemas.microsoft.com/office/word/2024/wordml/sdtformatlock" xmlns:w16se="http://schemas.microsoft.com/office/word/2015/wordml/symex" xmlns:wpg="http://schemas.microsoft.com/office/word/2010/wordprocessingGroup" xmlns:wpi="http://schemas.microsoft.com/office/word/2010/wordprocessingInk" xmlns:wne="http://schemas.microsoft.com/office/word/2006/wordml" xmlns:wps="http://schemas.microsoft.com/office/word/2010/wordprocessingShape" mc:Ignorable="w14 w15 w16se w16cid w16 w16cex w16sdtdh w16sdtfl w16du wp14">
   <w:abstractNum w:abstractNumId="0" w15:restartNumberingAfterBreak="0">
     <w:nsid w:val="088D2FF6"/>
     <w:multiLevelType w:val="multilevel"/>
@@ -8828,53 +8857,53 @@
       </w:rPr>
     </w:lvl>
   </w:abstractNum>
-  <w:num w:numId="1">
+  <w:num w:numId="1" w16cid:durableId="1086730658">
     <w:abstractNumId w:val="1"/>
   </w:num>
-  <w:num w:numId="2">
+  <w:num w:numId="2" w16cid:durableId="296882468">
     <w:abstractNumId w:val="3"/>
   </w:num>
-  <w:num w:numId="3">
+  <w:num w:numId="3" w16cid:durableId="1858426933">
     <w:abstractNumId w:val="4"/>
   </w:num>
-  <w:num w:numId="4">
+  <w:num w:numId="4" w16cid:durableId="256402577">
     <w:abstractNumId w:val="0"/>
   </w:num>
-  <w:num w:numId="5">
+  <w:num w:numId="5" w16cid:durableId="1639216880">
     <w:abstractNumId w:val="5"/>
   </w:num>
-  <w:num w:numId="6">
+  <w:num w:numId="6" w16cid:durableId="863401729">
     <w:abstractNumId w:val="7"/>
   </w:num>
-  <w:num w:numId="7">
+  <w:num w:numId="7" w16cid:durableId="805663073">
     <w:abstractNumId w:val="9"/>
   </w:num>
-  <w:num w:numId="8">
+  <w:num w:numId="8" w16cid:durableId="40636739">
     <w:abstractNumId w:val="8"/>
   </w:num>
-  <w:num w:numId="9">
+  <w:num w:numId="9" w16cid:durableId="1431049003">
     <w:abstractNumId w:val="10"/>
   </w:num>
-  <w:num w:numId="10">
+  <w:num w:numId="10" w16cid:durableId="296297491">
     <w:abstractNumId w:val="13"/>
   </w:num>
-  <w:num w:numId="11">
+  <w:num w:numId="11" w16cid:durableId="13656735">
     <w:abstractNumId w:val="2"/>
   </w:num>
-  <w:num w:numId="12">
+  <w:num w:numId="12" w16cid:durableId="477573126">
     <w:abstractNumId w:val="11"/>
   </w:num>
-  <w:num w:numId="13">
+  <w:num w:numId="13" w16cid:durableId="199901872">
     <w:abstractNumId w:val="12"/>
   </w:num>
-  <w:num w:numId="14">
+  <w:num w:numId="14" w16cid:durableId="970088727">
     <w:abstractNumId w:val="6"/>
   </w:num>
 </w:numbering>
 </file>
 
 <file path=word/styles.xml><?xml version="1.0" encoding="utf-8"?>
-<w:styles xmlns:mc="http://schemas.openxmlformats.org/markup-compatibility/2006" xmlns:r="http://schemas.openxmlformats.org/officeDocument/2006/relationships" xmlns:w="http://schemas.openxmlformats.org/wordprocessingml/2006/main" xmlns:w14="http://schemas.microsoft.com/office/word/2010/wordml" xmlns:w15="http://schemas.microsoft.com/office/word/2012/wordml" xmlns:w16cex="http://schemas.microsoft.com/office/word/2018/wordml/cex" xmlns:w16cid="http://schemas.microsoft.com/office/word/2016/wordml/cid" xmlns:w16="http://schemas.microsoft.com/office/word/2018/wordml" xmlns:w16sdtdh="http://schemas.microsoft.com/office/word/2020/wordml/sdtdatahash" xmlns:w16se="http://schemas.microsoft.com/office/word/2015/wordml/symex" mc:Ignorable="w14 w15 w16se w16cid w16 w16cex w16sdtdh">
+<w:styles xmlns:mc="http://schemas.openxmlformats.org/markup-compatibility/2006" xmlns:r="http://schemas.openxmlformats.org/officeDocument/2006/relationships" xmlns:w="http://schemas.openxmlformats.org/wordprocessingml/2006/main" xmlns:w14="http://schemas.microsoft.com/office/word/2010/wordml" xmlns:w15="http://schemas.microsoft.com/office/word/2012/wordml" xmlns:w16cex="http://schemas.microsoft.com/office/word/2018/wordml/cex" xmlns:w16cid="http://schemas.microsoft.com/office/word/2016/wordml/cid" xmlns:w16="http://schemas.microsoft.com/office/word/2018/wordml" xmlns:w16du="http://schemas.microsoft.com/office/word/2023/wordml/word16du" xmlns:w16sdtdh="http://schemas.microsoft.com/office/word/2020/wordml/sdtdatahash" xmlns:w16sdtfl="http://schemas.microsoft.com/office/word/2024/wordml/sdtformatlock" xmlns:w16se="http://schemas.microsoft.com/office/word/2015/wordml/symex" mc:Ignorable="w14 w15 w16se w16cid w16 w16cex w16sdtdh w16sdtfl w16du">
   <w:docDefaults>
     <w:rPrDefault>
       <w:rPr>

</xml_diff>

<commit_message>
feat: completar archivo historico, galeria audiovisual y documentacion final feat: completar archivo historico, galeria audiovisual y documentacion final
</commit_message>
<xml_diff>
--- a/docs/Reporte-landing-page.docx
+++ b/docs/Reporte-landing-page.docx
@@ -1,6 +1,6 @@
 
 <file path=word/document.xml><?xml version="1.0" encoding="utf-8"?>
-<w:document xmlns:wpc="http://schemas.microsoft.com/office/word/2010/wordprocessingCanvas" xmlns:cx="http://schemas.microsoft.com/office/drawing/2014/chartex" xmlns:cx1="http://schemas.microsoft.com/office/drawing/2015/9/8/chartex" xmlns:cx2="http://schemas.microsoft.com/office/drawing/2015/10/21/chartex" xmlns:cx3="http://schemas.microsoft.com/office/drawing/2016/5/9/chartex" xmlns:cx4="http://schemas.microsoft.com/office/drawing/2016/5/10/chartex" xmlns:cx5="http://schemas.microsoft.com/office/drawing/2016/5/11/chartex" xmlns:cx6="http://schemas.microsoft.com/office/drawing/2016/5/12/chartex" xmlns:cx7="http://schemas.microsoft.com/office/drawing/2016/5/13/chartex" xmlns:cx8="http://schemas.microsoft.com/office/drawing/2016/5/14/chartex" xmlns:mc="http://schemas.openxmlformats.org/markup-compatibility/2006" xmlns:aink="http://schemas.microsoft.com/office/drawing/2016/ink" xmlns:am3d="http://schemas.microsoft.com/office/drawing/2017/model3d" xmlns:o="urn:schemas-microsoft-com:office:office" xmlns:oel="http://schemas.microsoft.com/office/2019/extlst" xmlns:r="http://schemas.openxmlformats.org/officeDocument/2006/relationships" xmlns:m="http://schemas.openxmlformats.org/officeDocument/2006/math" xmlns:v="urn:schemas-microsoft-com:vml" xmlns:wp14="http://schemas.microsoft.com/office/word/2010/wordprocessingDrawing" xmlns:wp="http://schemas.openxmlformats.org/drawingml/2006/wordprocessingDrawing" xmlns:w10="urn:schemas-microsoft-com:office:word" xmlns:w="http://schemas.openxmlformats.org/wordprocessingml/2006/main" xmlns:w14="http://schemas.microsoft.com/office/word/2010/wordml" xmlns:w15="http://schemas.microsoft.com/office/word/2012/wordml" xmlns:w16cex="http://schemas.microsoft.com/office/word/2018/wordml/cex" xmlns:w16cid="http://schemas.microsoft.com/office/word/2016/wordml/cid" xmlns:w16="http://schemas.microsoft.com/office/word/2018/wordml" xmlns:w16du="http://schemas.microsoft.com/office/word/2023/wordml/word16du" xmlns:w16sdtdh="http://schemas.microsoft.com/office/word/2020/wordml/sdtdatahash" xmlns:w16sdtfl="http://schemas.microsoft.com/office/word/2024/wordml/sdtformatlock" xmlns:w16se="http://schemas.microsoft.com/office/word/2015/wordml/symex" xmlns:wpg="http://schemas.microsoft.com/office/word/2010/wordprocessingGroup" xmlns:wpi="http://schemas.microsoft.com/office/word/2010/wordprocessingInk" xmlns:wne="http://schemas.microsoft.com/office/word/2006/wordml" xmlns:wps="http://schemas.microsoft.com/office/word/2010/wordprocessingShape" mc:Ignorable="w14 w15 w16se w16cid w16 w16cex w16sdtdh w16sdtfl w16du wp14">
+<w:document xmlns:wpc="http://schemas.microsoft.com/office/word/2010/wordprocessingCanvas" xmlns:cx="http://schemas.microsoft.com/office/drawing/2014/chartex" xmlns:cx1="http://schemas.microsoft.com/office/drawing/2015/9/8/chartex" xmlns:cx2="http://schemas.microsoft.com/office/drawing/2015/10/21/chartex" xmlns:cx3="http://schemas.microsoft.com/office/drawing/2016/5/9/chartex" xmlns:cx4="http://schemas.microsoft.com/office/drawing/2016/5/10/chartex" xmlns:cx5="http://schemas.microsoft.com/office/drawing/2016/5/11/chartex" xmlns:cx6="http://schemas.microsoft.com/office/drawing/2016/5/12/chartex" xmlns:cx7="http://schemas.microsoft.com/office/drawing/2016/5/13/chartex" xmlns:cx8="http://schemas.microsoft.com/office/drawing/2016/5/14/chartex" xmlns:mc="http://schemas.openxmlformats.org/markup-compatibility/2006" xmlns:aink="http://schemas.microsoft.com/office/drawing/2016/ink" xmlns:am3d="http://schemas.microsoft.com/office/drawing/2017/model3d" xmlns:o="urn:schemas-microsoft-com:office:office" xmlns:r="http://schemas.openxmlformats.org/officeDocument/2006/relationships" xmlns:m="http://schemas.openxmlformats.org/officeDocument/2006/math" xmlns:v="urn:schemas-microsoft-com:vml" xmlns:wp14="http://schemas.microsoft.com/office/word/2010/wordprocessingDrawing" xmlns:wp="http://schemas.openxmlformats.org/drawingml/2006/wordprocessingDrawing" xmlns:w10="urn:schemas-microsoft-com:office:word" xmlns:w="http://schemas.openxmlformats.org/wordprocessingml/2006/main" xmlns:w14="http://schemas.microsoft.com/office/word/2010/wordml" xmlns:w15="http://schemas.microsoft.com/office/word/2012/wordml" xmlns:w16cex="http://schemas.microsoft.com/office/word/2018/wordml/cex" xmlns:w16cid="http://schemas.microsoft.com/office/word/2016/wordml/cid" xmlns:w16="http://schemas.microsoft.com/office/word/2018/wordml" xmlns:w16sdtdh="http://schemas.microsoft.com/office/word/2020/wordml/sdtdatahash" xmlns:w16se="http://schemas.microsoft.com/office/word/2015/wordml/symex" xmlns:wpg="http://schemas.microsoft.com/office/word/2010/wordprocessingGroup" xmlns:wpi="http://schemas.microsoft.com/office/word/2010/wordprocessingInk" xmlns:wne="http://schemas.microsoft.com/office/word/2006/wordml" xmlns:wps="http://schemas.microsoft.com/office/word/2010/wordprocessingShape" mc:Ignorable="w14 w15 w16se w16cid w16 w16cex w16sdtdh wp14">
   <w:body>
     <w:sdt>
       <w:sdtPr>
@@ -165,6 +165,7 @@
                                     <w:calendar w:val="gregorian"/>
                                   </w:date>
                                 </w:sdtPr>
+                                <w:sdtEndPr/>
                                 <w:sdtContent>
                                   <w:p>
                                     <w:pPr>
@@ -362,6 +363,7 @@
                                   <w:dataBinding w:prefixMappings="xmlns:ns0='http://purl.org/dc/elements/1.1/' xmlns:ns1='http://schemas.openxmlformats.org/package/2006/metadata/core-properties' " w:xpath="/ns1:coreProperties[1]/ns0:creator[1]" w:storeItemID="{6C3C8BC8-F283-45AE-878A-BAB7291924A1}"/>
                                   <w:text/>
                                 </w:sdtPr>
+                                <w:sdtEndPr/>
                                 <w:sdtContent>
                                   <w:p>
                                     <w:pPr>
@@ -412,6 +414,7 @@
                                     <w:dataBinding w:prefixMappings="xmlns:ns0='http://schemas.openxmlformats.org/officeDocument/2006/extended-properties' " w:xpath="/ns0:Properties[1]/ns0:Company[1]" w:storeItemID="{6668398D-A668-4E3E-A5EB-62B293D839F1}"/>
                                     <w:text/>
                                   </w:sdtPr>
+                                  <w:sdtEndPr/>
                                   <w:sdtContent>
                                     <w:r>
                                       <w:rPr>
@@ -656,6 +659,7 @@
                                     <w:dataBinding w:prefixMappings="xmlns:ns0='http://purl.org/dc/elements/1.1/' xmlns:ns1='http://schemas.openxmlformats.org/package/2006/metadata/core-properties' " w:xpath="/ns1:coreProperties[1]/ns0:title[1]" w:storeItemID="{6C3C8BC8-F283-45AE-878A-BAB7291924A1}"/>
                                     <w:text w:multiLine="1"/>
                                   </w:sdtPr>
+                                  <w:sdtEndPr/>
                                   <w:sdtContent>
                                     <w:r>
                                       <w:rPr>
@@ -684,6 +688,7 @@
                                   <w:dataBinding w:prefixMappings="xmlns:ns0='http://purl.org/dc/elements/1.1/' xmlns:ns1='http://schemas.openxmlformats.org/package/2006/metadata/core-properties' " w:xpath="/ns1:coreProperties[1]/ns0:subject[1]" w:storeItemID="{6C3C8BC8-F283-45AE-878A-BAB7291924A1}"/>
                                   <w:text/>
                                 </w:sdtPr>
+                                <w:sdtEndPr/>
                                 <w:sdtContent>
                                   <w:p>
                                     <w:pPr>
@@ -1062,7 +1067,7 @@
               <w:r>
                 <w:fldChar w:fldCharType="separate"/>
               </w:r>
-              <w:hyperlink w:anchor="_Toc243075235" w:history="1">
+              <w:hyperlink w:anchor="_Toc243674494" w:history="1">
                 <w:r>
                   <w:rPr>
                     <w:rStyle w:val="Hipervnculo"/>
@@ -1090,7 +1095,7 @@
                     <w:noProof/>
                     <w:webHidden/>
                   </w:rPr>
-                  <w:instrText xml:space="preserve"> PAGEREF _Toc243075235 \h </w:instrText>
+                  <w:instrText xml:space="preserve"> PAGEREF _Toc243674494 \h </w:instrText>
                 </w:r>
                 <w:r>
                   <w:rPr>
@@ -1128,10 +1133,12 @@
                   <w:tab w:val="right" w:leader="dot" w:pos="8494"/>
                 </w:tabs>
                 <w:rPr>
+                  <w:rFonts w:eastAsiaTheme="minorEastAsia"/>
                   <w:noProof/>
+                  <w:lang w:val="es-MX" w:eastAsia="es-MX"/>
                 </w:rPr>
               </w:pPr>
-              <w:hyperlink w:anchor="_Toc243075236" w:history="1">
+              <w:hyperlink w:anchor="_Toc243674495" w:history="1">
                 <w:r>
                   <w:rPr>
                     <w:rStyle w:val="Hipervnculo"/>
@@ -1159,7 +1166,7 @@
                     <w:noProof/>
                     <w:webHidden/>
                   </w:rPr>
-                  <w:instrText xml:space="preserve"> PAGEREF _Toc243075236 \h </w:instrText>
+                  <w:instrText xml:space="preserve"> PAGEREF _Toc243674495 \h </w:instrText>
                 </w:r>
                 <w:r>
                   <w:rPr>
@@ -1197,10 +1204,12 @@
                   <w:tab w:val="right" w:leader="dot" w:pos="8494"/>
                 </w:tabs>
                 <w:rPr>
+                  <w:rFonts w:eastAsiaTheme="minorEastAsia"/>
                   <w:noProof/>
+                  <w:lang w:val="es-MX" w:eastAsia="es-MX"/>
                 </w:rPr>
               </w:pPr>
-              <w:hyperlink w:anchor="_Toc243075237" w:history="1">
+              <w:hyperlink w:anchor="_Toc243674496" w:history="1">
                 <w:r>
                   <w:rPr>
                     <w:rStyle w:val="Hipervnculo"/>
@@ -1228,7 +1237,7 @@
                     <w:noProof/>
                     <w:webHidden/>
                   </w:rPr>
-                  <w:instrText xml:space="preserve"> PAGEREF _Toc243075237 \h </w:instrText>
+                  <w:instrText xml:space="preserve"> PAGEREF _Toc243674496 \h </w:instrText>
                 </w:r>
                 <w:r>
                   <w:rPr>
@@ -1266,10 +1275,12 @@
                   <w:tab w:val="right" w:leader="dot" w:pos="8494"/>
                 </w:tabs>
                 <w:rPr>
+                  <w:rFonts w:eastAsiaTheme="minorEastAsia"/>
                   <w:noProof/>
+                  <w:lang w:val="es-MX" w:eastAsia="es-MX"/>
                 </w:rPr>
               </w:pPr>
-              <w:hyperlink w:anchor="_Toc243075238" w:history="1">
+              <w:hyperlink w:anchor="_Toc243674497" w:history="1">
                 <w:r>
                   <w:rPr>
                     <w:rStyle w:val="Hipervnculo"/>
@@ -1297,7 +1308,7 @@
                     <w:noProof/>
                     <w:webHidden/>
                   </w:rPr>
-                  <w:instrText xml:space="preserve"> PAGEREF _Toc243075238 \h </w:instrText>
+                  <w:instrText xml:space="preserve"> PAGEREF _Toc243674497 \h </w:instrText>
                 </w:r>
                 <w:r>
                   <w:rPr>
@@ -1317,7 +1328,7 @@
                     <w:noProof/>
                     <w:webHidden/>
                   </w:rPr>
-                  <w:t>2</w:t>
+                  <w:t>3</w:t>
                 </w:r>
                 <w:r>
                   <w:rPr>
@@ -1340,7 +1351,7 @@
                   <w:lang w:val="es-MX" w:eastAsia="es-MX"/>
                 </w:rPr>
               </w:pPr>
-              <w:hyperlink w:anchor="_Toc243075239" w:history="1">
+              <w:hyperlink w:anchor="_Toc243674498" w:history="1">
                 <w:r>
                   <w:rPr>
                     <w:rStyle w:val="Hipervnculo"/>
@@ -1368,7 +1379,7 @@
                     <w:noProof/>
                     <w:webHidden/>
                   </w:rPr>
-                  <w:instrText xml:space="preserve"> PAGEREF _Toc243075239 \h </w:instrText>
+                  <w:instrText xml:space="preserve"> PAGEREF _Toc243674498 \h </w:instrText>
                 </w:r>
                 <w:r>
                   <w:rPr>
@@ -1406,10 +1417,12 @@
                   <w:tab w:val="right" w:leader="dot" w:pos="8494"/>
                 </w:tabs>
                 <w:rPr>
+                  <w:rFonts w:eastAsiaTheme="minorEastAsia"/>
                   <w:noProof/>
+                  <w:lang w:val="es-MX" w:eastAsia="es-MX"/>
                 </w:rPr>
               </w:pPr>
-              <w:hyperlink w:anchor="_Toc243075240" w:history="1">
+              <w:hyperlink w:anchor="_Toc243674499" w:history="1">
                 <w:r>
                   <w:rPr>
                     <w:rStyle w:val="Hipervnculo"/>
@@ -1437,7 +1450,7 @@
                     <w:noProof/>
                     <w:webHidden/>
                   </w:rPr>
-                  <w:instrText xml:space="preserve"> PAGEREF _Toc243075240 \h </w:instrText>
+                  <w:instrText xml:space="preserve"> PAGEREF _Toc243674499 \h </w:instrText>
                 </w:r>
                 <w:r>
                   <w:rPr>
@@ -1475,10 +1488,12 @@
                   <w:tab w:val="right" w:leader="dot" w:pos="8494"/>
                 </w:tabs>
                 <w:rPr>
+                  <w:rFonts w:eastAsiaTheme="minorEastAsia"/>
                   <w:noProof/>
+                  <w:lang w:val="es-MX" w:eastAsia="es-MX"/>
                 </w:rPr>
               </w:pPr>
-              <w:hyperlink w:anchor="_Toc243075241" w:history="1">
+              <w:hyperlink w:anchor="_Toc243674500" w:history="1">
                 <w:r>
                   <w:rPr>
                     <w:rStyle w:val="Hipervnculo"/>
@@ -1506,7 +1521,7 @@
                     <w:noProof/>
                     <w:webHidden/>
                   </w:rPr>
-                  <w:instrText xml:space="preserve"> PAGEREF _Toc243075241 \h </w:instrText>
+                  <w:instrText xml:space="preserve"> PAGEREF _Toc243674500 \h </w:instrText>
                 </w:r>
                 <w:r>
                   <w:rPr>
@@ -1544,10 +1559,12 @@
                   <w:tab w:val="right" w:leader="dot" w:pos="8494"/>
                 </w:tabs>
                 <w:rPr>
+                  <w:rFonts w:eastAsiaTheme="minorEastAsia"/>
                   <w:noProof/>
+                  <w:lang w:val="es-MX" w:eastAsia="es-MX"/>
                 </w:rPr>
               </w:pPr>
-              <w:hyperlink w:anchor="_Toc243075242" w:history="1">
+              <w:hyperlink w:anchor="_Toc243674501" w:history="1">
                 <w:r>
                   <w:rPr>
                     <w:rStyle w:val="Hipervnculo"/>
@@ -1575,7 +1592,7 @@
                     <w:noProof/>
                     <w:webHidden/>
                   </w:rPr>
-                  <w:instrText xml:space="preserve"> PAGEREF _Toc243075242 \h </w:instrText>
+                  <w:instrText xml:space="preserve"> PAGEREF _Toc243674501 \h </w:instrText>
                 </w:r>
                 <w:r>
                   <w:rPr>
@@ -1613,10 +1630,12 @@
                   <w:tab w:val="right" w:leader="dot" w:pos="8494"/>
                 </w:tabs>
                 <w:rPr>
+                  <w:rFonts w:eastAsiaTheme="minorEastAsia"/>
                   <w:noProof/>
+                  <w:lang w:val="es-MX" w:eastAsia="es-MX"/>
                 </w:rPr>
               </w:pPr>
-              <w:hyperlink w:anchor="_Toc243075243" w:history="1">
+              <w:hyperlink w:anchor="_Toc243674502" w:history="1">
                 <w:r>
                   <w:rPr>
                     <w:rStyle w:val="Hipervnculo"/>
@@ -1644,7 +1663,7 @@
                     <w:noProof/>
                     <w:webHidden/>
                   </w:rPr>
-                  <w:instrText xml:space="preserve"> PAGEREF _Toc243075243 \h </w:instrText>
+                  <w:instrText xml:space="preserve"> PAGEREF _Toc243674502 \h </w:instrText>
                 </w:r>
                 <w:r>
                   <w:rPr>
@@ -1687,7 +1706,7 @@
                   <w:lang w:val="es-MX" w:eastAsia="es-MX"/>
                 </w:rPr>
               </w:pPr>
-              <w:hyperlink w:anchor="_Toc243075244" w:history="1">
+              <w:hyperlink w:anchor="_Toc243674503" w:history="1">
                 <w:r>
                   <w:rPr>
                     <w:rStyle w:val="Hipervnculo"/>
@@ -1715,7 +1734,7 @@
                     <w:noProof/>
                     <w:webHidden/>
                   </w:rPr>
-                  <w:instrText xml:space="preserve"> PAGEREF _Toc243075244 \h </w:instrText>
+                  <w:instrText xml:space="preserve"> PAGEREF _Toc243674503 \h </w:instrText>
                 </w:r>
                 <w:r>
                   <w:rPr>
@@ -1735,7 +1754,7 @@
                     <w:noProof/>
                     <w:webHidden/>
                   </w:rPr>
-                  <w:t>5</w:t>
+                  <w:t>6</w:t>
                 </w:r>
                 <w:r>
                   <w:rPr>
@@ -1753,10 +1772,12 @@
                   <w:tab w:val="right" w:leader="dot" w:pos="8494"/>
                 </w:tabs>
                 <w:rPr>
+                  <w:rFonts w:eastAsiaTheme="minorEastAsia"/>
                   <w:noProof/>
+                  <w:lang w:val="es-MX" w:eastAsia="es-MX"/>
                 </w:rPr>
               </w:pPr>
-              <w:hyperlink w:anchor="_Toc243075245" w:history="1">
+              <w:hyperlink w:anchor="_Toc243674504" w:history="1">
                 <w:r>
                   <w:rPr>
                     <w:rStyle w:val="Hipervnculo"/>
@@ -1784,7 +1805,7 @@
                     <w:noProof/>
                     <w:webHidden/>
                   </w:rPr>
-                  <w:instrText xml:space="preserve"> PAGEREF _Toc243075245 \h </w:instrText>
+                  <w:instrText xml:space="preserve"> PAGEREF _Toc243674504 \h </w:instrText>
                 </w:r>
                 <w:r>
                   <w:rPr>
@@ -1804,7 +1825,7 @@
                     <w:noProof/>
                     <w:webHidden/>
                   </w:rPr>
-                  <w:t>5</w:t>
+                  <w:t>6</w:t>
                 </w:r>
                 <w:r>
                   <w:rPr>
@@ -1822,10 +1843,12 @@
                   <w:tab w:val="right" w:leader="dot" w:pos="8494"/>
                 </w:tabs>
                 <w:rPr>
+                  <w:rFonts w:eastAsiaTheme="minorEastAsia"/>
                   <w:noProof/>
+                  <w:lang w:val="es-MX" w:eastAsia="es-MX"/>
                 </w:rPr>
               </w:pPr>
-              <w:hyperlink w:anchor="_Toc243075246" w:history="1">
+              <w:hyperlink w:anchor="_Toc243674505" w:history="1">
                 <w:r>
                   <w:rPr>
                     <w:rStyle w:val="Hipervnculo"/>
@@ -1853,7 +1876,7 @@
                     <w:noProof/>
                     <w:webHidden/>
                   </w:rPr>
-                  <w:instrText xml:space="preserve"> PAGEREF _Toc243075246 \h </w:instrText>
+                  <w:instrText xml:space="preserve"> PAGEREF _Toc243674505 \h </w:instrText>
                 </w:r>
                 <w:r>
                   <w:rPr>
@@ -1896,7 +1919,7 @@
                   <w:lang w:val="es-MX" w:eastAsia="es-MX"/>
                 </w:rPr>
               </w:pPr>
-              <w:hyperlink w:anchor="_Toc243075247" w:history="1">
+              <w:hyperlink w:anchor="_Toc243674506" w:history="1">
                 <w:r>
                   <w:rPr>
                     <w:rStyle w:val="Hipervnculo"/>
@@ -1924,7 +1947,7 @@
                     <w:noProof/>
                     <w:webHidden/>
                   </w:rPr>
-                  <w:instrText xml:space="preserve"> PAGEREF _Toc243075247 \h </w:instrText>
+                  <w:instrText xml:space="preserve"> PAGEREF _Toc243674506 \h </w:instrText>
                 </w:r>
                 <w:r>
                   <w:rPr>
@@ -1944,7 +1967,7 @@
                     <w:noProof/>
                     <w:webHidden/>
                   </w:rPr>
-                  <w:t>6</w:t>
+                  <w:t>7</w:t>
                 </w:r>
                 <w:r>
                   <w:rPr>
@@ -1962,10 +1985,12 @@
                   <w:tab w:val="right" w:leader="dot" w:pos="8494"/>
                 </w:tabs>
                 <w:rPr>
+                  <w:rFonts w:eastAsiaTheme="minorEastAsia"/>
                   <w:noProof/>
+                  <w:lang w:val="es-MX" w:eastAsia="es-MX"/>
                 </w:rPr>
               </w:pPr>
-              <w:hyperlink w:anchor="_Toc243075248" w:history="1">
+              <w:hyperlink w:anchor="_Toc243674507" w:history="1">
                 <w:r>
                   <w:rPr>
                     <w:rStyle w:val="Hipervnculo"/>
@@ -1993,7 +2018,7 @@
                     <w:noProof/>
                     <w:webHidden/>
                   </w:rPr>
-                  <w:instrText xml:space="preserve"> PAGEREF _Toc243075248 \h </w:instrText>
+                  <w:instrText xml:space="preserve"> PAGEREF _Toc243674507 \h </w:instrText>
                 </w:r>
                 <w:r>
                   <w:rPr>
@@ -2013,7 +2038,7 @@
                     <w:noProof/>
                     <w:webHidden/>
                   </w:rPr>
-                  <w:t>6</w:t>
+                  <w:t>7</w:t>
                 </w:r>
                 <w:r>
                   <w:rPr>
@@ -2031,10 +2056,12 @@
                   <w:tab w:val="right" w:leader="dot" w:pos="8494"/>
                 </w:tabs>
                 <w:rPr>
+                  <w:rFonts w:eastAsiaTheme="minorEastAsia"/>
                   <w:noProof/>
+                  <w:lang w:val="es-MX" w:eastAsia="es-MX"/>
                 </w:rPr>
               </w:pPr>
-              <w:hyperlink w:anchor="_Toc243075249" w:history="1">
+              <w:hyperlink w:anchor="_Toc243674508" w:history="1">
                 <w:r>
                   <w:rPr>
                     <w:rStyle w:val="Hipervnculo"/>
@@ -2062,7 +2089,7 @@
                     <w:noProof/>
                     <w:webHidden/>
                   </w:rPr>
-                  <w:instrText xml:space="preserve"> PAGEREF _Toc243075249 \h </w:instrText>
+                  <w:instrText xml:space="preserve"> PAGEREF _Toc243674508 \h </w:instrText>
                 </w:r>
                 <w:r>
                   <w:rPr>
@@ -2082,7 +2109,7 @@
                     <w:noProof/>
                     <w:webHidden/>
                   </w:rPr>
-                  <w:t>6</w:t>
+                  <w:t>7</w:t>
                 </w:r>
                 <w:r>
                   <w:rPr>
@@ -2100,10 +2127,12 @@
                   <w:tab w:val="right" w:leader="dot" w:pos="8494"/>
                 </w:tabs>
                 <w:rPr>
+                  <w:rFonts w:eastAsiaTheme="minorEastAsia"/>
                   <w:noProof/>
+                  <w:lang w:val="es-MX" w:eastAsia="es-MX"/>
                 </w:rPr>
               </w:pPr>
-              <w:hyperlink w:anchor="_Toc243075250" w:history="1">
+              <w:hyperlink w:anchor="_Toc243674509" w:history="1">
                 <w:r>
                   <w:rPr>
                     <w:rStyle w:val="Hipervnculo"/>
@@ -2131,7 +2160,7 @@
                     <w:noProof/>
                     <w:webHidden/>
                   </w:rPr>
-                  <w:instrText xml:space="preserve"> PAGEREF _Toc243075250 \h </w:instrText>
+                  <w:instrText xml:space="preserve"> PAGEREF _Toc243674509 \h </w:instrText>
                 </w:r>
                 <w:r>
                   <w:rPr>
@@ -2169,10 +2198,12 @@
                   <w:tab w:val="right" w:leader="dot" w:pos="8494"/>
                 </w:tabs>
                 <w:rPr>
+                  <w:rFonts w:eastAsiaTheme="minorEastAsia"/>
                   <w:noProof/>
+                  <w:lang w:val="es-MX" w:eastAsia="es-MX"/>
                 </w:rPr>
               </w:pPr>
-              <w:hyperlink w:anchor="_Toc243075251" w:history="1">
+              <w:hyperlink w:anchor="_Toc243674510" w:history="1">
                 <w:r>
                   <w:rPr>
                     <w:rStyle w:val="Hipervnculo"/>
@@ -2200,7 +2231,7 @@
                     <w:noProof/>
                     <w:webHidden/>
                   </w:rPr>
-                  <w:instrText xml:space="preserve"> PAGEREF _Toc243075251 \h </w:instrText>
+                  <w:instrText xml:space="preserve"> PAGEREF _Toc243674510 \h </w:instrText>
                 </w:r>
                 <w:r>
                   <w:rPr>
@@ -2220,7 +2251,7 @@
                     <w:noProof/>
                     <w:webHidden/>
                   </w:rPr>
-                  <w:t>7</w:t>
+                  <w:t>8</w:t>
                 </w:r>
                 <w:r>
                   <w:rPr>
@@ -2243,14 +2274,14 @@
                   <w:lang w:val="es-MX" w:eastAsia="es-MX"/>
                 </w:rPr>
               </w:pPr>
-              <w:hyperlink w:anchor="_Toc243075252" w:history="1">
+              <w:hyperlink w:anchor="_Toc243674511" w:history="1">
                 <w:r>
                   <w:rPr>
                     <w:rStyle w:val="Hipervnculo"/>
                     <w:noProof/>
-                    <w:lang w:val="es-EC"/>
-                  </w:rPr>
-                  <w:t>Despliegue</w:t>
+                    <w:lang w:val="es-MX"/>
+                  </w:rPr>
+                  <w:t>Personalización y funcionalidades implementadas</w:t>
                 </w:r>
                 <w:r>
                   <w:rPr>
@@ -2271,7 +2302,7 @@
                     <w:noProof/>
                     <w:webHidden/>
                   </w:rPr>
-                  <w:instrText xml:space="preserve"> PAGEREF _Toc243075252 \h </w:instrText>
+                  <w:instrText xml:space="preserve"> PAGEREF _Toc243674511 \h </w:instrText>
                 </w:r>
                 <w:r>
                   <w:rPr>
@@ -2291,7 +2322,7 @@
                     <w:noProof/>
                     <w:webHidden/>
                   </w:rPr>
-                  <w:t>7</w:t>
+                  <w:t>8</w:t>
                 </w:r>
                 <w:r>
                   <w:rPr>
@@ -2314,13 +2345,155 @@
                   <w:lang w:val="es-MX" w:eastAsia="es-MX"/>
                 </w:rPr>
               </w:pPr>
-              <w:hyperlink w:anchor="_Toc243075253" w:history="1">
+              <w:hyperlink w:anchor="_Toc243674512" w:history="1">
                 <w:r>
                   <w:rPr>
                     <w:rStyle w:val="Hipervnculo"/>
                     <w:noProof/>
                     <w:lang w:val="es-EC"/>
                   </w:rPr>
+                  <w:t>Despliegue</w:t>
+                </w:r>
+                <w:r>
+                  <w:rPr>
+                    <w:noProof/>
+                    <w:webHidden/>
+                  </w:rPr>
+                  <w:tab/>
+                </w:r>
+                <w:r>
+                  <w:rPr>
+                    <w:noProof/>
+                    <w:webHidden/>
+                  </w:rPr>
+                  <w:fldChar w:fldCharType="begin"/>
+                </w:r>
+                <w:r>
+                  <w:rPr>
+                    <w:noProof/>
+                    <w:webHidden/>
+                  </w:rPr>
+                  <w:instrText xml:space="preserve"> PAGEREF _Toc243674512 \h </w:instrText>
+                </w:r>
+                <w:r>
+                  <w:rPr>
+                    <w:noProof/>
+                    <w:webHidden/>
+                  </w:rPr>
+                </w:r>
+                <w:r>
+                  <w:rPr>
+                    <w:noProof/>
+                    <w:webHidden/>
+                  </w:rPr>
+                  <w:fldChar w:fldCharType="separate"/>
+                </w:r>
+                <w:r>
+                  <w:rPr>
+                    <w:noProof/>
+                    <w:webHidden/>
+                  </w:rPr>
+                  <w:t>9</w:t>
+                </w:r>
+                <w:r>
+                  <w:rPr>
+                    <w:noProof/>
+                    <w:webHidden/>
+                  </w:rPr>
+                  <w:fldChar w:fldCharType="end"/>
+                </w:r>
+              </w:hyperlink>
+            </w:p>
+            <w:p>
+              <w:pPr>
+                <w:pStyle w:val="TDC1"/>
+                <w:tabs>
+                  <w:tab w:val="right" w:leader="dot" w:pos="8494"/>
+                </w:tabs>
+                <w:rPr>
+                  <w:rFonts w:eastAsiaTheme="minorEastAsia"/>
+                  <w:noProof/>
+                  <w:lang w:val="es-MX" w:eastAsia="es-MX"/>
+                </w:rPr>
+              </w:pPr>
+              <w:hyperlink w:anchor="_Toc243674513" w:history="1">
+                <w:r>
+                  <w:rPr>
+                    <w:rStyle w:val="Hipervnculo"/>
+                    <w:noProof/>
+                    <w:lang w:val="es-EC"/>
+                  </w:rPr>
+                  <w:t>Evidencias de implementación</w:t>
+                </w:r>
+                <w:r>
+                  <w:rPr>
+                    <w:noProof/>
+                    <w:webHidden/>
+                  </w:rPr>
+                  <w:tab/>
+                </w:r>
+                <w:r>
+                  <w:rPr>
+                    <w:noProof/>
+                    <w:webHidden/>
+                  </w:rPr>
+                  <w:fldChar w:fldCharType="begin"/>
+                </w:r>
+                <w:r>
+                  <w:rPr>
+                    <w:noProof/>
+                    <w:webHidden/>
+                  </w:rPr>
+                  <w:instrText xml:space="preserve"> PAGEREF _Toc243674513 \h </w:instrText>
+                </w:r>
+                <w:r>
+                  <w:rPr>
+                    <w:noProof/>
+                    <w:webHidden/>
+                  </w:rPr>
+                </w:r>
+                <w:r>
+                  <w:rPr>
+                    <w:noProof/>
+                    <w:webHidden/>
+                  </w:rPr>
+                  <w:fldChar w:fldCharType="separate"/>
+                </w:r>
+                <w:r>
+                  <w:rPr>
+                    <w:noProof/>
+                    <w:webHidden/>
+                  </w:rPr>
+                  <w:t>9</w:t>
+                </w:r>
+                <w:r>
+                  <w:rPr>
+                    <w:noProof/>
+                    <w:webHidden/>
+                  </w:rPr>
+                  <w:fldChar w:fldCharType="end"/>
+                </w:r>
+              </w:hyperlink>
+            </w:p>
+            <w:p>
+              <w:pPr>
+                <w:pStyle w:val="TDC1"/>
+                <w:tabs>
+                  <w:tab w:val="right" w:leader="dot" w:pos="8494"/>
+                </w:tabs>
+                <w:rPr>
+                  <w:rFonts w:eastAsiaTheme="minorEastAsia"/>
+                  <w:noProof/>
+                  <w:lang w:val="es-MX" w:eastAsia="es-MX"/>
+                </w:rPr>
+              </w:pPr>
+              <w:hyperlink w:anchor="_Toc243674514" w:history="1">
+                <w:r>
+                  <w:rPr>
+                    <w:rStyle w:val="Hipervnculo"/>
+                    <w:noProof/>
+                    <w:lang w:val="es-EC"/>
+                  </w:rPr>
                   <w:t>Bibliografía</w:t>
                 </w:r>
                 <w:r>
@@ -2342,7 +2515,7 @@
                     <w:noProof/>
                     <w:webHidden/>
                   </w:rPr>
-                  <w:instrText xml:space="preserve"> PAGEREF _Toc243075253 \h </w:instrText>
+                  <w:instrText xml:space="preserve"> PAGEREF _Toc243674514 \h </w:instrText>
                 </w:r>
                 <w:r>
                   <w:rPr>
@@ -2362,7 +2535,7 @@
                     <w:noProof/>
                     <w:webHidden/>
                   </w:rPr>
-                  <w:t>8</w:t>
+                  <w:t>12</w:t>
                 </w:r>
                 <w:r>
                   <w:rPr>
@@ -2421,7 +2594,7 @@
           <w:lang w:val="es-EC"/>
         </w:rPr>
       </w:pPr>
-      <w:bookmarkStart w:id="0" w:name="_Toc243075235"/>
+      <w:bookmarkStart w:id="0" w:name="_Toc243674494"/>
       <w:r>
         <w:rPr>
           <w:lang w:val="es-EC"/>
@@ -2438,7 +2611,7 @@
           <w:lang w:val="es-EC"/>
         </w:rPr>
       </w:pPr>
-      <w:bookmarkStart w:id="1" w:name="_Toc243075236"/>
+      <w:bookmarkStart w:id="1" w:name="_Toc243674495"/>
       <w:r>
         <w:rPr>
           <w:lang w:val="es-EC"/>
@@ -2459,22 +2632,52 @@
           <w:rFonts w:ascii="Cambria" w:hAnsi="Cambria"/>
           <w:lang w:val="es-EC"/>
         </w:rPr>
-        <w:t>Arte en el Cerro es un evento cultural de acceso libre que presenta agrupaciones artísticas y busca fortalecer la conexión entre la comunidad politécnica y la ciudad.</w:t>
-      </w:r>
-    </w:p>
-    <w:p>
-      <w:pPr>
-        <w:rPr>
-          <w:rFonts w:ascii="Cambria" w:hAnsi="Cambria"/>
-          <w:lang w:val="es-EC"/>
-        </w:rPr>
-      </w:pPr>
-      <w:r>
-        <w:rPr>
-          <w:rFonts w:ascii="Cambria" w:hAnsi="Cambria"/>
-          <w:lang w:val="es-EC"/>
-        </w:rPr>
-        <w:t>El objetivo de este proyecto es desarrollar una primera versión funcional de una landing page que centralice la información del evento y permita presentar su propósito, programación artística, La información recopilada durante el levantamiento de datos servirá como base para definir el contenido del sitio. Se evitará publicar información que no haya sido confirmada por los organizadores.</w:t>
+        <w:t>Arte en el Cerro es una iniciativa cultural impulsada por la Escuela Superior Politécnica del Litoral (ESPOL), en colaboración con Segura EP y la comunidad del Cerro del Carmen. Su propósito es fortalecer la convivencia comunitaria, promover el encuentro ciudadano y utilizar el arte como herramienta de transformación social. La iniciativa se desarrolla en el marco de las acciones de vinculación entre ESPOL y su entorno, relacionadas con la visión de Distrito 100.</w:t>
+      </w:r>
+    </w:p>
+    <w:p>
+      <w:pPr>
+        <w:rPr>
+          <w:rFonts w:ascii="Cambria" w:hAnsi="Cambria"/>
+          <w:lang w:val="es-EC"/>
+        </w:rPr>
+      </w:pPr>
+      <w:r>
+        <w:rPr>
+          <w:rFonts w:ascii="Cambria" w:hAnsi="Cambria"/>
+          <w:lang w:val="es-EC"/>
+        </w:rPr>
+        <w:t>El proyecto cultural inició el 21 de julio de 2026 y contempla encuentros artísticos el primer viernes de cada mes a las 17:00. Hasta octubre de 2026 se documentaron cuatro jornadas: 21 de julio, 7 de agosto, 4 de septiembre y 2 de octubre.</w:t>
+      </w:r>
+    </w:p>
+    <w:p>
+      <w:pPr>
+        <w:rPr>
+          <w:rFonts w:ascii="Cambria" w:hAnsi="Cambria"/>
+          <w:lang w:val="es-EC"/>
+        </w:rPr>
+      </w:pPr>
+      <w:r>
+        <w:rPr>
+          <w:rFonts w:ascii="Cambria" w:hAnsi="Cambria"/>
+          <w:lang w:val="es-EC"/>
+        </w:rPr>
+        <w:t>La presente landing page se centra especialmente en la edición del 2 de octubre de 2026, en la que participaron el Coro ESPOL, el Grupo de Teatro ESPOL y la invitada especial Elena Erazo. Debido a las condiciones climáticas, esta jornada se desarrolló en el Aula Magna de ESPOL Campus Las Peñas, en lugar del espacio exterior inicialmente previsto.</w:t>
+      </w:r>
+    </w:p>
+    <w:p>
+      <w:pPr>
+        <w:rPr>
+          <w:rFonts w:ascii="Cambria" w:hAnsi="Cambria"/>
+          <w:lang w:val="es-EC"/>
+        </w:rPr>
+      </w:pPr>
+      <w:r>
+        <w:rPr>
+          <w:rFonts w:ascii="Cambria" w:hAnsi="Cambria"/>
+          <w:lang w:val="es-EC"/>
+        </w:rPr>
+        <w:t>El objetivo académico fue desarrollar una página web informativa y adaptable, basada en la plantilla ZeroFour de HTML5 UP, que presentara los detalles de la edición de octubre y, de manera complementaria, mostrara la continuidad del proyecto mediante fotografías de encuentros anteriores, videos, enlaces institucionales y recursos interactivos.</w:t>
       </w:r>
     </w:p>
     <w:p>
@@ -2484,7 +2687,7 @@
           <w:lang w:val="es-EC"/>
         </w:rPr>
       </w:pPr>
-      <w:bookmarkStart w:id="2" w:name="_Toc243075237"/>
+      <w:bookmarkStart w:id="2" w:name="_Toc243674496"/>
       <w:r>
         <w:rPr>
           <w:lang w:val="es-EC"/>
@@ -2500,9 +2703,9 @@
         <w:tblLook w:val="04A0" w:firstRow="1" w:lastRow="0" w:firstColumn="1" w:lastColumn="0" w:noHBand="0" w:noVBand="1"/>
       </w:tblPr>
       <w:tblGrid>
-        <w:gridCol w:w="2832"/>
-        <w:gridCol w:w="2826"/>
-        <w:gridCol w:w="2836"/>
+        <w:gridCol w:w="2829"/>
+        <w:gridCol w:w="2823"/>
+        <w:gridCol w:w="2842"/>
       </w:tblGrid>
       <w:tr>
         <w:tc>
@@ -2576,7 +2779,7 @@
                 <w:bCs/>
                 <w:lang w:val="es-EC"/>
               </w:rPr>
-              <w:t>Datos que se presentarán</w:t>
+              <w:t>Contenido implementado</w:t>
             </w:r>
           </w:p>
         </w:tc>
@@ -2641,7 +2844,7 @@
                 <w:rFonts w:ascii="Cambria" w:hAnsi="Cambria"/>
                 <w:lang w:val="es-EC"/>
               </w:rPr>
-              <w:t xml:space="preserve">Nombre, descripción breve e imagen representativa.   </w:t>
+              <w:t>Identidad de Arte en el Cerro y presentación de la edición de octubre</w:t>
             </w:r>
           </w:p>
         </w:tc>
@@ -2706,7 +2909,7 @@
                 <w:rFonts w:ascii="Cambria" w:hAnsi="Cambria"/>
                 <w:lang w:val="es-EC"/>
               </w:rPr>
-              <w:t>Descripción, acceso libre e importancia para la comunidad.</w:t>
+              <w:t>Contexto cultural, colaboración ESPOL–Segura EP, periodicidad y descripción de la edición</w:t>
             </w:r>
           </w:p>
         </w:tc>
@@ -2771,7 +2974,7 @@
                 <w:rFonts w:ascii="Cambria" w:hAnsi="Cambria"/>
                 <w:lang w:val="es-EC"/>
               </w:rPr>
-              <w:t>Agrupaciones, descripciones y horarios confirmados.</w:t>
+              <w:t>Coro ESPOL, Grupo de Teatro ESPOL y Elena Erazo, correspondientes al 2 de octubre</w:t>
             </w:r>
           </w:p>
         </w:tc>
@@ -2836,7 +3039,23 @@
                 <w:rFonts w:ascii="Cambria" w:hAnsi="Cambria"/>
                 <w:lang w:val="es-EC"/>
               </w:rPr>
-              <w:t>Fotografías autorizadas de artistas, presentaciones y espacios.</w:t>
+              <w:t xml:space="preserve">Tres videos de octubre, nueve fotografías de fechas anteriores y </w:t>
+            </w:r>
+            <w:proofErr w:type="spellStart"/>
+            <w:r>
+              <w:rPr>
+                <w:rFonts w:ascii="Cambria" w:hAnsi="Cambria"/>
+                <w:lang w:val="es-EC"/>
+              </w:rPr>
+              <w:t>Reel</w:t>
+            </w:r>
+            <w:proofErr w:type="spellEnd"/>
+            <w:r>
+              <w:rPr>
+                <w:rFonts w:ascii="Cambria" w:hAnsi="Cambria"/>
+                <w:lang w:val="es-EC"/>
+              </w:rPr>
+              <w:t xml:space="preserve"> oficial</w:t>
             </w:r>
           </w:p>
         </w:tc>
@@ -2901,7 +3120,7 @@
                 <w:rFonts w:ascii="Cambria" w:hAnsi="Cambria"/>
                 <w:lang w:val="es-EC"/>
               </w:rPr>
-              <w:t>Fecha, horario, ubicación y novedades confirmadas.</w:t>
+              <w:t>Fecha, hora, entrada gratuita y escenario de la edición del 2 de octubre</w:t>
             </w:r>
           </w:p>
         </w:tc>
@@ -2966,7 +3185,7 @@
                 <w:rFonts w:ascii="Cambria" w:hAnsi="Cambria"/>
                 <w:lang w:val="es-EC"/>
               </w:rPr>
-              <w:t>Nombre del espacio, campus y referencia de ubicación.</w:t>
+              <w:t>Aula Magna, ESPOL Campus Las Peñas y Google Maps</w:t>
             </w:r>
           </w:p>
         </w:tc>
@@ -2989,6 +3208,7 @@
                 <w:rFonts w:ascii="Cambria" w:hAnsi="Cambria"/>
                 <w:lang w:val="es-EC"/>
               </w:rPr>
+              <w:lastRenderedPageBreak/>
               <w:t>Contacto y redes sociales</w:t>
             </w:r>
           </w:p>
@@ -3031,7 +3251,7 @@
                 <w:rFonts w:ascii="Cambria" w:hAnsi="Cambria"/>
                 <w:lang w:val="es-EC"/>
               </w:rPr>
-              <w:t>Enlaces a redes sociales y medios de contacto disponibles.</w:t>
+              <w:t>Redes institucionales y formulario demostrativo</w:t>
             </w:r>
           </w:p>
         </w:tc>
@@ -3067,7 +3287,7 @@
           <w:lang w:val="es-EC"/>
         </w:rPr>
       </w:pPr>
-      <w:bookmarkStart w:id="3" w:name="_Toc243075238"/>
+      <w:bookmarkStart w:id="3" w:name="_Toc243674497"/>
       <w:r>
         <w:rPr>
           <w:lang w:val="es-EC"/>
@@ -3211,7 +3431,6 @@
           <w:rFonts w:ascii="Cambria" w:hAnsi="Cambria"/>
           <w:lang w:val="es-EC"/>
         </w:rPr>
-        <w:lastRenderedPageBreak/>
         <w:t>Estas necesidades orientan la selección de la plantilla y las decisiones de diseño.</w:t>
       </w:r>
     </w:p>
@@ -3222,7 +3441,7 @@
           <w:lang w:val="es-EC"/>
         </w:rPr>
       </w:pPr>
-      <w:bookmarkStart w:id="4" w:name="_Toc243075239"/>
+      <w:bookmarkStart w:id="4" w:name="_Toc243674498"/>
       <w:r>
         <w:rPr>
           <w:lang w:val="es-EC"/>
@@ -3238,7 +3457,7 @@
           <w:lang w:val="es-EC"/>
         </w:rPr>
       </w:pPr>
-      <w:bookmarkStart w:id="5" w:name="_Toc243075240"/>
+      <w:bookmarkStart w:id="5" w:name="_Toc243674499"/>
       <w:r>
         <w:rPr>
           <w:lang w:val="es-EC"/>
@@ -3274,21 +3493,12 @@
           <w:lang w:val="en-US"/>
         </w:rPr>
       </w:pPr>
-      <w:proofErr w:type="spellStart"/>
       <w:r>
         <w:rPr>
           <w:rFonts w:ascii="Cambria" w:hAnsi="Cambria"/>
           <w:lang w:val="en-US"/>
         </w:rPr>
-        <w:t>ZeroFour</w:t>
-      </w:r>
-      <w:proofErr w:type="spellEnd"/>
-      <w:r>
-        <w:rPr>
-          <w:rFonts w:ascii="Cambria" w:hAnsi="Cambria"/>
-          <w:lang w:val="en-US"/>
-        </w:rPr>
-        <w:t xml:space="preserve"> (</w:t>
+        <w:t>ZeroFour (</w:t>
       </w:r>
       <w:hyperlink r:id="rId9" w:history="1">
         <w:r>
@@ -3315,14 +3525,6 @@
           <w:lang w:val="en-US"/>
         </w:rPr>
       </w:pPr>
-    </w:p>
-    <w:p>
-      <w:pPr>
-        <w:rPr>
-          <w:rFonts w:ascii="Cambria" w:hAnsi="Cambria"/>
-          <w:lang w:val="en-US"/>
-        </w:rPr>
-      </w:pPr>
       <w:r>
         <w:rPr>
           <w:rFonts w:ascii="Cambria" w:hAnsi="Cambria"/>
@@ -3330,16 +3532,16 @@
           <w:lang w:val="en-US"/>
         </w:rPr>
         <w:drawing>
-          <wp:anchor distT="0" distB="0" distL="114300" distR="114300" simplePos="0" relativeHeight="251652608" behindDoc="1" locked="0" layoutInCell="1" allowOverlap="1" wp14:anchorId="1605535D" wp14:editId="2C2E631C">
+          <wp:anchor distT="0" distB="0" distL="114300" distR="114300" simplePos="0" relativeHeight="251652608" behindDoc="1" locked="0" layoutInCell="1" allowOverlap="1" wp14:anchorId="1605535D" wp14:editId="7FDF2CAA">
             <wp:simplePos x="0" y="0"/>
-            <wp:positionH relativeFrom="column">
-              <wp:posOffset>-3810</wp:posOffset>
+            <wp:positionH relativeFrom="margin">
+              <wp:posOffset>8566</wp:posOffset>
             </wp:positionH>
             <wp:positionV relativeFrom="page">
-              <wp:posOffset>3438525</wp:posOffset>
+              <wp:posOffset>6293677</wp:posOffset>
             </wp:positionV>
             <wp:extent cx="5400040" cy="2473960"/>
-            <wp:effectExtent l="0" t="0" r="0" b="0"/>
+            <wp:effectExtent l="0" t="0" r="0" b="2540"/>
             <wp:wrapNone/>
             <wp:docPr id="1" name="Imagen 1"/>
             <wp:cNvGraphicFramePr>
@@ -3438,6 +3640,14 @@
     </w:p>
     <w:p>
       <w:pPr>
+        <w:rPr>
+          <w:rFonts w:ascii="Cambria" w:hAnsi="Cambria"/>
+          <w:lang w:val="en-US"/>
+        </w:rPr>
+      </w:pPr>
+    </w:p>
+    <w:p>
+      <w:pPr>
         <w:pStyle w:val="Prrafodelista"/>
         <w:ind w:left="720" w:firstLine="0"/>
         <w:rPr>
@@ -3492,6 +3702,76 @@
           <w:lang w:val="en-US"/>
         </w:rPr>
       </w:pPr>
+    </w:p>
+    <w:p>
+      <w:pPr>
+        <w:pStyle w:val="Prrafodelista"/>
+        <w:ind w:left="720" w:firstLine="0"/>
+        <w:rPr>
+          <w:rFonts w:ascii="Cambria" w:hAnsi="Cambria"/>
+          <w:lang w:val="en-US"/>
+        </w:rPr>
+      </w:pPr>
+    </w:p>
+    <w:p>
+      <w:pPr>
+        <w:pStyle w:val="Prrafodelista"/>
+        <w:ind w:left="720" w:firstLine="0"/>
+        <w:rPr>
+          <w:rFonts w:ascii="Cambria" w:hAnsi="Cambria"/>
+          <w:lang w:val="en-US"/>
+        </w:rPr>
+      </w:pPr>
+    </w:p>
+    <w:p>
+      <w:pPr>
+        <w:pStyle w:val="Prrafodelista"/>
+        <w:ind w:left="720" w:firstLine="0"/>
+        <w:rPr>
+          <w:rFonts w:ascii="Cambria" w:hAnsi="Cambria"/>
+          <w:lang w:val="en-US"/>
+        </w:rPr>
+      </w:pPr>
+    </w:p>
+    <w:p>
+      <w:pPr>
+        <w:pStyle w:val="Prrafodelista"/>
+        <w:ind w:left="720" w:firstLine="0"/>
+        <w:rPr>
+          <w:rFonts w:ascii="Cambria" w:hAnsi="Cambria"/>
+          <w:lang w:val="en-US"/>
+        </w:rPr>
+      </w:pPr>
+    </w:p>
+    <w:p>
+      <w:pPr>
+        <w:pStyle w:val="Prrafodelista"/>
+        <w:ind w:left="720" w:firstLine="0"/>
+        <w:rPr>
+          <w:rFonts w:ascii="Cambria" w:hAnsi="Cambria"/>
+          <w:lang w:val="en-US"/>
+        </w:rPr>
+      </w:pPr>
+    </w:p>
+    <w:p>
+      <w:pPr>
+        <w:pStyle w:val="Prrafodelista"/>
+        <w:ind w:left="720" w:firstLine="0"/>
+        <w:rPr>
+          <w:rFonts w:ascii="Cambria" w:hAnsi="Cambria"/>
+          <w:lang w:val="en-US"/>
+        </w:rPr>
+      </w:pPr>
+    </w:p>
+    <w:p>
+      <w:pPr>
+        <w:pStyle w:val="Prrafodelista"/>
+        <w:ind w:left="720" w:firstLine="0"/>
+        <w:rPr>
+          <w:rFonts w:ascii="Cambria" w:hAnsi="Cambria"/>
+          <w:lang w:val="en-US"/>
+        </w:rPr>
+      </w:pPr>
       <w:r>
         <w:rPr>
           <w:rFonts w:ascii="Cambria" w:hAnsi="Cambria"/>
@@ -3499,13 +3779,13 @@
           <w:lang w:val="en-US"/>
         </w:rPr>
         <w:drawing>
-          <wp:anchor distT="0" distB="0" distL="114300" distR="114300" simplePos="0" relativeHeight="251656704" behindDoc="1" locked="0" layoutInCell="1" allowOverlap="1" wp14:anchorId="71C35D29" wp14:editId="226DDE2D">
+          <wp:anchor distT="0" distB="0" distL="114300" distR="114300" simplePos="0" relativeHeight="251656704" behindDoc="1" locked="0" layoutInCell="1" allowOverlap="1" wp14:anchorId="71C35D29" wp14:editId="3310DEBA">
             <wp:simplePos x="0" y="0"/>
             <wp:positionH relativeFrom="column">
-              <wp:posOffset>-3810</wp:posOffset>
+              <wp:posOffset>-55568</wp:posOffset>
             </wp:positionH>
             <wp:positionV relativeFrom="page">
-              <wp:posOffset>6534150</wp:posOffset>
+              <wp:posOffset>1004618</wp:posOffset>
             </wp:positionV>
             <wp:extent cx="5400040" cy="2463800"/>
             <wp:effectExtent l="0" t="0" r="0" b="0"/>
@@ -3611,104 +3891,6 @@
     </w:p>
     <w:p>
       <w:pPr>
-        <w:pStyle w:val="Prrafodelista"/>
-        <w:ind w:left="720" w:firstLine="0"/>
-        <w:rPr>
-          <w:rFonts w:ascii="Cambria" w:hAnsi="Cambria"/>
-          <w:lang w:val="en-US"/>
-        </w:rPr>
-      </w:pPr>
-    </w:p>
-    <w:p>
-      <w:pPr>
-        <w:pStyle w:val="Prrafodelista"/>
-        <w:ind w:left="720" w:firstLine="0"/>
-        <w:rPr>
-          <w:rFonts w:ascii="Cambria" w:hAnsi="Cambria"/>
-          <w:lang w:val="en-US"/>
-        </w:rPr>
-      </w:pPr>
-    </w:p>
-    <w:p>
-      <w:pPr>
-        <w:pStyle w:val="Prrafodelista"/>
-        <w:ind w:left="720" w:firstLine="0"/>
-        <w:rPr>
-          <w:rFonts w:ascii="Cambria" w:hAnsi="Cambria"/>
-          <w:lang w:val="en-US"/>
-        </w:rPr>
-      </w:pPr>
-    </w:p>
-    <w:p>
-      <w:pPr>
-        <w:pStyle w:val="Prrafodelista"/>
-        <w:ind w:left="720" w:firstLine="0"/>
-        <w:rPr>
-          <w:rFonts w:ascii="Cambria" w:hAnsi="Cambria"/>
-          <w:lang w:val="en-US"/>
-        </w:rPr>
-      </w:pPr>
-    </w:p>
-    <w:p>
-      <w:pPr>
-        <w:pStyle w:val="Prrafodelista"/>
-        <w:ind w:left="720" w:firstLine="0"/>
-        <w:rPr>
-          <w:rFonts w:ascii="Cambria" w:hAnsi="Cambria"/>
-          <w:lang w:val="en-US"/>
-        </w:rPr>
-      </w:pPr>
-    </w:p>
-    <w:p>
-      <w:pPr>
-        <w:pStyle w:val="Prrafodelista"/>
-        <w:ind w:left="720" w:firstLine="0"/>
-        <w:rPr>
-          <w:rFonts w:ascii="Cambria" w:hAnsi="Cambria"/>
-          <w:lang w:val="en-US"/>
-        </w:rPr>
-      </w:pPr>
-    </w:p>
-    <w:p>
-      <w:pPr>
-        <w:pStyle w:val="Prrafodelista"/>
-        <w:ind w:left="720" w:firstLine="0"/>
-        <w:rPr>
-          <w:rFonts w:ascii="Cambria" w:hAnsi="Cambria"/>
-          <w:lang w:val="en-US"/>
-        </w:rPr>
-      </w:pPr>
-    </w:p>
-    <w:p>
-      <w:pPr>
-        <w:pStyle w:val="Prrafodelista"/>
-        <w:ind w:left="720" w:firstLine="0"/>
-        <w:rPr>
-          <w:rFonts w:ascii="Cambria" w:hAnsi="Cambria"/>
-          <w:lang w:val="en-US"/>
-        </w:rPr>
-      </w:pPr>
-    </w:p>
-    <w:p>
-      <w:pPr>
-        <w:rPr>
-          <w:rFonts w:ascii="Cambria" w:hAnsi="Cambria"/>
-          <w:lang w:val="en-US"/>
-        </w:rPr>
-      </w:pPr>
-    </w:p>
-    <w:p>
-      <w:pPr>
-        <w:pStyle w:val="Prrafodelista"/>
-        <w:ind w:left="720" w:firstLine="0"/>
-        <w:rPr>
-          <w:rFonts w:ascii="Cambria" w:hAnsi="Cambria"/>
-          <w:lang w:val="en-US"/>
-        </w:rPr>
-      </w:pPr>
-    </w:p>
-    <w:p>
-      <w:pPr>
         <w:rPr>
           <w:rFonts w:ascii="Cambria" w:hAnsi="Cambria"/>
           <w:lang w:val="en-US"/>
@@ -3732,7 +3914,6 @@
           <w:rFonts w:ascii="Cambria" w:hAnsi="Cambria"/>
           <w:lang w:val="es-EC"/>
         </w:rPr>
-        <w:lastRenderedPageBreak/>
         <w:t>Prologue (</w:t>
       </w:r>
       <w:hyperlink r:id="rId13" w:history="1">
@@ -3767,16 +3948,16 @@
           <w:lang w:val="es-EC"/>
         </w:rPr>
         <w:drawing>
-          <wp:anchor distT="0" distB="0" distL="114300" distR="114300" simplePos="0" relativeHeight="251665920" behindDoc="1" locked="0" layoutInCell="1" allowOverlap="1" wp14:anchorId="755227C9" wp14:editId="12289BD9">
+          <wp:anchor distT="0" distB="0" distL="114300" distR="114300" simplePos="0" relativeHeight="251665920" behindDoc="1" locked="0" layoutInCell="1" allowOverlap="1" wp14:anchorId="755227C9" wp14:editId="3488B600">
             <wp:simplePos x="0" y="0"/>
-            <wp:positionH relativeFrom="column">
-              <wp:posOffset>-3810</wp:posOffset>
+            <wp:positionH relativeFrom="margin">
+              <wp:posOffset>-58576</wp:posOffset>
             </wp:positionH>
             <wp:positionV relativeFrom="page">
-              <wp:posOffset>2005330</wp:posOffset>
+              <wp:align>center</wp:align>
             </wp:positionV>
             <wp:extent cx="5400040" cy="2466975"/>
-            <wp:effectExtent l="0" t="0" r="0" b="0"/>
+            <wp:effectExtent l="0" t="0" r="0" b="9525"/>
             <wp:wrapNone/>
             <wp:docPr id="3" name="Imagen 3"/>
             <wp:cNvGraphicFramePr>
@@ -3888,7 +4069,7 @@
           <w:lang w:val="es-EC"/>
         </w:rPr>
       </w:pPr>
-      <w:bookmarkStart w:id="6" w:name="_Toc243075241"/>
+      <w:bookmarkStart w:id="6" w:name="_Toc243674500"/>
       <w:r>
         <w:rPr>
           <w:lang w:val="es-EC"/>
@@ -4287,6 +4468,7 @@
                 <w:rFonts w:ascii="Cambria" w:hAnsi="Cambria"/>
                 <w:lang w:val="es-EC"/>
               </w:rPr>
+              <w:lastRenderedPageBreak/>
               <w:t>Adaptabilidad</w:t>
             </w:r>
           </w:p>
@@ -4459,7 +4641,6 @@
                 <w:rFonts w:ascii="Cambria" w:hAnsi="Cambria"/>
                 <w:lang w:val="es-EC"/>
               </w:rPr>
-              <w:lastRenderedPageBreak/>
               <w:t>Adecuación al evento</w:t>
             </w:r>
           </w:p>
@@ -4559,7 +4740,7 @@
           <w:lang w:val="es-EC"/>
         </w:rPr>
       </w:pPr>
-      <w:bookmarkStart w:id="7" w:name="_Toc243075242"/>
+      <w:bookmarkStart w:id="7" w:name="_Toc243674501"/>
       <w:r>
         <w:rPr>
           <w:lang w:val="es-EC"/>
@@ -4635,7 +4816,7 @@
           <w:lang w:val="es-EC"/>
         </w:rPr>
       </w:pPr>
-      <w:bookmarkStart w:id="8" w:name="_Toc243075243"/>
+      <w:bookmarkStart w:id="8" w:name="_Toc243674502"/>
       <w:r>
         <w:rPr>
           <w:lang w:val="es-EC"/>
@@ -4643,6 +4824,854 @@
         <w:t>Plan de trabajo</w:t>
       </w:r>
       <w:bookmarkEnd w:id="8"/>
+    </w:p>
+    <w:tbl>
+      <w:tblPr>
+        <w:tblStyle w:val="Tablaconcuadrcula"/>
+        <w:tblW w:w="0" w:type="auto"/>
+        <w:tblLook w:val="04A0" w:firstRow="1" w:lastRow="0" w:firstColumn="1" w:lastColumn="0" w:noHBand="0" w:noVBand="1"/>
+      </w:tblPr>
+      <w:tblGrid>
+        <w:gridCol w:w="4245"/>
+        <w:gridCol w:w="4249"/>
+      </w:tblGrid>
+      <w:tr>
+        <w:tc>
+          <w:tcPr>
+            <w:tcW w:w="4245" w:type="dxa"/>
+          </w:tcPr>
+          <w:p>
+            <w:pPr>
+              <w:jc w:val="center"/>
+              <w:rPr>
+                <w:rFonts w:asciiTheme="majorHAnsi" w:hAnsiTheme="majorHAnsi"/>
+                <w:b/>
+                <w:bCs/>
+                <w:lang w:val="es-EC"/>
+              </w:rPr>
+            </w:pPr>
+            <w:r>
+              <w:rPr>
+                <w:rFonts w:asciiTheme="majorHAnsi" w:hAnsiTheme="majorHAnsi"/>
+                <w:b/>
+                <w:bCs/>
+                <w:lang w:val="es-EC"/>
+              </w:rPr>
+              <w:t>Actividad</w:t>
+            </w:r>
+          </w:p>
+        </w:tc>
+        <w:tc>
+          <w:tcPr>
+            <w:tcW w:w="4249" w:type="dxa"/>
+          </w:tcPr>
+          <w:p>
+            <w:pPr>
+              <w:jc w:val="center"/>
+              <w:rPr>
+                <w:rFonts w:asciiTheme="majorHAnsi" w:hAnsiTheme="majorHAnsi"/>
+                <w:b/>
+                <w:bCs/>
+                <w:lang w:val="es-EC"/>
+              </w:rPr>
+            </w:pPr>
+            <w:r>
+              <w:rPr>
+                <w:rFonts w:asciiTheme="majorHAnsi" w:hAnsiTheme="majorHAnsi"/>
+                <w:b/>
+                <w:bCs/>
+                <w:lang w:val="es-EC"/>
+              </w:rPr>
+              <w:t>Resultado esperado</w:t>
+            </w:r>
+          </w:p>
+        </w:tc>
+      </w:tr>
+      <w:tr>
+        <w:tc>
+          <w:tcPr>
+            <w:tcW w:w="4245" w:type="dxa"/>
+          </w:tcPr>
+          <w:p>
+            <w:pPr>
+              <w:jc w:val="center"/>
+              <w:rPr>
+                <w:rFonts w:ascii="Cambria" w:hAnsi="Cambria"/>
+                <w:lang w:val="es-EC"/>
+              </w:rPr>
+            </w:pPr>
+            <w:r>
+              <w:rPr>
+                <w:rFonts w:ascii="Cambria" w:hAnsi="Cambria"/>
+                <w:lang w:val="es-EC"/>
+              </w:rPr>
+              <w:t>Revisar la información del evento.</w:t>
+            </w:r>
+          </w:p>
+        </w:tc>
+        <w:tc>
+          <w:tcPr>
+            <w:tcW w:w="4249" w:type="dxa"/>
+          </w:tcPr>
+          <w:p>
+            <w:pPr>
+              <w:jc w:val="center"/>
+              <w:rPr>
+                <w:rFonts w:ascii="Cambria" w:hAnsi="Cambria"/>
+                <w:lang w:val="es-EC"/>
+              </w:rPr>
+            </w:pPr>
+            <w:r>
+              <w:rPr>
+                <w:rFonts w:ascii="Cambria" w:hAnsi="Cambria"/>
+                <w:lang w:val="es-EC"/>
+              </w:rPr>
+              <w:t>Datos disponibles y pendientes identificados.</w:t>
+            </w:r>
+          </w:p>
+        </w:tc>
+      </w:tr>
+      <w:tr>
+        <w:tc>
+          <w:tcPr>
+            <w:tcW w:w="4245" w:type="dxa"/>
+          </w:tcPr>
+          <w:p>
+            <w:pPr>
+              <w:jc w:val="center"/>
+              <w:rPr>
+                <w:rFonts w:ascii="Cambria" w:hAnsi="Cambria"/>
+                <w:lang w:val="es-EC"/>
+              </w:rPr>
+            </w:pPr>
+            <w:r>
+              <w:rPr>
+                <w:rFonts w:ascii="Cambria" w:hAnsi="Cambria"/>
+                <w:lang w:val="es-EC"/>
+              </w:rPr>
+              <w:t>Organizar el contenido.</w:t>
+            </w:r>
+          </w:p>
+        </w:tc>
+        <w:tc>
+          <w:tcPr>
+            <w:tcW w:w="4249" w:type="dxa"/>
+          </w:tcPr>
+          <w:p>
+            <w:pPr>
+              <w:jc w:val="center"/>
+              <w:rPr>
+                <w:rFonts w:ascii="Cambria" w:hAnsi="Cambria"/>
+                <w:lang w:val="es-EC"/>
+              </w:rPr>
+            </w:pPr>
+            <w:r>
+              <w:rPr>
+                <w:rFonts w:ascii="Cambria" w:hAnsi="Cambria"/>
+                <w:lang w:val="es-EC"/>
+              </w:rPr>
+              <w:t>Secciones definidas para la landing page.</w:t>
+            </w:r>
+          </w:p>
+        </w:tc>
+      </w:tr>
+      <w:tr>
+        <w:tc>
+          <w:tcPr>
+            <w:tcW w:w="4245" w:type="dxa"/>
+          </w:tcPr>
+          <w:p>
+            <w:pPr>
+              <w:jc w:val="center"/>
+              <w:rPr>
+                <w:rFonts w:ascii="Cambria" w:hAnsi="Cambria"/>
+                <w:lang w:val="es-EC"/>
+              </w:rPr>
+            </w:pPr>
+            <w:r>
+              <w:rPr>
+                <w:rFonts w:ascii="Cambria" w:hAnsi="Cambria"/>
+                <w:lang w:val="es-EC"/>
+              </w:rPr>
+              <w:t>Comparar las plantillas.</w:t>
+            </w:r>
+          </w:p>
+        </w:tc>
+        <w:tc>
+          <w:tcPr>
+            <w:tcW w:w="4249" w:type="dxa"/>
+          </w:tcPr>
+          <w:p>
+            <w:pPr>
+              <w:jc w:val="center"/>
+              <w:rPr>
+                <w:rFonts w:ascii="Cambria" w:hAnsi="Cambria"/>
+                <w:lang w:val="es-EC"/>
+              </w:rPr>
+            </w:pPr>
+            <w:r>
+              <w:rPr>
+                <w:rFonts w:ascii="Cambria" w:hAnsi="Cambria"/>
+                <w:lang w:val="es-EC"/>
+              </w:rPr>
+              <w:t>Análisis de tres alternativas.</w:t>
+            </w:r>
+          </w:p>
+        </w:tc>
+      </w:tr>
+      <w:tr>
+        <w:tc>
+          <w:tcPr>
+            <w:tcW w:w="4245" w:type="dxa"/>
+          </w:tcPr>
+          <w:p>
+            <w:pPr>
+              <w:jc w:val="center"/>
+              <w:rPr>
+                <w:rFonts w:ascii="Cambria" w:hAnsi="Cambria"/>
+                <w:lang w:val="es-EC"/>
+              </w:rPr>
+            </w:pPr>
+            <w:r>
+              <w:rPr>
+                <w:rFonts w:ascii="Cambria" w:hAnsi="Cambria"/>
+                <w:lang w:val="es-EC"/>
+              </w:rPr>
+              <w:lastRenderedPageBreak/>
+              <w:t>Seleccionar ZeroFour.</w:t>
+            </w:r>
+          </w:p>
+        </w:tc>
+        <w:tc>
+          <w:tcPr>
+            <w:tcW w:w="4249" w:type="dxa"/>
+          </w:tcPr>
+          <w:p>
+            <w:pPr>
+              <w:jc w:val="center"/>
+              <w:rPr>
+                <w:rFonts w:ascii="Cambria" w:hAnsi="Cambria"/>
+                <w:lang w:val="es-EC"/>
+              </w:rPr>
+            </w:pPr>
+            <w:r>
+              <w:rPr>
+                <w:rFonts w:ascii="Cambria" w:hAnsi="Cambria"/>
+                <w:lang w:val="es-EC"/>
+              </w:rPr>
+              <w:t>Decisión documentada y justificada.</w:t>
+            </w:r>
+          </w:p>
+        </w:tc>
+      </w:tr>
+      <w:tr>
+        <w:tc>
+          <w:tcPr>
+            <w:tcW w:w="4245" w:type="dxa"/>
+          </w:tcPr>
+          <w:p>
+            <w:pPr>
+              <w:jc w:val="center"/>
+              <w:rPr>
+                <w:rFonts w:ascii="Cambria" w:hAnsi="Cambria"/>
+                <w:lang w:val="es-EC"/>
+              </w:rPr>
+            </w:pPr>
+            <w:r>
+              <w:rPr>
+                <w:rFonts w:ascii="Cambria" w:hAnsi="Cambria"/>
+                <w:lang w:val="es-EC"/>
+              </w:rPr>
+              <w:t>Adaptar HTML y CSS.</w:t>
+            </w:r>
+          </w:p>
+        </w:tc>
+        <w:tc>
+          <w:tcPr>
+            <w:tcW w:w="4249" w:type="dxa"/>
+          </w:tcPr>
+          <w:p>
+            <w:pPr>
+              <w:jc w:val="center"/>
+              <w:rPr>
+                <w:rFonts w:ascii="Cambria" w:hAnsi="Cambria"/>
+                <w:lang w:val="es-EC"/>
+              </w:rPr>
+            </w:pPr>
+            <w:r>
+              <w:rPr>
+                <w:rFonts w:ascii="Cambria" w:hAnsi="Cambria"/>
+                <w:lang w:val="es-EC"/>
+              </w:rPr>
+              <w:t>Primera versión de la página.</w:t>
+            </w:r>
+          </w:p>
+        </w:tc>
+      </w:tr>
+      <w:tr>
+        <w:tc>
+          <w:tcPr>
+            <w:tcW w:w="4245" w:type="dxa"/>
+          </w:tcPr>
+          <w:p>
+            <w:pPr>
+              <w:jc w:val="center"/>
+              <w:rPr>
+                <w:rFonts w:ascii="Cambria" w:hAnsi="Cambria"/>
+                <w:lang w:val="es-EC"/>
+              </w:rPr>
+            </w:pPr>
+            <w:r>
+              <w:rPr>
+                <w:rFonts w:ascii="Cambria" w:hAnsi="Cambria"/>
+                <w:lang w:val="es-EC"/>
+              </w:rPr>
+              <w:t>Verificar navegación y adaptabilidad.</w:t>
+            </w:r>
+          </w:p>
+        </w:tc>
+        <w:tc>
+          <w:tcPr>
+            <w:tcW w:w="4249" w:type="dxa"/>
+          </w:tcPr>
+          <w:p>
+            <w:pPr>
+              <w:jc w:val="center"/>
+              <w:rPr>
+                <w:rFonts w:ascii="Cambria" w:hAnsi="Cambria"/>
+                <w:lang w:val="es-EC"/>
+              </w:rPr>
+            </w:pPr>
+            <w:r>
+              <w:rPr>
+                <w:rFonts w:ascii="Cambria" w:hAnsi="Cambria"/>
+                <w:lang w:val="es-EC"/>
+              </w:rPr>
+              <w:t>Página revisada en distintos tamaños de pantalla.</w:t>
+            </w:r>
+          </w:p>
+        </w:tc>
+      </w:tr>
+      <w:tr>
+        <w:tc>
+          <w:tcPr>
+            <w:tcW w:w="4245" w:type="dxa"/>
+          </w:tcPr>
+          <w:p>
+            <w:pPr>
+              <w:jc w:val="center"/>
+              <w:rPr>
+                <w:rFonts w:ascii="Cambria" w:hAnsi="Cambria"/>
+                <w:lang w:val="es-EC"/>
+              </w:rPr>
+            </w:pPr>
+            <w:r>
+              <w:rPr>
+                <w:rFonts w:ascii="Cambria" w:hAnsi="Cambria"/>
+                <w:lang w:val="es-EC"/>
+              </w:rPr>
+              <w:t>Publicar el repositorio.</w:t>
+            </w:r>
+          </w:p>
+        </w:tc>
+        <w:tc>
+          <w:tcPr>
+            <w:tcW w:w="4249" w:type="dxa"/>
+          </w:tcPr>
+          <w:p>
+            <w:pPr>
+              <w:jc w:val="center"/>
+              <w:rPr>
+                <w:rFonts w:ascii="Cambria" w:hAnsi="Cambria"/>
+                <w:lang w:val="es-EC"/>
+              </w:rPr>
+            </w:pPr>
+            <w:r>
+              <w:rPr>
+                <w:rFonts w:ascii="Cambria" w:hAnsi="Cambria"/>
+                <w:lang w:val="es-EC"/>
+              </w:rPr>
+              <w:t>Código fuente y documentación disponibles en GitHub.</w:t>
+            </w:r>
+          </w:p>
+        </w:tc>
+      </w:tr>
+    </w:tbl>
+    <w:p>
+      <w:pPr>
+        <w:rPr>
+          <w:rFonts w:ascii="Cambria" w:hAnsi="Cambria"/>
+          <w:lang w:val="es-EC"/>
+        </w:rPr>
+      </w:pPr>
+    </w:p>
+    <w:p>
+      <w:pPr>
+        <w:spacing w:after="0" w:line="240" w:lineRule="auto"/>
+        <w:rPr>
+          <w:rFonts w:ascii="Cambria" w:hAnsi="Cambria"/>
+          <w:lang w:val="es-EC"/>
+        </w:rPr>
+      </w:pPr>
+      <w:r>
+        <w:rPr>
+          <w:rFonts w:ascii="Cambria" w:hAnsi="Cambria"/>
+          <w:lang w:val="es-EC"/>
+        </w:rPr>
+        <w:t>Las actividades planificadas se desarrollaron mediante la adaptación progresiva de la plantilla ZeroFour, la incorporación de información del evento y la personalización de componentes HTML, CSS y JavaScript. El proyecto se gestionó con control de versiones Git y se publicó mediante GitHub Pages.</w:t>
+      </w:r>
+    </w:p>
+    <w:p>
+      <w:pPr>
+        <w:pStyle w:val="Ttulo1"/>
+        <w:rPr>
+          <w:lang w:val="es-EC"/>
+        </w:rPr>
+      </w:pPr>
+      <w:bookmarkStart w:id="9" w:name="_Toc243674503"/>
+      <w:r>
+        <w:rPr>
+          <w:lang w:val="es-EC"/>
+        </w:rPr>
+        <w:t>Diseño</w:t>
+      </w:r>
+      <w:bookmarkEnd w:id="9"/>
+    </w:p>
+    <w:p>
+      <w:pPr>
+        <w:pStyle w:val="Ttulo2"/>
+        <w:rPr>
+          <w:lang w:val="es-EC"/>
+        </w:rPr>
+      </w:pPr>
+      <w:bookmarkStart w:id="10" w:name="_Toc243674504"/>
+      <w:r>
+        <w:rPr>
+          <w:lang w:val="es-EC"/>
+        </w:rPr>
+        <w:t>Estructura de la landing page</w:t>
+      </w:r>
+      <w:bookmarkEnd w:id="10"/>
+    </w:p>
+    <w:p>
+      <w:pPr>
+        <w:rPr>
+          <w:rFonts w:ascii="Cambria" w:hAnsi="Cambria"/>
+          <w:lang w:val="es-EC"/>
+        </w:rPr>
+      </w:pPr>
+      <w:r>
+        <w:rPr>
+          <w:rFonts w:ascii="Cambria" w:hAnsi="Cambria"/>
+          <w:lang w:val="es-EC"/>
+        </w:rPr>
+        <w:t>La landing page implementada se organiza en las siguientes secciones:</w:t>
+      </w:r>
+    </w:p>
+    <w:p>
+      <w:pPr>
+        <w:rPr>
+          <w:rFonts w:ascii="Cambria" w:hAnsi="Cambria"/>
+          <w:lang w:val="es-EC"/>
+        </w:rPr>
+      </w:pPr>
+      <w:r>
+        <w:rPr>
+          <w:rFonts w:ascii="Cambria" w:hAnsi="Cambria"/>
+          <w:b/>
+          <w:bCs/>
+          <w:lang w:val="es-EC"/>
+        </w:rPr>
+        <w:t>1. Inicio:</w:t>
+      </w:r>
+      <w:r>
+        <w:rPr>
+          <w:rFonts w:ascii="Cambria" w:hAnsi="Cambria"/>
+          <w:lang w:val="es-EC"/>
+        </w:rPr>
+        <w:t xml:space="preserve"> nombre del evento, descripción e imagen principal.</w:t>
+      </w:r>
+    </w:p>
+    <w:p>
+      <w:pPr>
+        <w:rPr>
+          <w:rFonts w:ascii="Cambria" w:hAnsi="Cambria"/>
+          <w:lang w:val="es-EC"/>
+        </w:rPr>
+      </w:pPr>
+      <w:r>
+        <w:rPr>
+          <w:rFonts w:ascii="Cambria" w:hAnsi="Cambria"/>
+          <w:b/>
+          <w:bCs/>
+          <w:lang w:val="es-EC"/>
+        </w:rPr>
+        <w:t>2. Sobre el evento:</w:t>
+      </w:r>
+      <w:r>
+        <w:rPr>
+          <w:rFonts w:ascii="Cambria" w:hAnsi="Cambria"/>
+          <w:lang w:val="es-EC"/>
+        </w:rPr>
+        <w:t xml:space="preserve"> propósito y descripción de Arte en el Cerro.</w:t>
+      </w:r>
+    </w:p>
+    <w:p>
+      <w:pPr>
+        <w:rPr>
+          <w:rFonts w:ascii="Cambria" w:hAnsi="Cambria"/>
+          <w:lang w:val="es-EC"/>
+        </w:rPr>
+      </w:pPr>
+      <w:r>
+        <w:rPr>
+          <w:rFonts w:ascii="Cambria" w:hAnsi="Cambria"/>
+          <w:b/>
+          <w:bCs/>
+          <w:lang w:val="es-EC"/>
+        </w:rPr>
+        <w:t>3. Programación artística:</w:t>
+      </w:r>
+      <w:r>
+        <w:rPr>
+          <w:rFonts w:ascii="Cambria" w:hAnsi="Cambria"/>
+          <w:lang w:val="es-EC"/>
+        </w:rPr>
+        <w:t xml:space="preserve"> agrupaciones y presentaciones confirmadas.</w:t>
+      </w:r>
+    </w:p>
+    <w:p>
+      <w:pPr>
+        <w:rPr>
+          <w:rFonts w:ascii="Cambria" w:hAnsi="Cambria"/>
+          <w:lang w:val="es-EC"/>
+        </w:rPr>
+      </w:pPr>
+      <w:r>
+        <w:rPr>
+          <w:rFonts w:ascii="Cambria" w:hAnsi="Cambria"/>
+          <w:b/>
+          <w:bCs/>
+          <w:lang w:val="es-EC"/>
+        </w:rPr>
+        <w:t>4. Galería:</w:t>
+      </w:r>
+      <w:r>
+        <w:rPr>
+          <w:rFonts w:ascii="Cambria" w:hAnsi="Cambria"/>
+          <w:lang w:val="es-EC"/>
+        </w:rPr>
+        <w:t xml:space="preserve"> </w:t>
+      </w:r>
+      <w:r>
+        <w:rPr>
+          <w:rFonts w:ascii="Cambria" w:hAnsi="Cambria"/>
+          <w:lang w:val="es-EC"/>
+        </w:rPr>
+        <w:t>sección multimedia que incorpora grabaciones audiovisuales de las tres participaciones del 2 de octubre, un archivo fotográfico interactivo de julio, agosto y septiembre, y contenido promocional publicado por ESPOL Cultural en Instagram.</w:t>
+      </w:r>
+    </w:p>
+    <w:p>
+      <w:pPr>
+        <w:rPr>
+          <w:rFonts w:ascii="Cambria" w:hAnsi="Cambria"/>
+          <w:lang w:val="es-EC"/>
+        </w:rPr>
+      </w:pPr>
+      <w:r>
+        <w:rPr>
+          <w:rFonts w:ascii="Cambria" w:hAnsi="Cambria"/>
+          <w:b/>
+          <w:bCs/>
+          <w:lang w:val="es-EC"/>
+        </w:rPr>
+        <w:t>5. Información y ubicación:</w:t>
+      </w:r>
+      <w:r>
+        <w:rPr>
+          <w:rFonts w:ascii="Cambria" w:hAnsi="Cambria"/>
+          <w:lang w:val="es-EC"/>
+        </w:rPr>
+        <w:t xml:space="preserve"> datos prácticos para conocer el lugar y las condiciones de la actividad.</w:t>
+      </w:r>
+    </w:p>
+    <w:p>
+      <w:pPr>
+        <w:rPr>
+          <w:rFonts w:ascii="Cambria" w:hAnsi="Cambria"/>
+          <w:lang w:val="es-EC"/>
+        </w:rPr>
+      </w:pPr>
+      <w:r>
+        <w:rPr>
+          <w:rFonts w:ascii="Cambria" w:hAnsi="Cambria"/>
+          <w:b/>
+          <w:bCs/>
+          <w:lang w:val="es-EC"/>
+        </w:rPr>
+        <w:t>6. Contacto y redes sociales:</w:t>
+      </w:r>
+      <w:r>
+        <w:rPr>
+          <w:rFonts w:ascii="Cambria" w:hAnsi="Cambria"/>
+          <w:lang w:val="es-EC"/>
+        </w:rPr>
+        <w:t xml:space="preserve"> </w:t>
+      </w:r>
+      <w:r>
+        <w:rPr>
+          <w:rFonts w:ascii="Cambria" w:hAnsi="Cambria"/>
+          <w:lang w:val="es-EC"/>
+        </w:rPr>
+        <w:t>enlaces a canales institucionales y formulario de contacto demostrativo, sin procesamiento ni almacenamiento de mensajes.</w:t>
+      </w:r>
+    </w:p>
+    <w:p>
+      <w:pPr>
+        <w:rPr>
+          <w:rFonts w:ascii="Cambria" w:hAnsi="Cambria"/>
+          <w:lang w:val="es-EC"/>
+        </w:rPr>
+      </w:pPr>
+      <w:r>
+        <w:rPr>
+          <w:rFonts w:ascii="Cambria" w:hAnsi="Cambria"/>
+          <w:b/>
+          <w:bCs/>
+          <w:lang w:val="es-EC"/>
+        </w:rPr>
+        <w:t>7. Pie de página:</w:t>
+      </w:r>
+      <w:r>
+        <w:rPr>
+          <w:rFonts w:ascii="Cambria" w:hAnsi="Cambria"/>
+          <w:lang w:val="es-EC"/>
+        </w:rPr>
+        <w:t xml:space="preserve"> créditos y atribución de la plantilla.</w:t>
+      </w:r>
+    </w:p>
+    <w:p>
+      <w:pPr>
+        <w:pStyle w:val="Ttulo2"/>
+        <w:rPr>
+          <w:lang w:val="es-EC"/>
+        </w:rPr>
+      </w:pPr>
+      <w:bookmarkStart w:id="11" w:name="_Toc243674505"/>
+      <w:r>
+        <w:rPr>
+          <w:lang w:val="es-EC"/>
+        </w:rPr>
+        <w:t>Criterios de diseño</w:t>
+      </w:r>
+      <w:bookmarkEnd w:id="11"/>
+    </w:p>
+    <w:p>
+      <w:pPr>
+        <w:pStyle w:val="Prrafodelista"/>
+        <w:numPr>
+          <w:ilvl w:val="0"/>
+          <w:numId w:val="10"/>
+        </w:numPr>
+        <w:rPr>
+          <w:rFonts w:ascii="Cambria" w:hAnsi="Cambria"/>
+          <w:lang w:val="es-EC"/>
+        </w:rPr>
+      </w:pPr>
+      <w:r>
+        <w:rPr>
+          <w:rFonts w:ascii="Cambria" w:hAnsi="Cambria"/>
+          <w:b/>
+          <w:bCs/>
+          <w:lang w:val="es-EC"/>
+        </w:rPr>
+        <w:t>Jerarquía visual:</w:t>
+      </w:r>
+      <w:r>
+        <w:rPr>
+          <w:rFonts w:ascii="Cambria" w:hAnsi="Cambria"/>
+          <w:lang w:val="es-EC"/>
+        </w:rPr>
+        <w:t xml:space="preserve"> destacar el nombre del evento y la información principal.</w:t>
+      </w:r>
+    </w:p>
+    <w:p>
+      <w:pPr>
+        <w:pStyle w:val="Prrafodelista"/>
+        <w:numPr>
+          <w:ilvl w:val="0"/>
+          <w:numId w:val="10"/>
+        </w:numPr>
+        <w:rPr>
+          <w:rFonts w:ascii="Cambria" w:hAnsi="Cambria"/>
+          <w:lang w:val="es-EC"/>
+        </w:rPr>
+      </w:pPr>
+      <w:r>
+        <w:rPr>
+          <w:rFonts w:ascii="Cambria" w:hAnsi="Cambria"/>
+          <w:b/>
+          <w:bCs/>
+          <w:lang w:val="es-EC"/>
+        </w:rPr>
+        <w:t>Consistencia:</w:t>
+      </w:r>
+      <w:r>
+        <w:rPr>
+          <w:rFonts w:ascii="Cambria" w:hAnsi="Cambria"/>
+          <w:lang w:val="es-EC"/>
+        </w:rPr>
+        <w:t xml:space="preserve"> mantener uniformidad en tipografías, colores, espacios y componentes.</w:t>
+      </w:r>
+    </w:p>
+    <w:p>
+      <w:pPr>
+        <w:pStyle w:val="Prrafodelista"/>
+        <w:numPr>
+          <w:ilvl w:val="0"/>
+          <w:numId w:val="10"/>
+        </w:numPr>
+        <w:rPr>
+          <w:rFonts w:ascii="Cambria" w:hAnsi="Cambria"/>
+          <w:lang w:val="es-EC"/>
+        </w:rPr>
+      </w:pPr>
+      <w:r>
+        <w:rPr>
+          <w:rFonts w:ascii="Cambria" w:hAnsi="Cambria"/>
+          <w:b/>
+          <w:bCs/>
+          <w:lang w:val="es-EC"/>
+        </w:rPr>
+        <w:t>Legibilidad:</w:t>
+      </w:r>
+      <w:r>
+        <w:rPr>
+          <w:rFonts w:ascii="Cambria" w:hAnsi="Cambria"/>
+          <w:lang w:val="es-EC"/>
+        </w:rPr>
+        <w:t xml:space="preserve"> utilizar textos claros y contrastes adecuados.</w:t>
+      </w:r>
+    </w:p>
+    <w:p>
+      <w:pPr>
+        <w:pStyle w:val="Prrafodelista"/>
+        <w:numPr>
+          <w:ilvl w:val="0"/>
+          <w:numId w:val="10"/>
+        </w:numPr>
+        <w:rPr>
+          <w:rFonts w:ascii="Cambria" w:hAnsi="Cambria"/>
+          <w:lang w:val="es-EC"/>
+        </w:rPr>
+      </w:pPr>
+      <w:r>
+        <w:rPr>
+          <w:rFonts w:ascii="Cambria" w:hAnsi="Cambria"/>
+          <w:b/>
+          <w:bCs/>
+          <w:lang w:val="es-EC"/>
+        </w:rPr>
+        <w:t>Adaptabilidad:</w:t>
+      </w:r>
+      <w:r>
+        <w:rPr>
+          <w:rFonts w:ascii="Cambria" w:hAnsi="Cambria"/>
+          <w:lang w:val="es-EC"/>
+        </w:rPr>
+        <w:t xml:space="preserve"> comprobar la presentación en computadoras, tabletas y teléfonos móviles.</w:t>
+      </w:r>
+    </w:p>
+    <w:p>
+      <w:pPr>
+        <w:pStyle w:val="Prrafodelista"/>
+        <w:numPr>
+          <w:ilvl w:val="0"/>
+          <w:numId w:val="10"/>
+        </w:numPr>
+        <w:rPr>
+          <w:rFonts w:ascii="Cambria" w:hAnsi="Cambria"/>
+          <w:lang w:val="es-EC"/>
+        </w:rPr>
+      </w:pPr>
+      <w:r>
+        <w:rPr>
+          <w:rFonts w:ascii="Cambria" w:hAnsi="Cambria"/>
+          <w:b/>
+          <w:bCs/>
+          <w:lang w:val="es-EC"/>
+        </w:rPr>
+        <w:t>Coherencia temática:</w:t>
+      </w:r>
+      <w:r>
+        <w:rPr>
+          <w:rFonts w:ascii="Cambria" w:hAnsi="Cambria"/>
+          <w:lang w:val="es-EC"/>
+        </w:rPr>
+        <w:t xml:space="preserve"> utilizar recursos visuales relacionados con las actividades culturales.</w:t>
+      </w:r>
+    </w:p>
+    <w:p>
+      <w:pPr>
+        <w:pStyle w:val="Prrafodelista"/>
+        <w:numPr>
+          <w:ilvl w:val="0"/>
+          <w:numId w:val="10"/>
+        </w:numPr>
+        <w:rPr>
+          <w:rFonts w:ascii="Cambria" w:hAnsi="Cambria"/>
+          <w:lang w:val="es-EC"/>
+        </w:rPr>
+      </w:pPr>
+      <w:r>
+        <w:rPr>
+          <w:rFonts w:ascii="Cambria" w:hAnsi="Cambria"/>
+          <w:b/>
+          <w:bCs/>
+          <w:lang w:val="es-EC"/>
+        </w:rPr>
+        <w:t>Navegación clara:</w:t>
+      </w:r>
+      <w:r>
+        <w:rPr>
+          <w:rFonts w:ascii="Cambria" w:hAnsi="Cambria"/>
+          <w:lang w:val="es-EC"/>
+        </w:rPr>
+        <w:t xml:space="preserve"> emplear etiquetas descriptivas para cada sección.</w:t>
+      </w:r>
+    </w:p>
+    <w:p>
+      <w:pPr>
+        <w:pStyle w:val="Ttulo1"/>
+        <w:rPr>
+          <w:lang w:val="es-EC"/>
+        </w:rPr>
+      </w:pPr>
+      <w:bookmarkStart w:id="12" w:name="_Toc243674506"/>
+      <w:r>
+        <w:rPr>
+          <w:lang w:val="es-EC"/>
+        </w:rPr>
+        <w:lastRenderedPageBreak/>
+        <w:t>Implementación</w:t>
+      </w:r>
+      <w:bookmarkEnd w:id="12"/>
+    </w:p>
+    <w:p>
+      <w:pPr>
+        <w:pStyle w:val="Ttulo2"/>
+        <w:rPr>
+          <w:lang w:val="es-EC"/>
+        </w:rPr>
+      </w:pPr>
+      <w:bookmarkStart w:id="13" w:name="_Toc243674507"/>
+      <w:r>
+        <w:rPr>
+          <w:lang w:val="es-EC"/>
+        </w:rPr>
+        <w:t>Tecnologías utilizadas</w:t>
+      </w:r>
+      <w:bookmarkEnd w:id="13"/>
     </w:p>
     <w:tbl>
       <w:tblPr>
@@ -4676,830 +5705,6 @@
                 <w:bCs/>
                 <w:lang w:val="es-EC"/>
               </w:rPr>
-              <w:t>Actividad</w:t>
-            </w:r>
-          </w:p>
-        </w:tc>
-        <w:tc>
-          <w:tcPr>
-            <w:tcW w:w="4322" w:type="dxa"/>
-          </w:tcPr>
-          <w:p>
-            <w:pPr>
-              <w:jc w:val="center"/>
-              <w:rPr>
-                <w:rFonts w:asciiTheme="majorHAnsi" w:hAnsiTheme="majorHAnsi"/>
-                <w:b/>
-                <w:bCs/>
-                <w:lang w:val="es-EC"/>
-              </w:rPr>
-            </w:pPr>
-            <w:r>
-              <w:rPr>
-                <w:rFonts w:asciiTheme="majorHAnsi" w:hAnsiTheme="majorHAnsi"/>
-                <w:b/>
-                <w:bCs/>
-                <w:lang w:val="es-EC"/>
-              </w:rPr>
-              <w:t>Resultado esperado</w:t>
-            </w:r>
-          </w:p>
-        </w:tc>
-      </w:tr>
-      <w:tr>
-        <w:tc>
-          <w:tcPr>
-            <w:tcW w:w="4322" w:type="dxa"/>
-          </w:tcPr>
-          <w:p>
-            <w:pPr>
-              <w:jc w:val="center"/>
-              <w:rPr>
-                <w:rFonts w:ascii="Cambria" w:hAnsi="Cambria"/>
-                <w:lang w:val="es-EC"/>
-              </w:rPr>
-            </w:pPr>
-            <w:r>
-              <w:rPr>
-                <w:rFonts w:ascii="Cambria" w:hAnsi="Cambria"/>
-                <w:lang w:val="es-EC"/>
-              </w:rPr>
-              <w:t>Revisar la información del evento.</w:t>
-            </w:r>
-          </w:p>
-        </w:tc>
-        <w:tc>
-          <w:tcPr>
-            <w:tcW w:w="4322" w:type="dxa"/>
-          </w:tcPr>
-          <w:p>
-            <w:pPr>
-              <w:jc w:val="center"/>
-              <w:rPr>
-                <w:rFonts w:ascii="Cambria" w:hAnsi="Cambria"/>
-                <w:lang w:val="es-EC"/>
-              </w:rPr>
-            </w:pPr>
-            <w:r>
-              <w:rPr>
-                <w:rFonts w:ascii="Cambria" w:hAnsi="Cambria"/>
-                <w:lang w:val="es-EC"/>
-              </w:rPr>
-              <w:t>Datos disponibles y pendientes identificados.</w:t>
-            </w:r>
-          </w:p>
-        </w:tc>
-      </w:tr>
-      <w:tr>
-        <w:tc>
-          <w:tcPr>
-            <w:tcW w:w="4322" w:type="dxa"/>
-          </w:tcPr>
-          <w:p>
-            <w:pPr>
-              <w:jc w:val="center"/>
-              <w:rPr>
-                <w:rFonts w:ascii="Cambria" w:hAnsi="Cambria"/>
-                <w:lang w:val="es-EC"/>
-              </w:rPr>
-            </w:pPr>
-            <w:r>
-              <w:rPr>
-                <w:rFonts w:ascii="Cambria" w:hAnsi="Cambria"/>
-                <w:lang w:val="es-EC"/>
-              </w:rPr>
-              <w:t>Organizar el contenido.</w:t>
-            </w:r>
-          </w:p>
-        </w:tc>
-        <w:tc>
-          <w:tcPr>
-            <w:tcW w:w="4322" w:type="dxa"/>
-          </w:tcPr>
-          <w:p>
-            <w:pPr>
-              <w:jc w:val="center"/>
-              <w:rPr>
-                <w:rFonts w:ascii="Cambria" w:hAnsi="Cambria"/>
-                <w:lang w:val="es-EC"/>
-              </w:rPr>
-            </w:pPr>
-            <w:r>
-              <w:rPr>
-                <w:rFonts w:ascii="Cambria" w:hAnsi="Cambria"/>
-                <w:lang w:val="es-EC"/>
-              </w:rPr>
-              <w:t>Secciones definidas para la landing page.</w:t>
-            </w:r>
-          </w:p>
-        </w:tc>
-      </w:tr>
-      <w:tr>
-        <w:tc>
-          <w:tcPr>
-            <w:tcW w:w="4322" w:type="dxa"/>
-          </w:tcPr>
-          <w:p>
-            <w:pPr>
-              <w:jc w:val="center"/>
-              <w:rPr>
-                <w:rFonts w:ascii="Cambria" w:hAnsi="Cambria"/>
-                <w:lang w:val="es-EC"/>
-              </w:rPr>
-            </w:pPr>
-            <w:r>
-              <w:rPr>
-                <w:rFonts w:ascii="Cambria" w:hAnsi="Cambria"/>
-                <w:lang w:val="es-EC"/>
-              </w:rPr>
-              <w:t>Comparar las plantillas.</w:t>
-            </w:r>
-          </w:p>
-        </w:tc>
-        <w:tc>
-          <w:tcPr>
-            <w:tcW w:w="4322" w:type="dxa"/>
-          </w:tcPr>
-          <w:p>
-            <w:pPr>
-              <w:jc w:val="center"/>
-              <w:rPr>
-                <w:rFonts w:ascii="Cambria" w:hAnsi="Cambria"/>
-                <w:lang w:val="es-EC"/>
-              </w:rPr>
-            </w:pPr>
-            <w:r>
-              <w:rPr>
-                <w:rFonts w:ascii="Cambria" w:hAnsi="Cambria"/>
-                <w:lang w:val="es-EC"/>
-              </w:rPr>
-              <w:t>Análisis de tres alternativas.</w:t>
-            </w:r>
-          </w:p>
-        </w:tc>
-      </w:tr>
-      <w:tr>
-        <w:tc>
-          <w:tcPr>
-            <w:tcW w:w="4322" w:type="dxa"/>
-          </w:tcPr>
-          <w:p>
-            <w:pPr>
-              <w:jc w:val="center"/>
-              <w:rPr>
-                <w:rFonts w:ascii="Cambria" w:hAnsi="Cambria"/>
-                <w:lang w:val="es-EC"/>
-              </w:rPr>
-            </w:pPr>
-            <w:r>
-              <w:rPr>
-                <w:rFonts w:ascii="Cambria" w:hAnsi="Cambria"/>
-                <w:lang w:val="es-EC"/>
-              </w:rPr>
-              <w:t>Seleccionar ZeroFour.</w:t>
-            </w:r>
-          </w:p>
-        </w:tc>
-        <w:tc>
-          <w:tcPr>
-            <w:tcW w:w="4322" w:type="dxa"/>
-          </w:tcPr>
-          <w:p>
-            <w:pPr>
-              <w:jc w:val="center"/>
-              <w:rPr>
-                <w:rFonts w:ascii="Cambria" w:hAnsi="Cambria"/>
-                <w:lang w:val="es-EC"/>
-              </w:rPr>
-            </w:pPr>
-            <w:r>
-              <w:rPr>
-                <w:rFonts w:ascii="Cambria" w:hAnsi="Cambria"/>
-                <w:lang w:val="es-EC"/>
-              </w:rPr>
-              <w:t>Decisión documentada y justificada.</w:t>
-            </w:r>
-          </w:p>
-        </w:tc>
-      </w:tr>
-      <w:tr>
-        <w:tc>
-          <w:tcPr>
-            <w:tcW w:w="4322" w:type="dxa"/>
-          </w:tcPr>
-          <w:p>
-            <w:pPr>
-              <w:jc w:val="center"/>
-              <w:rPr>
-                <w:rFonts w:ascii="Cambria" w:hAnsi="Cambria"/>
-                <w:lang w:val="es-EC"/>
-              </w:rPr>
-            </w:pPr>
-            <w:r>
-              <w:rPr>
-                <w:rFonts w:ascii="Cambria" w:hAnsi="Cambria"/>
-                <w:lang w:val="es-EC"/>
-              </w:rPr>
-              <w:t>Adaptar HTML y CSS.</w:t>
-            </w:r>
-          </w:p>
-        </w:tc>
-        <w:tc>
-          <w:tcPr>
-            <w:tcW w:w="4322" w:type="dxa"/>
-          </w:tcPr>
-          <w:p>
-            <w:pPr>
-              <w:jc w:val="center"/>
-              <w:rPr>
-                <w:rFonts w:ascii="Cambria" w:hAnsi="Cambria"/>
-                <w:lang w:val="es-EC"/>
-              </w:rPr>
-            </w:pPr>
-            <w:r>
-              <w:rPr>
-                <w:rFonts w:ascii="Cambria" w:hAnsi="Cambria"/>
-                <w:lang w:val="es-EC"/>
-              </w:rPr>
-              <w:t>Primera versión de la página.</w:t>
-            </w:r>
-          </w:p>
-        </w:tc>
-      </w:tr>
-      <w:tr>
-        <w:tc>
-          <w:tcPr>
-            <w:tcW w:w="4322" w:type="dxa"/>
-          </w:tcPr>
-          <w:p>
-            <w:pPr>
-              <w:jc w:val="center"/>
-              <w:rPr>
-                <w:rFonts w:ascii="Cambria" w:hAnsi="Cambria"/>
-                <w:lang w:val="es-EC"/>
-              </w:rPr>
-            </w:pPr>
-            <w:r>
-              <w:rPr>
-                <w:rFonts w:ascii="Cambria" w:hAnsi="Cambria"/>
-                <w:lang w:val="es-EC"/>
-              </w:rPr>
-              <w:t>Verificar navegación y adaptabilidad.</w:t>
-            </w:r>
-          </w:p>
-        </w:tc>
-        <w:tc>
-          <w:tcPr>
-            <w:tcW w:w="4322" w:type="dxa"/>
-          </w:tcPr>
-          <w:p>
-            <w:pPr>
-              <w:jc w:val="center"/>
-              <w:rPr>
-                <w:rFonts w:ascii="Cambria" w:hAnsi="Cambria"/>
-                <w:lang w:val="es-EC"/>
-              </w:rPr>
-            </w:pPr>
-            <w:r>
-              <w:rPr>
-                <w:rFonts w:ascii="Cambria" w:hAnsi="Cambria"/>
-                <w:lang w:val="es-EC"/>
-              </w:rPr>
-              <w:t>Página revisada en distintos tamaños de pantalla.</w:t>
-            </w:r>
-          </w:p>
-        </w:tc>
-      </w:tr>
-      <w:tr>
-        <w:tc>
-          <w:tcPr>
-            <w:tcW w:w="4322" w:type="dxa"/>
-          </w:tcPr>
-          <w:p>
-            <w:pPr>
-              <w:jc w:val="center"/>
-              <w:rPr>
-                <w:rFonts w:ascii="Cambria" w:hAnsi="Cambria"/>
-                <w:lang w:val="es-EC"/>
-              </w:rPr>
-            </w:pPr>
-            <w:r>
-              <w:rPr>
-                <w:rFonts w:ascii="Cambria" w:hAnsi="Cambria"/>
-                <w:lang w:val="es-EC"/>
-              </w:rPr>
-              <w:t>Publicar el repositorio.</w:t>
-            </w:r>
-          </w:p>
-        </w:tc>
-        <w:tc>
-          <w:tcPr>
-            <w:tcW w:w="4322" w:type="dxa"/>
-          </w:tcPr>
-          <w:p>
-            <w:pPr>
-              <w:jc w:val="center"/>
-              <w:rPr>
-                <w:rFonts w:ascii="Cambria" w:hAnsi="Cambria"/>
-                <w:lang w:val="es-EC"/>
-              </w:rPr>
-            </w:pPr>
-            <w:r>
-              <w:rPr>
-                <w:rFonts w:ascii="Cambria" w:hAnsi="Cambria"/>
-                <w:lang w:val="es-EC"/>
-              </w:rPr>
-              <w:t>Código fuente y documentación disponibles en GitHub.</w:t>
-            </w:r>
-          </w:p>
-        </w:tc>
-      </w:tr>
-    </w:tbl>
-    <w:p>
-      <w:pPr>
-        <w:pStyle w:val="Ttulo1"/>
-        <w:rPr>
-          <w:lang w:val="es-EC"/>
-        </w:rPr>
-      </w:pPr>
-      <w:bookmarkStart w:id="9" w:name="_Toc243075244"/>
-      <w:r>
-        <w:rPr>
-          <w:lang w:val="es-EC"/>
-        </w:rPr>
-        <w:t>Diseño</w:t>
-      </w:r>
-      <w:bookmarkEnd w:id="9"/>
-    </w:p>
-    <w:p>
-      <w:pPr>
-        <w:pStyle w:val="Ttulo2"/>
-        <w:rPr>
-          <w:lang w:val="es-EC"/>
-        </w:rPr>
-      </w:pPr>
-      <w:bookmarkStart w:id="10" w:name="_Toc243075245"/>
-      <w:r>
-        <w:rPr>
-          <w:lang w:val="es-EC"/>
-        </w:rPr>
-        <w:t>Estructura de la landing page</w:t>
-      </w:r>
-      <w:bookmarkEnd w:id="10"/>
-    </w:p>
-    <w:p>
-      <w:pPr>
-        <w:rPr>
-          <w:rFonts w:ascii="Cambria" w:hAnsi="Cambria"/>
-          <w:lang w:val="es-EC"/>
-        </w:rPr>
-      </w:pPr>
-      <w:r>
-        <w:rPr>
-          <w:rFonts w:ascii="Cambria" w:hAnsi="Cambria"/>
-          <w:lang w:val="es-EC"/>
-        </w:rPr>
-        <w:t>La página se organizará en las siguientes secciones:</w:t>
-      </w:r>
-    </w:p>
-    <w:p>
-      <w:pPr>
-        <w:rPr>
-          <w:rFonts w:ascii="Cambria" w:hAnsi="Cambria"/>
-          <w:lang w:val="es-EC"/>
-        </w:rPr>
-      </w:pPr>
-      <w:r>
-        <w:rPr>
-          <w:rFonts w:ascii="Cambria" w:hAnsi="Cambria"/>
-          <w:b/>
-          <w:bCs/>
-          <w:lang w:val="es-EC"/>
-        </w:rPr>
-        <w:lastRenderedPageBreak/>
-        <w:t>1. Inicio:</w:t>
-      </w:r>
-      <w:r>
-        <w:rPr>
-          <w:rFonts w:ascii="Cambria" w:hAnsi="Cambria"/>
-          <w:lang w:val="es-EC"/>
-        </w:rPr>
-        <w:t xml:space="preserve"> nombre del evento, descripción e imagen principal.</w:t>
-      </w:r>
-    </w:p>
-    <w:p>
-      <w:pPr>
-        <w:rPr>
-          <w:rFonts w:ascii="Cambria" w:hAnsi="Cambria"/>
-          <w:lang w:val="es-EC"/>
-        </w:rPr>
-      </w:pPr>
-      <w:r>
-        <w:rPr>
-          <w:rFonts w:ascii="Cambria" w:hAnsi="Cambria"/>
-          <w:b/>
-          <w:bCs/>
-          <w:lang w:val="es-EC"/>
-        </w:rPr>
-        <w:t>2. Sobre el evento:</w:t>
-      </w:r>
-      <w:r>
-        <w:rPr>
-          <w:rFonts w:ascii="Cambria" w:hAnsi="Cambria"/>
-          <w:lang w:val="es-EC"/>
-        </w:rPr>
-        <w:t xml:space="preserve"> propósito y descripción de Arte en el Cerro.</w:t>
-      </w:r>
-    </w:p>
-    <w:p>
-      <w:pPr>
-        <w:rPr>
-          <w:rFonts w:ascii="Cambria" w:hAnsi="Cambria"/>
-          <w:lang w:val="es-EC"/>
-        </w:rPr>
-      </w:pPr>
-      <w:r>
-        <w:rPr>
-          <w:rFonts w:ascii="Cambria" w:hAnsi="Cambria"/>
-          <w:b/>
-          <w:bCs/>
-          <w:lang w:val="es-EC"/>
-        </w:rPr>
-        <w:t>3. Programación artística:</w:t>
-      </w:r>
-      <w:r>
-        <w:rPr>
-          <w:rFonts w:ascii="Cambria" w:hAnsi="Cambria"/>
-          <w:lang w:val="es-EC"/>
-        </w:rPr>
-        <w:t xml:space="preserve"> agrupaciones y presentaciones confirmadas.</w:t>
-      </w:r>
-    </w:p>
-    <w:p>
-      <w:pPr>
-        <w:rPr>
-          <w:rFonts w:ascii="Cambria" w:hAnsi="Cambria"/>
-          <w:lang w:val="es-EC"/>
-        </w:rPr>
-      </w:pPr>
-      <w:r>
-        <w:rPr>
-          <w:rFonts w:ascii="Cambria" w:hAnsi="Cambria"/>
-          <w:b/>
-          <w:bCs/>
-          <w:lang w:val="es-EC"/>
-        </w:rPr>
-        <w:t>4. Galería:</w:t>
-      </w:r>
-      <w:r>
-        <w:rPr>
-          <w:rFonts w:ascii="Cambria" w:hAnsi="Cambria"/>
-          <w:lang w:val="es-EC"/>
-        </w:rPr>
-        <w:t xml:space="preserve"> fotografías autorizadas relacionadas con el evento.</w:t>
-      </w:r>
-    </w:p>
-    <w:p>
-      <w:pPr>
-        <w:rPr>
-          <w:rFonts w:ascii="Cambria" w:hAnsi="Cambria"/>
-          <w:lang w:val="es-EC"/>
-        </w:rPr>
-      </w:pPr>
-      <w:r>
-        <w:rPr>
-          <w:rFonts w:ascii="Cambria" w:hAnsi="Cambria"/>
-          <w:b/>
-          <w:bCs/>
-          <w:lang w:val="es-EC"/>
-        </w:rPr>
-        <w:t>5. Información y ubicación:</w:t>
-      </w:r>
-      <w:r>
-        <w:rPr>
-          <w:rFonts w:ascii="Cambria" w:hAnsi="Cambria"/>
-          <w:lang w:val="es-EC"/>
-        </w:rPr>
-        <w:t xml:space="preserve"> datos prácticos para conocer el lugar y las condiciones de la actividad.</w:t>
-      </w:r>
-    </w:p>
-    <w:p>
-      <w:pPr>
-        <w:rPr>
-          <w:rFonts w:ascii="Cambria" w:hAnsi="Cambria"/>
-          <w:lang w:val="es-EC"/>
-        </w:rPr>
-      </w:pPr>
-      <w:r>
-        <w:rPr>
-          <w:rFonts w:ascii="Cambria" w:hAnsi="Cambria"/>
-          <w:b/>
-          <w:bCs/>
-          <w:lang w:val="es-EC"/>
-        </w:rPr>
-        <w:t>6. Contacto y redes sociales:</w:t>
-      </w:r>
-      <w:r>
-        <w:rPr>
-          <w:rFonts w:ascii="Cambria" w:hAnsi="Cambria"/>
-          <w:lang w:val="es-EC"/>
-        </w:rPr>
-        <w:t xml:space="preserve"> canales oficiales disponibles.</w:t>
-      </w:r>
-    </w:p>
-    <w:p>
-      <w:pPr>
-        <w:rPr>
-          <w:rFonts w:ascii="Cambria" w:hAnsi="Cambria"/>
-          <w:lang w:val="es-EC"/>
-        </w:rPr>
-      </w:pPr>
-      <w:r>
-        <w:rPr>
-          <w:rFonts w:ascii="Cambria" w:hAnsi="Cambria"/>
-          <w:b/>
-          <w:bCs/>
-          <w:lang w:val="es-EC"/>
-        </w:rPr>
-        <w:t>7. Pie de página:</w:t>
-      </w:r>
-      <w:r>
-        <w:rPr>
-          <w:rFonts w:ascii="Cambria" w:hAnsi="Cambria"/>
-          <w:lang w:val="es-EC"/>
-        </w:rPr>
-        <w:t xml:space="preserve"> créditos y atribución de la plantilla.</w:t>
-      </w:r>
-    </w:p>
-    <w:p>
-      <w:pPr>
-        <w:rPr>
-          <w:rFonts w:ascii="Cambria" w:hAnsi="Cambria"/>
-          <w:lang w:val="es-EC"/>
-        </w:rPr>
-      </w:pPr>
-      <w:r>
-        <w:rPr>
-          <w:rFonts w:ascii="Cambria" w:hAnsi="Cambria"/>
-          <w:lang w:val="es-EC"/>
-        </w:rPr>
-        <w:t>La estructura definitiva dependerá de la organización de ZeroFour y de la información que se encuentre disponible.</w:t>
-      </w:r>
-    </w:p>
-    <w:p>
-      <w:pPr>
-        <w:pStyle w:val="Ttulo2"/>
-        <w:rPr>
-          <w:lang w:val="es-EC"/>
-        </w:rPr>
-      </w:pPr>
-      <w:bookmarkStart w:id="11" w:name="_Toc243075246"/>
-      <w:r>
-        <w:rPr>
-          <w:lang w:val="es-EC"/>
-        </w:rPr>
-        <w:t>Criterios de diseño</w:t>
-      </w:r>
-      <w:bookmarkEnd w:id="11"/>
-    </w:p>
-    <w:p>
-      <w:pPr>
-        <w:pStyle w:val="Prrafodelista"/>
-        <w:numPr>
-          <w:ilvl w:val="0"/>
-          <w:numId w:val="10"/>
-        </w:numPr>
-        <w:rPr>
-          <w:rFonts w:ascii="Cambria" w:hAnsi="Cambria"/>
-          <w:lang w:val="es-EC"/>
-        </w:rPr>
-      </w:pPr>
-      <w:r>
-        <w:rPr>
-          <w:rFonts w:ascii="Cambria" w:hAnsi="Cambria"/>
-          <w:b/>
-          <w:bCs/>
-          <w:lang w:val="es-EC"/>
-        </w:rPr>
-        <w:t>Jerarquía visual:</w:t>
-      </w:r>
-      <w:r>
-        <w:rPr>
-          <w:rFonts w:ascii="Cambria" w:hAnsi="Cambria"/>
-          <w:lang w:val="es-EC"/>
-        </w:rPr>
-        <w:t xml:space="preserve"> destacar el nombre del evento y la información principal.</w:t>
-      </w:r>
-    </w:p>
-    <w:p>
-      <w:pPr>
-        <w:pStyle w:val="Prrafodelista"/>
-        <w:numPr>
-          <w:ilvl w:val="0"/>
-          <w:numId w:val="10"/>
-        </w:numPr>
-        <w:rPr>
-          <w:rFonts w:ascii="Cambria" w:hAnsi="Cambria"/>
-          <w:lang w:val="es-EC"/>
-        </w:rPr>
-      </w:pPr>
-      <w:r>
-        <w:rPr>
-          <w:rFonts w:ascii="Cambria" w:hAnsi="Cambria"/>
-          <w:b/>
-          <w:bCs/>
-          <w:lang w:val="es-EC"/>
-        </w:rPr>
-        <w:t>Consistencia:</w:t>
-      </w:r>
-      <w:r>
-        <w:rPr>
-          <w:rFonts w:ascii="Cambria" w:hAnsi="Cambria"/>
-          <w:lang w:val="es-EC"/>
-        </w:rPr>
-        <w:t xml:space="preserve"> mantener uniformidad en tipografías, colores, espacios y componentes.</w:t>
-      </w:r>
-    </w:p>
-    <w:p>
-      <w:pPr>
-        <w:pStyle w:val="Prrafodelista"/>
-        <w:numPr>
-          <w:ilvl w:val="0"/>
-          <w:numId w:val="10"/>
-        </w:numPr>
-        <w:rPr>
-          <w:rFonts w:ascii="Cambria" w:hAnsi="Cambria"/>
-          <w:lang w:val="es-EC"/>
-        </w:rPr>
-      </w:pPr>
-      <w:r>
-        <w:rPr>
-          <w:rFonts w:ascii="Cambria" w:hAnsi="Cambria"/>
-          <w:b/>
-          <w:bCs/>
-          <w:lang w:val="es-EC"/>
-        </w:rPr>
-        <w:t>Legibilidad:</w:t>
-      </w:r>
-      <w:r>
-        <w:rPr>
-          <w:rFonts w:ascii="Cambria" w:hAnsi="Cambria"/>
-          <w:lang w:val="es-EC"/>
-        </w:rPr>
-        <w:t xml:space="preserve"> utilizar textos claros y contrastes adecuados.</w:t>
-      </w:r>
-    </w:p>
-    <w:p>
-      <w:pPr>
-        <w:pStyle w:val="Prrafodelista"/>
-        <w:numPr>
-          <w:ilvl w:val="0"/>
-          <w:numId w:val="10"/>
-        </w:numPr>
-        <w:rPr>
-          <w:rFonts w:ascii="Cambria" w:hAnsi="Cambria"/>
-          <w:lang w:val="es-EC"/>
-        </w:rPr>
-      </w:pPr>
-      <w:r>
-        <w:rPr>
-          <w:rFonts w:ascii="Cambria" w:hAnsi="Cambria"/>
-          <w:b/>
-          <w:bCs/>
-          <w:lang w:val="es-EC"/>
-        </w:rPr>
-        <w:t>Adaptabilidad:</w:t>
-      </w:r>
-      <w:r>
-        <w:rPr>
-          <w:rFonts w:ascii="Cambria" w:hAnsi="Cambria"/>
-          <w:lang w:val="es-EC"/>
-        </w:rPr>
-        <w:t xml:space="preserve"> comprobar la presentación en computadoras, tabletas y teléfonos móviles.</w:t>
-      </w:r>
-    </w:p>
-    <w:p>
-      <w:pPr>
-        <w:pStyle w:val="Prrafodelista"/>
-        <w:numPr>
-          <w:ilvl w:val="0"/>
-          <w:numId w:val="10"/>
-        </w:numPr>
-        <w:rPr>
-          <w:rFonts w:ascii="Cambria" w:hAnsi="Cambria"/>
-          <w:lang w:val="es-EC"/>
-        </w:rPr>
-      </w:pPr>
-      <w:r>
-        <w:rPr>
-          <w:rFonts w:ascii="Cambria" w:hAnsi="Cambria"/>
-          <w:b/>
-          <w:bCs/>
-          <w:lang w:val="es-EC"/>
-        </w:rPr>
-        <w:t>Coherencia temática:</w:t>
-      </w:r>
-      <w:r>
-        <w:rPr>
-          <w:rFonts w:ascii="Cambria" w:hAnsi="Cambria"/>
-          <w:lang w:val="es-EC"/>
-        </w:rPr>
-        <w:t xml:space="preserve"> utilizar recursos visuales relacionados con las actividades culturales.</w:t>
-      </w:r>
-    </w:p>
-    <w:p>
-      <w:pPr>
-        <w:pStyle w:val="Prrafodelista"/>
-        <w:numPr>
-          <w:ilvl w:val="0"/>
-          <w:numId w:val="10"/>
-        </w:numPr>
-        <w:rPr>
-          <w:rFonts w:ascii="Cambria" w:hAnsi="Cambria"/>
-          <w:lang w:val="es-EC"/>
-        </w:rPr>
-      </w:pPr>
-      <w:r>
-        <w:rPr>
-          <w:rFonts w:ascii="Cambria" w:hAnsi="Cambria"/>
-          <w:b/>
-          <w:bCs/>
-          <w:lang w:val="es-EC"/>
-        </w:rPr>
-        <w:t>Navegación clara:</w:t>
-      </w:r>
-      <w:r>
-        <w:rPr>
-          <w:rFonts w:ascii="Cambria" w:hAnsi="Cambria"/>
-          <w:lang w:val="es-EC"/>
-        </w:rPr>
-        <w:t xml:space="preserve"> emplear etiquetas descriptivas para cada sección.</w:t>
-      </w:r>
-    </w:p>
-    <w:p>
-      <w:pPr>
-        <w:pStyle w:val="Ttulo1"/>
-        <w:rPr>
-          <w:lang w:val="es-EC"/>
-        </w:rPr>
-      </w:pPr>
-      <w:bookmarkStart w:id="12" w:name="_Toc243075247"/>
-      <w:r>
-        <w:rPr>
-          <w:lang w:val="es-EC"/>
-        </w:rPr>
-        <w:t>Implementación</w:t>
-      </w:r>
-      <w:bookmarkEnd w:id="12"/>
-    </w:p>
-    <w:p>
-      <w:pPr>
-        <w:pStyle w:val="Ttulo2"/>
-        <w:rPr>
-          <w:lang w:val="es-EC"/>
-        </w:rPr>
-      </w:pPr>
-      <w:bookmarkStart w:id="13" w:name="_Toc243075248"/>
-      <w:r>
-        <w:rPr>
-          <w:lang w:val="es-EC"/>
-        </w:rPr>
-        <w:t>Tecnologías utilizadas</w:t>
-      </w:r>
-      <w:bookmarkEnd w:id="13"/>
-    </w:p>
-    <w:tbl>
-      <w:tblPr>
-        <w:tblStyle w:val="Tablaconcuadrcula"/>
-        <w:tblW w:w="0" w:type="auto"/>
-        <w:tblLook w:val="04A0" w:firstRow="1" w:lastRow="0" w:firstColumn="1" w:lastColumn="0" w:noHBand="0" w:noVBand="1"/>
-      </w:tblPr>
-      <w:tblGrid>
-        <w:gridCol w:w="4245"/>
-        <w:gridCol w:w="4249"/>
-      </w:tblGrid>
-      <w:tr>
-        <w:tc>
-          <w:tcPr>
-            <w:tcW w:w="4322" w:type="dxa"/>
-          </w:tcPr>
-          <w:p>
-            <w:pPr>
-              <w:jc w:val="center"/>
-              <w:rPr>
-                <w:rFonts w:asciiTheme="majorHAnsi" w:hAnsiTheme="majorHAnsi"/>
-                <w:b/>
-                <w:bCs/>
-                <w:lang w:val="es-EC"/>
-              </w:rPr>
-            </w:pPr>
-            <w:r>
-              <w:rPr>
-                <w:rFonts w:asciiTheme="majorHAnsi" w:hAnsiTheme="majorHAnsi"/>
-                <w:b/>
-                <w:bCs/>
-                <w:lang w:val="es-EC"/>
-              </w:rPr>
               <w:t>Tecnología</w:t>
             </w:r>
           </w:p>
@@ -5809,7 +6014,7 @@
           <w:lang w:val="es-EC"/>
         </w:rPr>
       </w:pPr>
-      <w:bookmarkStart w:id="14" w:name="_Toc243075249"/>
+      <w:bookmarkStart w:id="14" w:name="_Toc243674508"/>
       <w:r>
         <w:rPr>
           <w:lang w:val="es-EC"/>
@@ -5845,7 +6050,6 @@
           <w:rFonts w:ascii="Cambria" w:hAnsi="Cambria"/>
           <w:lang w:val="es-EC"/>
         </w:rPr>
-        <w:lastRenderedPageBreak/>
         <w:t>landing-page-arte-en-el-cerro/</w:t>
       </w:r>
     </w:p>
@@ -5942,6 +6146,22 @@
           <w:rFonts w:ascii="Cambria" w:hAnsi="Cambria"/>
           <w:lang w:val="en-US"/>
         </w:rPr>
+        <w:t xml:space="preserve"> docs/</w:t>
+      </w:r>
+    </w:p>
+    <w:p>
+      <w:pPr>
+        <w:spacing w:line="180" w:lineRule="auto"/>
+        <w:rPr>
+          <w:rFonts w:ascii="Cambria" w:hAnsi="Cambria"/>
+          <w:lang w:val="en-US"/>
+        </w:rPr>
+      </w:pPr>
+      <w:r>
+        <w:rPr>
+          <w:rFonts w:ascii="Cambria" w:hAnsi="Cambria"/>
+          <w:lang w:val="en-US"/>
+        </w:rPr>
         <w:t xml:space="preserve"> </w:t>
       </w:r>
       <w:r>
@@ -5949,7 +6169,139 @@
           <w:rFonts w:ascii="Cambria" w:hAnsi="Cambria"/>
           <w:lang w:val="en-US"/>
         </w:rPr>
-        <w:t>left-sidebar.html</w:t>
+        <w:tab/>
+      </w:r>
+      <w:r>
+        <w:rPr>
+          <w:rFonts w:ascii="Cambria" w:hAnsi="Cambria" w:cs="Calibri"/>
+          <w:lang w:val="en-US"/>
+        </w:rPr>
+        <w:t>─</w:t>
+      </w:r>
+      <w:r>
+        <w:rPr>
+          <w:rFonts w:ascii="Cambria" w:hAnsi="Cambria"/>
+          <w:lang w:val="en-US"/>
+        </w:rPr>
+        <w:t xml:space="preserve"> </w:t>
+      </w:r>
+      <w:r>
+        <w:rPr>
+          <w:rFonts w:ascii="Cambria" w:hAnsi="Cambria"/>
+          <w:lang w:val="en-US"/>
+        </w:rPr>
+        <w:t>assets/</w:t>
+      </w:r>
+    </w:p>
+    <w:p>
+      <w:pPr>
+        <w:spacing w:line="180" w:lineRule="auto"/>
+        <w:rPr>
+          <w:rFonts w:ascii="Cambria" w:hAnsi="Cambria"/>
+          <w:lang w:val="es-MX"/>
+        </w:rPr>
+      </w:pPr>
+      <w:r>
+        <w:rPr>
+          <w:rFonts w:ascii="Cambria" w:hAnsi="Cambria"/>
+          <w:lang w:val="en-US"/>
+        </w:rPr>
+        <w:tab/>
+      </w:r>
+      <w:r>
+        <w:rPr>
+          <w:rFonts w:ascii="Cambria" w:hAnsi="Cambria"/>
+          <w:lang w:val="en-US"/>
+        </w:rPr>
+        <w:tab/>
+      </w:r>
+      <w:r>
+        <w:rPr>
+          <w:rFonts w:ascii="Cambria" w:hAnsi="Cambria" w:cs="Calibri"/>
+          <w:lang w:val="es-MX"/>
+        </w:rPr>
+        <w:t>─</w:t>
+      </w:r>
+      <w:r>
+        <w:rPr>
+          <w:rFonts w:ascii="Cambria" w:hAnsi="Cambria"/>
+          <w:lang w:val="es-MX"/>
+        </w:rPr>
+        <w:t xml:space="preserve"> css/</w:t>
+      </w:r>
+    </w:p>
+    <w:p>
+      <w:pPr>
+        <w:spacing w:line="180" w:lineRule="auto"/>
+        <w:rPr>
+          <w:rFonts w:ascii="Cambria" w:hAnsi="Cambria"/>
+          <w:lang w:val="es-MX"/>
+        </w:rPr>
+      </w:pPr>
+      <w:r>
+        <w:rPr>
+          <w:rFonts w:ascii="Cambria" w:hAnsi="Cambria"/>
+          <w:lang w:val="es-MX"/>
+        </w:rPr>
+        <w:tab/>
+      </w:r>
+      <w:r>
+        <w:rPr>
+          <w:rFonts w:ascii="Cambria" w:hAnsi="Cambria"/>
+          <w:lang w:val="es-MX"/>
+        </w:rPr>
+        <w:tab/>
+      </w:r>
+      <w:r>
+        <w:rPr>
+          <w:rFonts w:ascii="Cambria" w:hAnsi="Cambria" w:cs="Calibri"/>
+          <w:lang w:val="es-MX"/>
+        </w:rPr>
+        <w:t>─</w:t>
+      </w:r>
+      <w:r>
+        <w:rPr>
+          <w:rFonts w:ascii="Cambria" w:hAnsi="Cambria"/>
+          <w:lang w:val="es-MX"/>
+        </w:rPr>
+        <w:t xml:space="preserve"> js/</w:t>
+      </w:r>
+    </w:p>
+    <w:p>
+      <w:pPr>
+        <w:spacing w:line="180" w:lineRule="auto"/>
+        <w:rPr>
+          <w:rFonts w:ascii="Cambria" w:hAnsi="Cambria"/>
+          <w:lang w:val="es-MX"/>
+        </w:rPr>
+      </w:pPr>
+      <w:r>
+        <w:rPr>
+          <w:rFonts w:ascii="Cambria" w:hAnsi="Cambria"/>
+          <w:lang w:val="es-MX"/>
+        </w:rPr>
+        <w:tab/>
+      </w:r>
+      <w:r>
+        <w:rPr>
+          <w:rFonts w:ascii="Cambria" w:hAnsi="Cambria"/>
+          <w:lang w:val="es-MX"/>
+        </w:rPr>
+        <w:tab/>
+      </w:r>
+      <w:r>
+        <w:rPr>
+          <w:rFonts w:ascii="Cambria" w:hAnsi="Cambria" w:cs="Calibri"/>
+          <w:lang w:val="es-MX"/>
+        </w:rPr>
+        <w:t>─</w:t>
+      </w:r>
+      <w:r>
+        <w:rPr>
+          <w:rFonts w:ascii="Cambria" w:hAnsi="Cambria"/>
+          <w:lang w:val="es-MX"/>
+        </w:rPr>
+        <w:t xml:space="preserve"> webfonts/</w:t>
       </w:r>
     </w:p>
     <w:p>
@@ -5958,22 +6310,15 @@
         <w:ind w:left="708"/>
         <w:rPr>
           <w:rFonts w:ascii="Cambria" w:hAnsi="Cambria"/>
-          <w:lang w:val="en-US"/>
-        </w:rPr>
-      </w:pPr>
-      <w:r>
-        <w:rPr>
-          <w:rFonts w:ascii="Cambria" w:hAnsi="Cambria" w:cs="Calibri"/>
-          <w:lang w:val="en-US"/>
-        </w:rPr>
-        <w:t>─</w:t>
-      </w:r>
-      <w:r>
-        <w:rPr>
-          <w:rFonts w:ascii="Cambria" w:hAnsi="Cambria"/>
-          <w:lang w:val="en-US"/>
-        </w:rPr>
-        <w:t xml:space="preserve"> no-sidebar.html</w:t>
+          <w:lang w:val="es-MX"/>
+        </w:rPr>
+      </w:pPr>
+      <w:r>
+        <w:rPr>
+          <w:rFonts w:ascii="Cambria" w:hAnsi="Cambria"/>
+          <w:lang w:val="es-MX"/>
+        </w:rPr>
+        <w:t>─ images/</w:t>
       </w:r>
     </w:p>
     <w:p>
@@ -5982,286 +6327,33 @@
         <w:ind w:left="708"/>
         <w:rPr>
           <w:rFonts w:ascii="Cambria" w:hAnsi="Cambria"/>
-          <w:lang w:val="en-US"/>
-        </w:rPr>
-      </w:pPr>
-      <w:r>
-        <w:rPr>
-          <w:rFonts w:ascii="Cambria" w:hAnsi="Cambria" w:cs="Calibri"/>
-          <w:lang w:val="en-US"/>
-        </w:rPr>
-        <w:t>─</w:t>
-      </w:r>
-      <w:r>
-        <w:rPr>
-          <w:rFonts w:ascii="Cambria" w:hAnsi="Cambria"/>
-          <w:lang w:val="en-US"/>
-        </w:rPr>
-        <w:t xml:space="preserve"> right-sidebar.html</w:t>
-      </w:r>
-    </w:p>
-    <w:p>
-      <w:pPr>
-        <w:spacing w:line="180" w:lineRule="auto"/>
-        <w:ind w:left="708"/>
-        <w:rPr>
-          <w:rFonts w:ascii="Cambria" w:hAnsi="Cambria"/>
-          <w:lang w:val="en-US"/>
-        </w:rPr>
-      </w:pPr>
-      <w:r>
-        <w:rPr>
-          <w:rFonts w:ascii="Cambria" w:hAnsi="Cambria" w:cs="Calibri"/>
-          <w:lang w:val="en-US"/>
-        </w:rPr>
-        <w:t>─</w:t>
-      </w:r>
-      <w:r>
-        <w:rPr>
-          <w:rFonts w:ascii="Cambria" w:hAnsi="Cambria"/>
-          <w:lang w:val="en-US"/>
-        </w:rPr>
-        <w:t xml:space="preserve"> docs/</w:t>
-      </w:r>
-    </w:p>
-    <w:p>
-      <w:pPr>
-        <w:spacing w:line="180" w:lineRule="auto"/>
-        <w:rPr>
-          <w:rFonts w:ascii="Cambria" w:hAnsi="Cambria"/>
-          <w:lang w:val="en-US"/>
-        </w:rPr>
-      </w:pPr>
-      <w:r>
-        <w:rPr>
-          <w:rFonts w:ascii="Cambria" w:hAnsi="Cambria"/>
-          <w:lang w:val="en-US"/>
-        </w:rPr>
-        <w:t xml:space="preserve"> </w:t>
-      </w:r>
-      <w:r>
-        <w:rPr>
-          <w:rFonts w:ascii="Cambria" w:hAnsi="Cambria"/>
-          <w:lang w:val="en-US"/>
-        </w:rPr>
-        <w:tab/>
-      </w:r>
-      <w:r>
-        <w:rPr>
-          <w:rFonts w:ascii="Cambria" w:hAnsi="Cambria" w:cs="Calibri"/>
-          <w:lang w:val="en-US"/>
-        </w:rPr>
-        <w:t>─</w:t>
-      </w:r>
-      <w:r>
-        <w:rPr>
-          <w:rFonts w:ascii="Cambria" w:hAnsi="Cambria"/>
-          <w:lang w:val="en-US"/>
-        </w:rPr>
-        <w:t xml:space="preserve"> </w:t>
-      </w:r>
-      <w:r>
-        <w:rPr>
-          <w:rFonts w:ascii="Cambria" w:hAnsi="Cambria"/>
-          <w:lang w:val="en-US"/>
-        </w:rPr>
-        <w:t>assets/</w:t>
-      </w:r>
-    </w:p>
-    <w:p>
-      <w:pPr>
-        <w:spacing w:line="180" w:lineRule="auto"/>
-        <w:rPr>
-          <w:rFonts w:ascii="Cambria" w:hAnsi="Cambria"/>
-          <w:lang w:val="es-EC"/>
-        </w:rPr>
-      </w:pPr>
-      <w:r>
-        <w:rPr>
-          <w:rFonts w:ascii="Cambria" w:hAnsi="Cambria"/>
-          <w:lang w:val="en-US"/>
-        </w:rPr>
-        <w:tab/>
-      </w:r>
-      <w:r>
-        <w:rPr>
-          <w:rFonts w:ascii="Cambria" w:hAnsi="Cambria"/>
-          <w:lang w:val="en-US"/>
-        </w:rPr>
-        <w:tab/>
-      </w:r>
-      <w:r>
-        <w:rPr>
-          <w:rFonts w:ascii="Cambria" w:hAnsi="Cambria" w:cs="Calibri"/>
-          <w:lang w:val="es-EC"/>
-        </w:rPr>
-        <w:t>─</w:t>
-      </w:r>
-      <w:r>
-        <w:rPr>
-          <w:rFonts w:ascii="Cambria" w:hAnsi="Cambria"/>
-          <w:lang w:val="es-EC"/>
-        </w:rPr>
-        <w:t xml:space="preserve"> </w:t>
-      </w:r>
-      <w:proofErr w:type="spellStart"/>
-      <w:r>
-        <w:rPr>
-          <w:rFonts w:ascii="Cambria" w:hAnsi="Cambria"/>
-          <w:lang w:val="es-EC"/>
-        </w:rPr>
-        <w:t>css</w:t>
-      </w:r>
-      <w:proofErr w:type="spellEnd"/>
-      <w:r>
-        <w:rPr>
-          <w:rFonts w:ascii="Cambria" w:hAnsi="Cambria"/>
-          <w:lang w:val="es-EC"/>
+          <w:lang w:val="es-MX"/>
+        </w:rPr>
+      </w:pPr>
+      <w:r>
+        <w:rPr>
+          <w:rFonts w:ascii="Cambria" w:hAnsi="Cambria"/>
+          <w:lang w:val="es-MX"/>
+        </w:rPr>
+        <w:t xml:space="preserve">─ </w:t>
+      </w:r>
+      <w:r>
+        <w:rPr>
+          <w:rFonts w:ascii="Cambria" w:hAnsi="Cambria"/>
+          <w:lang w:val="es-MX"/>
+        </w:rPr>
+        <w:t>videos</w:t>
+      </w:r>
+      <w:r>
+        <w:rPr>
+          <w:rFonts w:ascii="Cambria" w:hAnsi="Cambria"/>
+          <w:lang w:val="es-MX"/>
         </w:rPr>
         <w:t>/</w:t>
       </w:r>
     </w:p>
     <w:p>
       <w:pPr>
-        <w:spacing w:line="180" w:lineRule="auto"/>
-        <w:rPr>
-          <w:rFonts w:ascii="Cambria" w:hAnsi="Cambria"/>
-          <w:lang w:val="es-EC"/>
-        </w:rPr>
-      </w:pPr>
-      <w:r>
-        <w:rPr>
-          <w:rFonts w:ascii="Cambria" w:hAnsi="Cambria"/>
-          <w:lang w:val="es-EC"/>
-        </w:rPr>
-        <w:tab/>
-      </w:r>
-      <w:r>
-        <w:rPr>
-          <w:rFonts w:ascii="Cambria" w:hAnsi="Cambria"/>
-          <w:lang w:val="es-EC"/>
-        </w:rPr>
-        <w:tab/>
-      </w:r>
-      <w:r>
-        <w:rPr>
-          <w:rFonts w:ascii="Cambria" w:hAnsi="Cambria" w:cs="Calibri"/>
-          <w:lang w:val="es-EC"/>
-        </w:rPr>
-        <w:t>─</w:t>
-      </w:r>
-      <w:r>
-        <w:rPr>
-          <w:rFonts w:ascii="Cambria" w:hAnsi="Cambria"/>
-          <w:lang w:val="es-EC"/>
-        </w:rPr>
-        <w:t xml:space="preserve"> </w:t>
-      </w:r>
-      <w:proofErr w:type="spellStart"/>
-      <w:r>
-        <w:rPr>
-          <w:rFonts w:ascii="Cambria" w:hAnsi="Cambria"/>
-          <w:lang w:val="es-EC"/>
-        </w:rPr>
-        <w:t>js</w:t>
-      </w:r>
-      <w:proofErr w:type="spellEnd"/>
-      <w:r>
-        <w:rPr>
-          <w:rFonts w:ascii="Cambria" w:hAnsi="Cambria"/>
-          <w:lang w:val="es-EC"/>
-        </w:rPr>
-        <w:t>/</w:t>
-      </w:r>
-    </w:p>
-    <w:p>
-      <w:pPr>
-        <w:spacing w:line="180" w:lineRule="auto"/>
-        <w:rPr>
-          <w:rFonts w:ascii="Cambria" w:hAnsi="Cambria"/>
-          <w:lang w:val="es-EC"/>
-        </w:rPr>
-      </w:pPr>
-      <w:r>
-        <w:rPr>
-          <w:rFonts w:ascii="Cambria" w:hAnsi="Cambria"/>
-          <w:lang w:val="es-EC"/>
-        </w:rPr>
-        <w:tab/>
-      </w:r>
-      <w:r>
-        <w:rPr>
-          <w:rFonts w:ascii="Cambria" w:hAnsi="Cambria"/>
-          <w:lang w:val="es-EC"/>
-        </w:rPr>
-        <w:tab/>
-      </w:r>
-      <w:r>
-        <w:rPr>
-          <w:rFonts w:ascii="Cambria" w:hAnsi="Cambria" w:cs="Calibri"/>
-          <w:lang w:val="es-EC"/>
-        </w:rPr>
-        <w:t>─</w:t>
-      </w:r>
-      <w:r>
-        <w:rPr>
-          <w:rFonts w:ascii="Cambria" w:hAnsi="Cambria"/>
-          <w:lang w:val="es-EC"/>
-        </w:rPr>
-        <w:t xml:space="preserve"> </w:t>
-      </w:r>
-      <w:proofErr w:type="spellStart"/>
-      <w:r>
-        <w:rPr>
-          <w:rFonts w:ascii="Cambria" w:hAnsi="Cambria"/>
-          <w:lang w:val="es-EC"/>
-        </w:rPr>
-        <w:t>webfonts</w:t>
-      </w:r>
-      <w:proofErr w:type="spellEnd"/>
-      <w:r>
-        <w:rPr>
-          <w:rFonts w:ascii="Cambria" w:hAnsi="Cambria"/>
-          <w:lang w:val="es-EC"/>
-        </w:rPr>
-        <w:t>/</w:t>
-      </w:r>
-    </w:p>
-    <w:p>
-      <w:pPr>
-        <w:spacing w:line="180" w:lineRule="auto"/>
-        <w:ind w:left="708"/>
-        <w:rPr>
-          <w:rFonts w:ascii="Cambria" w:hAnsi="Cambria"/>
-          <w:lang w:val="es-EC"/>
-        </w:rPr>
-      </w:pPr>
-      <w:r>
-        <w:rPr>
-          <w:rFonts w:ascii="Cambria" w:hAnsi="Cambria"/>
-          <w:lang w:val="es-EC"/>
-        </w:rPr>
-        <w:t xml:space="preserve">─ </w:t>
-      </w:r>
-      <w:proofErr w:type="spellStart"/>
-      <w:r>
-        <w:rPr>
-          <w:rFonts w:ascii="Cambria" w:hAnsi="Cambria"/>
-          <w:lang w:val="es-EC"/>
-        </w:rPr>
-        <w:t>images</w:t>
-      </w:r>
-      <w:proofErr w:type="spellEnd"/>
-      <w:r>
-        <w:rPr>
-          <w:rFonts w:ascii="Cambria" w:hAnsi="Cambria"/>
-          <w:lang w:val="es-EC"/>
-        </w:rPr>
-        <w:t>/</w:t>
-      </w:r>
-    </w:p>
-    <w:p>
-      <w:pPr>
         <w:rPr>
           <w:rFonts w:ascii="Cambria" w:hAnsi="Cambria"/>
           <w:lang w:val="es-MX"/>
@@ -6282,7 +6374,7 @@
           <w:lang w:val="es-MX"/>
         </w:rPr>
       </w:pPr>
-      <w:bookmarkStart w:id="15" w:name="_Toc243075250"/>
+      <w:bookmarkStart w:id="15" w:name="_Toc243674509"/>
       <w:r>
         <w:rPr>
           <w:lang w:val="es-MX"/>
@@ -6342,6 +6434,7 @@
           <w:bCs/>
           <w:lang w:val="es-MX"/>
         </w:rPr>
+        <w:lastRenderedPageBreak/>
         <w:t>docs: documentar el proyecto</w:t>
       </w:r>
     </w:p>
@@ -6463,7 +6556,7 @@
           <w:lang w:val="es-MX"/>
         </w:rPr>
       </w:pPr>
-      <w:bookmarkStart w:id="16" w:name="_Toc243075251"/>
+      <w:bookmarkStart w:id="16" w:name="_Toc243674510"/>
       <w:r>
         <w:rPr>
           <w:lang w:val="es-MX"/>
@@ -6616,117 +6709,214 @@
       <w:pPr>
         <w:pStyle w:val="Ttulo1"/>
         <w:rPr>
-          <w:lang w:val="es-EC"/>
-        </w:rPr>
-      </w:pPr>
-      <w:bookmarkStart w:id="17" w:name="_Toc243075252"/>
-      <w:r>
-        <w:rPr>
-          <w:lang w:val="es-EC"/>
+          <w:lang w:val="es-MX"/>
+        </w:rPr>
+      </w:pPr>
+      <w:bookmarkStart w:id="17" w:name="_Toc243674511"/>
+      <w:r>
+        <w:rPr>
+          <w:lang w:val="es-MX"/>
+        </w:rPr>
+        <w:t>Personalización y funcionalidades implementadas</w:t>
+      </w:r>
+      <w:bookmarkEnd w:id="17"/>
+    </w:p>
+    <w:p>
+      <w:pPr>
+        <w:rPr>
+          <w:rFonts w:ascii="Cambria" w:hAnsi="Cambria"/>
+          <w:lang w:val="es-MX"/>
+        </w:rPr>
+      </w:pPr>
+      <w:r>
+        <w:rPr>
+          <w:rFonts w:ascii="Cambria" w:hAnsi="Cambria"/>
+          <w:lang w:val="es-MX"/>
+        </w:rPr>
+        <w:t>La landing page fue desarrollada mediante la adaptación de la plantilla ZeroFour de HTML5 UP. Se personalizó la composición visual utilizando los colores azul oscuro, azul institucional y ámbar, incorporando fotografías relacionadas con el evento y logotipos representativos.</w:t>
+      </w:r>
+    </w:p>
+    <w:p>
+      <w:pPr>
+        <w:rPr>
+          <w:rFonts w:ascii="Cambria" w:hAnsi="Cambria"/>
+          <w:lang w:val="es-MX"/>
+        </w:rPr>
+      </w:pPr>
+      <w:r>
+        <w:rPr>
+          <w:rFonts w:ascii="Cambria" w:hAnsi="Cambria"/>
+          <w:lang w:val="es-MX"/>
+        </w:rPr>
+        <w:t>En la portada se implementó un efecto de iluminación interactiva que responde al movimiento del cursor. La sección «Sobre el evento» presenta una composición editorial, animación tipográfica y un efecto de enfoque de palabras controlado mediante el desplazamiento de la página.</w:t>
+      </w:r>
+    </w:p>
+    <w:p>
+      <w:pPr>
+        <w:rPr>
+          <w:rFonts w:ascii="Cambria" w:hAnsi="Cambria"/>
+          <w:lang w:val="es-MX"/>
+        </w:rPr>
+      </w:pPr>
+      <w:r>
+        <w:rPr>
+          <w:rFonts w:ascii="Cambria" w:hAnsi="Cambria"/>
+          <w:lang w:val="es-MX"/>
+        </w:rPr>
+        <w:t>La programación artística documenta las participaciones del Coro ESPOL, Grupo de Teatro ESPOL y Elena Erazo durante la edición del 2 de octubre de 2026.</w:t>
+      </w:r>
+    </w:p>
+    <w:p>
+      <w:pPr>
+        <w:rPr>
+          <w:rFonts w:ascii="Cambria" w:hAnsi="Cambria"/>
+          <w:lang w:val="es-MX"/>
+        </w:rPr>
+      </w:pPr>
+      <w:r>
+        <w:rPr>
+          <w:rFonts w:ascii="Cambria" w:hAnsi="Cambria"/>
+          <w:lang w:val="es-MX"/>
+        </w:rPr>
+        <w:t xml:space="preserve">La galería incorpora un reproductor de video HTML5 con controles nativos y un selector desarrollado en JavaScript para cambiar entre las tres grabaciones de octubre. También cuenta con un archivo fotográfico que permite consultar tres imágenes correspondientes a cada una de las jornadas del 21 de julio, 7 de agosto y 4 de septiembre de 2026. Adicionalmente, integra un </w:t>
+      </w:r>
+      <w:proofErr w:type="spellStart"/>
+      <w:r>
+        <w:rPr>
+          <w:rFonts w:ascii="Cambria" w:hAnsi="Cambria"/>
+          <w:lang w:val="es-MX"/>
+        </w:rPr>
+        <w:t>Reel</w:t>
+      </w:r>
+      <w:proofErr w:type="spellEnd"/>
+      <w:r>
+        <w:rPr>
+          <w:rFonts w:ascii="Cambria" w:hAnsi="Cambria"/>
+          <w:lang w:val="es-MX"/>
+        </w:rPr>
+        <w:t xml:space="preserve"> promocional mediante el reproductor oficial de Instagram.</w:t>
+      </w:r>
+    </w:p>
+    <w:p>
+      <w:pPr>
+        <w:rPr>
+          <w:rFonts w:ascii="Cambria" w:hAnsi="Cambria"/>
+          <w:lang w:val="es-MX"/>
+        </w:rPr>
+      </w:pPr>
+      <w:r>
+        <w:rPr>
+          <w:rFonts w:ascii="Cambria" w:hAnsi="Cambria"/>
+          <w:lang w:val="es-MX"/>
+        </w:rPr>
+        <w:t>La sección de información presenta los datos confirmados del evento, acompañados de un efecto tipográfico de profundidad. La ubicación incluye un mapa de Google Maps y un enlace de consulta externa. Finalmente, el pie de página presenta canales de ESPOL Cultural y un formulario de contacto demostrativo que no envía ni almacena los datos ingresados.</w:t>
+      </w:r>
+    </w:p>
+    <w:p>
+      <w:pPr>
+        <w:rPr>
+          <w:rFonts w:ascii="Cambria" w:hAnsi="Cambria"/>
+          <w:lang w:val="es-MX"/>
+        </w:rPr>
+      </w:pPr>
+      <w:r>
+        <w:rPr>
+          <w:rFonts w:ascii="Cambria" w:hAnsi="Cambria"/>
+          <w:lang w:val="es-MX"/>
         </w:rPr>
         <w:lastRenderedPageBreak/>
+        <w:t>Los componentes personalizados se implementaron principalmente mediante HTML5, CSS3 y JavaScript, manteniendo la compatibilidad con la publicación estática mediante GitHub Pages.</w:t>
+      </w:r>
+    </w:p>
+    <w:p>
+      <w:pPr>
+        <w:pStyle w:val="Ttulo1"/>
+        <w:rPr>
+          <w:lang w:val="es-EC"/>
+        </w:rPr>
+      </w:pPr>
+      <w:bookmarkStart w:id="18" w:name="_Toc243674512"/>
+      <w:r>
+        <w:rPr>
+          <w:lang w:val="es-EC"/>
+        </w:rPr>
         <w:t>Despliegue</w:t>
       </w:r>
-      <w:bookmarkEnd w:id="17"/>
-    </w:p>
-    <w:p>
-      <w:pPr>
-        <w:rPr>
-          <w:rFonts w:ascii="Cambria" w:hAnsi="Cambria"/>
-          <w:lang w:val="es-EC"/>
-        </w:rPr>
-      </w:pPr>
-      <w:r>
-        <w:rPr>
-          <w:rFonts w:ascii="Cambria" w:hAnsi="Cambria"/>
-          <w:lang w:val="es-EC"/>
-        </w:rPr>
-        <w:t>El proyecto se alojará en un repositorio público de GitHub.</w:t>
-      </w:r>
-    </w:p>
-    <w:p>
-      <w:pPr>
-        <w:rPr>
-          <w:rFonts w:ascii="Cambria" w:hAnsi="Cambria"/>
-          <w:lang w:val="es-EC"/>
-        </w:rPr>
-      </w:pPr>
-      <w:r>
-        <w:rPr>
-          <w:rFonts w:ascii="Cambria" w:hAnsi="Cambria"/>
-          <w:lang w:val="es-EC"/>
-        </w:rPr>
-        <w:t xml:space="preserve">URL del repositorio: </w:t>
+      <w:bookmarkEnd w:id="18"/>
+    </w:p>
+    <w:p>
+      <w:pPr>
+        <w:rPr>
+          <w:rFonts w:ascii="Cambria" w:hAnsi="Cambria"/>
+          <w:lang w:val="es-MX"/>
+        </w:rPr>
+      </w:pPr>
+      <w:r>
+        <w:rPr>
+          <w:rFonts w:ascii="Cambria" w:hAnsi="Cambria"/>
+          <w:lang w:val="es-MX"/>
+        </w:rPr>
+        <w:t>El proyecto utiliza Git como herramienta de control de versiones y GitHub como plataforma de alojamiento del código fuente.</w:t>
+      </w:r>
+    </w:p>
+    <w:p>
+      <w:pPr>
+        <w:rPr>
+          <w:rFonts w:ascii="Cambria" w:hAnsi="Cambria"/>
+          <w:lang w:val="es-MX"/>
+        </w:rPr>
+      </w:pPr>
+      <w:r>
+        <w:rPr>
+          <w:rFonts w:ascii="Cambria" w:hAnsi="Cambria"/>
+          <w:lang w:val="es-MX"/>
+        </w:rPr>
+        <w:t xml:space="preserve">Repositorio: </w:t>
       </w:r>
       <w:hyperlink r:id="rId15" w:history="1">
         <w:r>
           <w:rPr>
             <w:rStyle w:val="Hipervnculo"/>
             <w:rFonts w:ascii="Cambria" w:hAnsi="Cambria"/>
-            <w:lang w:val="es-EC"/>
+            <w:lang w:val="es-MX"/>
           </w:rPr>
           <w:t>https://github.com/John0487/landing-page-arte-en-el-cerro</w:t>
         </w:r>
       </w:hyperlink>
-      <w:r>
-        <w:rPr>
-          <w:rFonts w:ascii="Cambria" w:hAnsi="Cambria"/>
-          <w:lang w:val="es-EC"/>
-        </w:rPr>
-        <w:br/>
-      </w:r>
-    </w:p>
-    <w:p>
-      <w:pPr>
-        <w:rPr>
-          <w:rFonts w:ascii="Cambria" w:hAnsi="Cambria"/>
-          <w:lang w:val="es-EC"/>
-        </w:rPr>
-      </w:pPr>
-      <w:r>
-        <w:rPr>
-          <w:rFonts w:ascii="Cambria" w:hAnsi="Cambria"/>
-          <w:lang w:val="es-EC"/>
-        </w:rPr>
-        <w:t>Como alternativa para publicar la página, se podrá configurar GitHub Pages.</w:t>
-      </w:r>
-    </w:p>
-    <w:p>
-      <w:pPr>
-        <w:rPr>
-          <w:rFonts w:ascii="Cambria" w:hAnsi="Cambria"/>
-          <w:lang w:val="es-EC"/>
-        </w:rPr>
-      </w:pPr>
-      <w:r>
-        <w:rPr>
-          <w:rFonts w:ascii="Cambria" w:hAnsi="Cambria"/>
-          <w:lang w:val="es-EC"/>
-        </w:rPr>
-        <w:t xml:space="preserve">URL de la </w:t>
-      </w:r>
-      <w:proofErr w:type="spellStart"/>
-      <w:r>
-        <w:rPr>
-          <w:rFonts w:ascii="Cambria" w:hAnsi="Cambria"/>
-          <w:lang w:val="es-EC"/>
-        </w:rPr>
-        <w:t>landing</w:t>
-      </w:r>
-      <w:proofErr w:type="spellEnd"/>
-      <w:r>
-        <w:rPr>
-          <w:rFonts w:ascii="Cambria" w:hAnsi="Cambria"/>
-          <w:lang w:val="es-EC"/>
-        </w:rPr>
-        <w:t xml:space="preserve"> page: </w:t>
+    </w:p>
+    <w:p>
+      <w:pPr>
+        <w:rPr>
+          <w:rFonts w:ascii="Cambria" w:hAnsi="Cambria"/>
+          <w:lang w:val="es-MX"/>
+        </w:rPr>
+      </w:pPr>
+      <w:r>
+        <w:rPr>
+          <w:rFonts w:ascii="Cambria" w:hAnsi="Cambria"/>
+          <w:lang w:val="es-MX"/>
+        </w:rPr>
+        <w:t>La primera versión funcional se publicó mediante GitHub Pages, utilizando la rama principal main y la carpeta raíz del repositorio como origen del contenido.</w:t>
+      </w:r>
+    </w:p>
+    <w:p>
+      <w:pPr>
+        <w:rPr>
+          <w:rFonts w:ascii="Cambria" w:hAnsi="Cambria"/>
+          <w:lang w:val="es-MX"/>
+        </w:rPr>
+      </w:pPr>
+      <w:r>
+        <w:rPr>
+          <w:rFonts w:ascii="Cambria" w:hAnsi="Cambria"/>
+          <w:lang w:val="es-MX"/>
+        </w:rPr>
+        <w:t xml:space="preserve">URL pública: </w:t>
       </w:r>
       <w:hyperlink r:id="rId16" w:history="1">
         <w:r>
           <w:rPr>
-            <w:rStyle w:val="Hipervnculo"/>
-            <w:rFonts w:ascii="Cambria" w:hAnsi="Cambria"/>
-            <w:lang w:val="es-EC"/>
+            <w:lang w:val="es-MX"/>
           </w:rPr>
           <w:t>https://john0487.github.io/landing-page-arte-en-el-cerro/</w:t>
         </w:r>
@@ -6736,15 +6926,15 @@
       <w:pPr>
         <w:rPr>
           <w:rFonts w:ascii="Cambria" w:hAnsi="Cambria"/>
-          <w:lang w:val="es-EC"/>
-        </w:rPr>
-      </w:pPr>
-      <w:r>
-        <w:rPr>
-          <w:rFonts w:ascii="Cambria" w:hAnsi="Cambria"/>
-          <w:lang w:val="es-EC"/>
-        </w:rPr>
-        <w:t>Antes de entregar el proyecto, se comprobará que el repositorio sea accesible públicamente y que la página publicada, si corresponde, cargue correctamente sus estilos, imágenes y elementos de navegación.</w:t>
+          <w:lang w:val="es-MX"/>
+        </w:rPr>
+      </w:pPr>
+      <w:r>
+        <w:rPr>
+          <w:rFonts w:ascii="Cambria" w:hAnsi="Cambria"/>
+          <w:lang w:val="es-MX"/>
+        </w:rPr>
+        <w:t>La publicación permite acceder a la landing page desde un navegador web sin necesidad de ejecutar un servidor local. La versión final del proyecto incorpora, además, el archivo histórico de ediciones anteriores, la galería audiovisual de octubre, el formulario demostrativo y las mejoras derivadas de las recomendaciones de la organización del evento.</w:t>
       </w:r>
     </w:p>
     <w:p>
@@ -6754,14 +6944,455 @@
           <w:lang w:val="es-EC"/>
         </w:rPr>
       </w:pPr>
-      <w:bookmarkStart w:id="18" w:name="_Toc243075253"/>
+      <w:bookmarkStart w:id="19" w:name="_Toc243674513"/>
+      <w:r>
+        <w:rPr>
+          <w:lang w:val="es-EC"/>
+        </w:rPr>
+        <w:t>Evidencias de implementación</w:t>
+      </w:r>
+      <w:bookmarkEnd w:id="19"/>
+    </w:p>
+    <w:p>
+      <w:pPr>
+        <w:jc w:val="center"/>
+        <w:rPr>
+          <w:lang w:val="es-EC"/>
+        </w:rPr>
+      </w:pPr>
+      <w:r>
+        <w:rPr>
+          <w:lang w:val="es-EC"/>
+        </w:rPr>
+        <w:drawing>
+          <wp:inline distT="0" distB="0" distL="0" distR="0" wp14:anchorId="56B0539E" wp14:editId="55779AFE">
+            <wp:extent cx="5400040" cy="2535555"/>
+            <wp:effectExtent l="0" t="0" r="0" b="0"/>
+            <wp:docPr id="10" name="Imagen 10"/>
+            <wp:cNvGraphicFramePr>
+              <a:graphicFrameLocks xmlns:a="http://schemas.openxmlformats.org/drawingml/2006/main" noChangeAspect="1"/>
+            </wp:cNvGraphicFramePr>
+            <a:graphic xmlns:a="http://schemas.openxmlformats.org/drawingml/2006/main">
+              <a:graphicData uri="http://schemas.openxmlformats.org/drawingml/2006/picture">
+                <pic:pic xmlns:pic="http://schemas.openxmlformats.org/drawingml/2006/picture">
+                  <pic:nvPicPr>
+                    <pic:cNvPr id="1" name=""/>
+                    <pic:cNvPicPr/>
+                  </pic:nvPicPr>
+                  <pic:blipFill>
+                    <a:blip r:embed="rId17"/>
+                    <a:stretch>
+                      <a:fillRect/>
+                    </a:stretch>
+                  </pic:blipFill>
+                  <pic:spPr>
+                    <a:xfrm>
+                      <a:off x="0" y="0"/>
+                      <a:ext cx="5400040" cy="2535555"/>
+                    </a:xfrm>
+                    <a:prstGeom prst="rect">
+                      <a:avLst/>
+                    </a:prstGeom>
+                  </pic:spPr>
+                </pic:pic>
+              </a:graphicData>
+            </a:graphic>
+          </wp:inline>
+        </w:drawing>
+      </w:r>
+    </w:p>
+    <w:p>
+      <w:pPr>
+        <w:jc w:val="center"/>
+        <w:rPr>
+          <w:lang w:val="es-EC"/>
+        </w:rPr>
+      </w:pPr>
+      <w:r>
+        <w:rPr>
+          <w:lang w:val="es-EC"/>
+        </w:rPr>
+        <w:lastRenderedPageBreak/>
+        <w:drawing>
+          <wp:inline distT="0" distB="0" distL="0" distR="0" wp14:anchorId="6A659F92" wp14:editId="205D9645">
+            <wp:extent cx="5400040" cy="2510790"/>
+            <wp:effectExtent l="0" t="0" r="0" b="3810"/>
+            <wp:docPr id="11" name="Imagen 11"/>
+            <wp:cNvGraphicFramePr>
+              <a:graphicFrameLocks xmlns:a="http://schemas.openxmlformats.org/drawingml/2006/main" noChangeAspect="1"/>
+            </wp:cNvGraphicFramePr>
+            <a:graphic xmlns:a="http://schemas.openxmlformats.org/drawingml/2006/main">
+              <a:graphicData uri="http://schemas.openxmlformats.org/drawingml/2006/picture">
+                <pic:pic xmlns:pic="http://schemas.openxmlformats.org/drawingml/2006/picture">
+                  <pic:nvPicPr>
+                    <pic:cNvPr id="1" name=""/>
+                    <pic:cNvPicPr/>
+                  </pic:nvPicPr>
+                  <pic:blipFill>
+                    <a:blip r:embed="rId18"/>
+                    <a:stretch>
+                      <a:fillRect/>
+                    </a:stretch>
+                  </pic:blipFill>
+                  <pic:spPr>
+                    <a:xfrm>
+                      <a:off x="0" y="0"/>
+                      <a:ext cx="5400040" cy="2510790"/>
+                    </a:xfrm>
+                    <a:prstGeom prst="rect">
+                      <a:avLst/>
+                    </a:prstGeom>
+                  </pic:spPr>
+                </pic:pic>
+              </a:graphicData>
+            </a:graphic>
+          </wp:inline>
+        </w:drawing>
+      </w:r>
+    </w:p>
+    <w:p>
+      <w:pPr>
+        <w:jc w:val="center"/>
+        <w:rPr>
+          <w:lang w:val="es-EC"/>
+        </w:rPr>
+      </w:pPr>
+      <w:r>
+        <w:rPr>
+          <w:lang w:val="es-EC"/>
+        </w:rPr>
+        <w:drawing>
+          <wp:inline distT="0" distB="0" distL="0" distR="0" wp14:anchorId="274D9024" wp14:editId="6DDD51AA">
+            <wp:extent cx="5400040" cy="2423160"/>
+            <wp:effectExtent l="0" t="0" r="0" b="0"/>
+            <wp:docPr id="12" name="Imagen 12"/>
+            <wp:cNvGraphicFramePr>
+              <a:graphicFrameLocks xmlns:a="http://schemas.openxmlformats.org/drawingml/2006/main" noChangeAspect="1"/>
+            </wp:cNvGraphicFramePr>
+            <a:graphic xmlns:a="http://schemas.openxmlformats.org/drawingml/2006/main">
+              <a:graphicData uri="http://schemas.openxmlformats.org/drawingml/2006/picture">
+                <pic:pic xmlns:pic="http://schemas.openxmlformats.org/drawingml/2006/picture">
+                  <pic:nvPicPr>
+                    <pic:cNvPr id="1" name=""/>
+                    <pic:cNvPicPr/>
+                  </pic:nvPicPr>
+                  <pic:blipFill>
+                    <a:blip r:embed="rId19"/>
+                    <a:stretch>
+                      <a:fillRect/>
+                    </a:stretch>
+                  </pic:blipFill>
+                  <pic:spPr>
+                    <a:xfrm>
+                      <a:off x="0" y="0"/>
+                      <a:ext cx="5400040" cy="2423160"/>
+                    </a:xfrm>
+                    <a:prstGeom prst="rect">
+                      <a:avLst/>
+                    </a:prstGeom>
+                  </pic:spPr>
+                </pic:pic>
+              </a:graphicData>
+            </a:graphic>
+          </wp:inline>
+        </w:drawing>
+      </w:r>
+    </w:p>
+    <w:p>
+      <w:pPr>
+        <w:jc w:val="center"/>
+        <w:rPr>
+          <w:lang w:val="es-EC"/>
+        </w:rPr>
+      </w:pPr>
+      <w:r>
+        <w:rPr>
+          <w:lang w:val="es-EC"/>
+        </w:rPr>
+        <w:lastRenderedPageBreak/>
+        <w:drawing>
+          <wp:inline distT="0" distB="0" distL="0" distR="0" wp14:anchorId="7D5A7DE4" wp14:editId="196347FC">
+            <wp:extent cx="5400040" cy="2585085"/>
+            <wp:effectExtent l="0" t="0" r="0" b="5715"/>
+            <wp:docPr id="13" name="Imagen 13"/>
+            <wp:cNvGraphicFramePr>
+              <a:graphicFrameLocks xmlns:a="http://schemas.openxmlformats.org/drawingml/2006/main" noChangeAspect="1"/>
+            </wp:cNvGraphicFramePr>
+            <a:graphic xmlns:a="http://schemas.openxmlformats.org/drawingml/2006/main">
+              <a:graphicData uri="http://schemas.openxmlformats.org/drawingml/2006/picture">
+                <pic:pic xmlns:pic="http://schemas.openxmlformats.org/drawingml/2006/picture">
+                  <pic:nvPicPr>
+                    <pic:cNvPr id="1" name=""/>
+                    <pic:cNvPicPr/>
+                  </pic:nvPicPr>
+                  <pic:blipFill>
+                    <a:blip r:embed="rId20"/>
+                    <a:stretch>
+                      <a:fillRect/>
+                    </a:stretch>
+                  </pic:blipFill>
+                  <pic:spPr>
+                    <a:xfrm>
+                      <a:off x="0" y="0"/>
+                      <a:ext cx="5400040" cy="2585085"/>
+                    </a:xfrm>
+                    <a:prstGeom prst="rect">
+                      <a:avLst/>
+                    </a:prstGeom>
+                  </pic:spPr>
+                </pic:pic>
+              </a:graphicData>
+            </a:graphic>
+          </wp:inline>
+        </w:drawing>
+      </w:r>
+      <w:r>
+        <w:rPr>
+          <w:noProof/>
+        </w:rPr>
+        <w:t xml:space="preserve"> </w:t>
+      </w:r>
+      <w:r>
+        <w:rPr>
+          <w:lang w:val="es-EC"/>
+        </w:rPr>
+        <w:drawing>
+          <wp:inline distT="0" distB="0" distL="0" distR="0" wp14:anchorId="3FB329A4" wp14:editId="2D7F46D7">
+            <wp:extent cx="5400040" cy="2425065"/>
+            <wp:effectExtent l="0" t="0" r="0" b="0"/>
+            <wp:docPr id="14" name="Imagen 14"/>
+            <wp:cNvGraphicFramePr>
+              <a:graphicFrameLocks xmlns:a="http://schemas.openxmlformats.org/drawingml/2006/main" noChangeAspect="1"/>
+            </wp:cNvGraphicFramePr>
+            <a:graphic xmlns:a="http://schemas.openxmlformats.org/drawingml/2006/main">
+              <a:graphicData uri="http://schemas.openxmlformats.org/drawingml/2006/picture">
+                <pic:pic xmlns:pic="http://schemas.openxmlformats.org/drawingml/2006/picture">
+                  <pic:nvPicPr>
+                    <pic:cNvPr id="1" name=""/>
+                    <pic:cNvPicPr/>
+                  </pic:nvPicPr>
+                  <pic:blipFill>
+                    <a:blip r:embed="rId21"/>
+                    <a:stretch>
+                      <a:fillRect/>
+                    </a:stretch>
+                  </pic:blipFill>
+                  <pic:spPr>
+                    <a:xfrm>
+                      <a:off x="0" y="0"/>
+                      <a:ext cx="5400040" cy="2425065"/>
+                    </a:xfrm>
+                    <a:prstGeom prst="rect">
+                      <a:avLst/>
+                    </a:prstGeom>
+                  </pic:spPr>
+                </pic:pic>
+              </a:graphicData>
+            </a:graphic>
+          </wp:inline>
+        </w:drawing>
+      </w:r>
+      <w:r>
+        <w:rPr>
+          <w:noProof/>
+        </w:rPr>
+        <w:t xml:space="preserve"> </w:t>
+      </w:r>
+      <w:r>
+        <w:rPr>
+          <w:noProof/>
+        </w:rPr>
+        <w:drawing>
+          <wp:inline distT="0" distB="0" distL="0" distR="0" wp14:anchorId="50751025" wp14:editId="2590F469">
+            <wp:extent cx="5400040" cy="2997835"/>
+            <wp:effectExtent l="0" t="0" r="0" b="0"/>
+            <wp:docPr id="15" name="Imagen 15"/>
+            <wp:cNvGraphicFramePr>
+              <a:graphicFrameLocks xmlns:a="http://schemas.openxmlformats.org/drawingml/2006/main" noChangeAspect="1"/>
+            </wp:cNvGraphicFramePr>
+            <a:graphic xmlns:a="http://schemas.openxmlformats.org/drawingml/2006/main">
+              <a:graphicData uri="http://schemas.openxmlformats.org/drawingml/2006/picture">
+                <pic:pic xmlns:pic="http://schemas.openxmlformats.org/drawingml/2006/picture">
+                  <pic:nvPicPr>
+                    <pic:cNvPr id="1" name=""/>
+                    <pic:cNvPicPr/>
+                  </pic:nvPicPr>
+                  <pic:blipFill>
+                    <a:blip r:embed="rId22"/>
+                    <a:stretch>
+                      <a:fillRect/>
+                    </a:stretch>
+                  </pic:blipFill>
+                  <pic:spPr>
+                    <a:xfrm>
+                      <a:off x="0" y="0"/>
+                      <a:ext cx="5400040" cy="2997835"/>
+                    </a:xfrm>
+                    <a:prstGeom prst="rect">
+                      <a:avLst/>
+                    </a:prstGeom>
+                  </pic:spPr>
+                </pic:pic>
+              </a:graphicData>
+            </a:graphic>
+          </wp:inline>
+        </w:drawing>
+      </w:r>
+      <w:r>
+        <w:rPr>
+          <w:noProof/>
+        </w:rPr>
+        <w:t xml:space="preserve"> </w:t>
+      </w:r>
+      <w:r>
+        <w:rPr>
+          <w:noProof/>
+        </w:rPr>
+        <w:lastRenderedPageBreak/>
+        <w:drawing>
+          <wp:inline distT="0" distB="0" distL="0" distR="0" wp14:anchorId="65AB8EDA" wp14:editId="335A827B">
+            <wp:extent cx="5400040" cy="2491740"/>
+            <wp:effectExtent l="0" t="0" r="0" b="3810"/>
+            <wp:docPr id="16" name="Imagen 16"/>
+            <wp:cNvGraphicFramePr>
+              <a:graphicFrameLocks xmlns:a="http://schemas.openxmlformats.org/drawingml/2006/main" noChangeAspect="1"/>
+            </wp:cNvGraphicFramePr>
+            <a:graphic xmlns:a="http://schemas.openxmlformats.org/drawingml/2006/main">
+              <a:graphicData uri="http://schemas.openxmlformats.org/drawingml/2006/picture">
+                <pic:pic xmlns:pic="http://schemas.openxmlformats.org/drawingml/2006/picture">
+                  <pic:nvPicPr>
+                    <pic:cNvPr id="1" name=""/>
+                    <pic:cNvPicPr/>
+                  </pic:nvPicPr>
+                  <pic:blipFill>
+                    <a:blip r:embed="rId23"/>
+                    <a:stretch>
+                      <a:fillRect/>
+                    </a:stretch>
+                  </pic:blipFill>
+                  <pic:spPr>
+                    <a:xfrm>
+                      <a:off x="0" y="0"/>
+                      <a:ext cx="5400040" cy="2491740"/>
+                    </a:xfrm>
+                    <a:prstGeom prst="rect">
+                      <a:avLst/>
+                    </a:prstGeom>
+                  </pic:spPr>
+                </pic:pic>
+              </a:graphicData>
+            </a:graphic>
+          </wp:inline>
+        </w:drawing>
+      </w:r>
+      <w:r>
+        <w:rPr>
+          <w:noProof/>
+        </w:rPr>
+        <w:t xml:space="preserve"> </w:t>
+      </w:r>
+      <w:r>
+        <w:rPr>
+          <w:noProof/>
+        </w:rPr>
+        <w:drawing>
+          <wp:inline distT="0" distB="0" distL="0" distR="0" wp14:anchorId="511FB16A" wp14:editId="3639C795">
+            <wp:extent cx="5400040" cy="2211705"/>
+            <wp:effectExtent l="0" t="0" r="0" b="0"/>
+            <wp:docPr id="17" name="Imagen 17"/>
+            <wp:cNvGraphicFramePr>
+              <a:graphicFrameLocks xmlns:a="http://schemas.openxmlformats.org/drawingml/2006/main" noChangeAspect="1"/>
+            </wp:cNvGraphicFramePr>
+            <a:graphic xmlns:a="http://schemas.openxmlformats.org/drawingml/2006/main">
+              <a:graphicData uri="http://schemas.openxmlformats.org/drawingml/2006/picture">
+                <pic:pic xmlns:pic="http://schemas.openxmlformats.org/drawingml/2006/picture">
+                  <pic:nvPicPr>
+                    <pic:cNvPr id="1" name=""/>
+                    <pic:cNvPicPr/>
+                  </pic:nvPicPr>
+                  <pic:blipFill>
+                    <a:blip r:embed="rId24"/>
+                    <a:stretch>
+                      <a:fillRect/>
+                    </a:stretch>
+                  </pic:blipFill>
+                  <pic:spPr>
+                    <a:xfrm>
+                      <a:off x="0" y="0"/>
+                      <a:ext cx="5400040" cy="2211705"/>
+                    </a:xfrm>
+                    <a:prstGeom prst="rect">
+                      <a:avLst/>
+                    </a:prstGeom>
+                  </pic:spPr>
+                </pic:pic>
+              </a:graphicData>
+            </a:graphic>
+          </wp:inline>
+        </w:drawing>
+      </w:r>
+      <w:r>
+        <w:rPr>
+          <w:noProof/>
+        </w:rPr>
+        <w:t xml:space="preserve"> </w:t>
+      </w:r>
+      <w:r>
+        <w:rPr>
+          <w:noProof/>
+        </w:rPr>
+        <w:drawing>
+          <wp:inline distT="0" distB="0" distL="0" distR="0" wp14:anchorId="5B90E91D" wp14:editId="33E862DB">
+            <wp:extent cx="5400040" cy="2049145"/>
+            <wp:effectExtent l="0" t="0" r="0" b="8255"/>
+            <wp:docPr id="18" name="Imagen 18"/>
+            <wp:cNvGraphicFramePr>
+              <a:graphicFrameLocks xmlns:a="http://schemas.openxmlformats.org/drawingml/2006/main" noChangeAspect="1"/>
+            </wp:cNvGraphicFramePr>
+            <a:graphic xmlns:a="http://schemas.openxmlformats.org/drawingml/2006/main">
+              <a:graphicData uri="http://schemas.openxmlformats.org/drawingml/2006/picture">
+                <pic:pic xmlns:pic="http://schemas.openxmlformats.org/drawingml/2006/picture">
+                  <pic:nvPicPr>
+                    <pic:cNvPr id="1" name=""/>
+                    <pic:cNvPicPr/>
+                  </pic:nvPicPr>
+                  <pic:blipFill>
+                    <a:blip r:embed="rId25"/>
+                    <a:stretch>
+                      <a:fillRect/>
+                    </a:stretch>
+                  </pic:blipFill>
+                  <pic:spPr>
+                    <a:xfrm>
+                      <a:off x="0" y="0"/>
+                      <a:ext cx="5400040" cy="2049145"/>
+                    </a:xfrm>
+                    <a:prstGeom prst="rect">
+                      <a:avLst/>
+                    </a:prstGeom>
+                  </pic:spPr>
+                </pic:pic>
+              </a:graphicData>
+            </a:graphic>
+          </wp:inline>
+        </w:drawing>
+      </w:r>
+    </w:p>
+    <w:p>
+      <w:pPr>
+        <w:pStyle w:val="Ttulo1"/>
+        <w:rPr>
+          <w:lang w:val="es-EC"/>
+        </w:rPr>
+      </w:pPr>
+      <w:bookmarkStart w:id="20" w:name="_Toc243674514"/>
       <w:r>
         <w:rPr>
           <w:lang w:val="es-EC"/>
         </w:rPr>
         <w:t>Bibliografía</w:t>
       </w:r>
-      <w:bookmarkEnd w:id="18"/>
+      <w:bookmarkEnd w:id="20"/>
     </w:p>
     <w:p>
       <w:pPr>
@@ -6794,23 +7425,14 @@
         </w:rPr>
         <w:t xml:space="preserve">HTML5 UP. (s. f.). </w:t>
       </w:r>
-      <w:proofErr w:type="spellStart"/>
       <w:r>
         <w:rPr>
           <w:rFonts w:ascii="Cambria" w:hAnsi="Cambria"/>
           <w:lang w:val="en-US"/>
         </w:rPr>
-        <w:t>ZeroFour</w:t>
-      </w:r>
-      <w:proofErr w:type="spellEnd"/>
-      <w:r>
-        <w:rPr>
-          <w:rFonts w:ascii="Cambria" w:hAnsi="Cambria"/>
-          <w:lang w:val="en-US"/>
-        </w:rPr>
-        <w:t xml:space="preserve">. </w:t>
-      </w:r>
-      <w:hyperlink r:id="rId17" w:history="1">
+        <w:t xml:space="preserve">ZeroFour. </w:t>
+      </w:r>
+      <w:hyperlink r:id="rId26" w:history="1">
         <w:r>
           <w:rPr>
             <w:rStyle w:val="Hipervnculo"/>
@@ -6839,7 +7461,7 @@
         </w:rPr>
         <w:t xml:space="preserve">HTML5 UP. (s. f.). Alpha. </w:t>
       </w:r>
-      <w:hyperlink r:id="rId18" w:history="1">
+      <w:hyperlink r:id="rId27" w:history="1">
         <w:r>
           <w:rPr>
             <w:rStyle w:val="Hipervnculo"/>
@@ -6868,7 +7490,7 @@
         </w:rPr>
         <w:t xml:space="preserve">HTML5 UP. (s. f.). Prologue. </w:t>
       </w:r>
-      <w:hyperlink r:id="rId19" w:history="1">
+      <w:hyperlink r:id="rId28" w:history="1">
         <w:r>
           <w:rPr>
             <w:rStyle w:val="Hipervnculo"/>
@@ -6895,9 +7517,10 @@
           <w:rFonts w:ascii="Cambria" w:hAnsi="Cambria"/>
           <w:lang w:val="en-US"/>
         </w:rPr>
+        <w:lastRenderedPageBreak/>
         <w:t xml:space="preserve">HTML5 UP. (s. f.). Responsive HTML5 and CSS3 site templates. </w:t>
       </w:r>
-      <w:hyperlink r:id="rId20" w:history="1">
+      <w:hyperlink r:id="rId29" w:history="1">
         <w:r>
           <w:rPr>
             <w:rStyle w:val="Hipervnculo"/>
@@ -6916,6 +7539,8 @@
         <w:spacing w:after="0"/>
         <w:rPr>
           <w:rFonts w:ascii="Cambria" w:hAnsi="Cambria"/>
+          <w:color w:val="0000FF" w:themeColor="hyperlink"/>
+          <w:u w:val="single"/>
           <w:lang w:val="en-US"/>
         </w:rPr>
       </w:pPr>
@@ -6926,7 +7551,7 @@
         </w:rPr>
         <w:t xml:space="preserve">GitHub Docs. (s. f.). GitHub Pages. </w:t>
       </w:r>
-      <w:hyperlink r:id="rId21" w:history="1">
+      <w:hyperlink r:id="rId30" w:history="1">
         <w:r>
           <w:rPr>
             <w:rStyle w:val="Hipervnculo"/>
@@ -6945,9 +7570,26 @@
         <w:spacing w:after="0"/>
         <w:rPr>
           <w:rFonts w:ascii="Cambria" w:hAnsi="Cambria"/>
-          <w:lang w:val="en-US"/>
-        </w:rPr>
-      </w:pPr>
+          <w:lang w:val="es-MX"/>
+        </w:rPr>
+      </w:pPr>
+      <w:r>
+        <w:rPr>
+          <w:rFonts w:ascii="Cambria" w:hAnsi="Cambria"/>
+          <w:lang w:val="es-MX"/>
+        </w:rPr>
+        <w:t xml:space="preserve">ESPOL. (2026). Julio 2026: ESPOL y Segura EP llevan la cultura y espacios de encuentro al Cerro del Carmen. </w:t>
+      </w:r>
+      <w:hyperlink r:id="rId31" w:history="1">
+        <w:r>
+          <w:rPr>
+            <w:rStyle w:val="Hipervnculo"/>
+            <w:rFonts w:ascii="Cambria" w:hAnsi="Cambria"/>
+            <w:lang w:val="es-MX"/>
+          </w:rPr>
+          <w:t>https://www.espol.edu.ec/enunminuto/julio-2026</w:t>
+        </w:r>
+      </w:hyperlink>
     </w:p>
     <w:p>
       <w:pPr>
@@ -6957,6 +7599,47 @@
         <w:spacing w:after="0"/>
         <w:rPr>
           <w:rFonts w:ascii="Cambria" w:hAnsi="Cambria"/>
+          <w:lang w:val="es-MX"/>
+        </w:rPr>
+      </w:pPr>
+      <w:r>
+        <w:rPr>
+          <w:rFonts w:ascii="Cambria" w:hAnsi="Cambria"/>
+          <w:lang w:val="es-MX"/>
+        </w:rPr>
+        <w:t xml:space="preserve">ESPOL. (s. f.). Distrito 100. </w:t>
+      </w:r>
+      <w:hyperlink r:id="rId32" w:history="1">
+        <w:r>
+          <w:rPr>
+            <w:rStyle w:val="Hipervnculo"/>
+            <w:rFonts w:ascii="Cambria" w:hAnsi="Cambria"/>
+            <w:lang w:val="es-MX"/>
+          </w:rPr>
+          <w:t>https://www.d100.espol.edu.ec/</w:t>
+        </w:r>
+      </w:hyperlink>
+    </w:p>
+    <w:p>
+      <w:pPr>
+        <w:tabs>
+          <w:tab w:val="left" w:pos="3267"/>
+        </w:tabs>
+        <w:spacing w:after="0"/>
+        <w:rPr>
+          <w:rFonts w:ascii="Cambria" w:hAnsi="Cambria"/>
+          <w:lang w:val="es-MX"/>
+        </w:rPr>
+      </w:pPr>
+    </w:p>
+    <w:p>
+      <w:pPr>
+        <w:tabs>
+          <w:tab w:val="left" w:pos="3267"/>
+        </w:tabs>
+        <w:spacing w:after="0"/>
+        <w:rPr>
+          <w:rFonts w:ascii="Cambria" w:hAnsi="Cambria"/>
           <w:lang w:val="es-EC"/>
         </w:rPr>
       </w:pPr>
@@ -6969,7 +7652,7 @@
       </w:r>
     </w:p>
     <w:sectPr>
-      <w:headerReference w:type="default" r:id="rId22"/>
+      <w:headerReference w:type="default" r:id="rId33"/>
       <w:pgSz w:w="11906" w:h="16838"/>
       <w:pgMar w:top="2650" w:right="1701" w:bottom="1417" w:left="1701" w:header="708" w:footer="708" w:gutter="0"/>
       <w:pgNumType w:start="0"/>
@@ -6982,7 +7665,7 @@
 </file>
 
 <file path=word/endnotes.xml><?xml version="1.0" encoding="utf-8"?>
-<w:endnotes xmlns:wpc="http://schemas.microsoft.com/office/word/2010/wordprocessingCanvas" xmlns:cx="http://schemas.microsoft.com/office/drawing/2014/chartex" xmlns:cx1="http://schemas.microsoft.com/office/drawing/2015/9/8/chartex" xmlns:cx2="http://schemas.microsoft.com/office/drawing/2015/10/21/chartex" xmlns:cx3="http://schemas.microsoft.com/office/drawing/2016/5/9/chartex" xmlns:cx4="http://schemas.microsoft.com/office/drawing/2016/5/10/chartex" xmlns:cx5="http://schemas.microsoft.com/office/drawing/2016/5/11/chartex" xmlns:cx6="http://schemas.microsoft.com/office/drawing/2016/5/12/chartex" xmlns:cx7="http://schemas.microsoft.com/office/drawing/2016/5/13/chartex" xmlns:cx8="http://schemas.microsoft.com/office/drawing/2016/5/14/chartex" xmlns:mc="http://schemas.openxmlformats.org/markup-compatibility/2006" xmlns:aink="http://schemas.microsoft.com/office/drawing/2016/ink" xmlns:am3d="http://schemas.microsoft.com/office/drawing/2017/model3d" xmlns:o="urn:schemas-microsoft-com:office:office" xmlns:oel="http://schemas.microsoft.com/office/2019/extlst" xmlns:r="http://schemas.openxmlformats.org/officeDocument/2006/relationships" xmlns:m="http://schemas.openxmlformats.org/officeDocument/2006/math" xmlns:v="urn:schemas-microsoft-com:vml" xmlns:wp14="http://schemas.microsoft.com/office/word/2010/wordprocessingDrawing" xmlns:wp="http://schemas.openxmlformats.org/drawingml/2006/wordprocessingDrawing" xmlns:w10="urn:schemas-microsoft-com:office:word" xmlns:w="http://schemas.openxmlformats.org/wordprocessingml/2006/main" xmlns:w14="http://schemas.microsoft.com/office/word/2010/wordml" xmlns:w15="http://schemas.microsoft.com/office/word/2012/wordml" xmlns:w16cex="http://schemas.microsoft.com/office/word/2018/wordml/cex" xmlns:w16cid="http://schemas.microsoft.com/office/word/2016/wordml/cid" xmlns:w16="http://schemas.microsoft.com/office/word/2018/wordml" xmlns:w16du="http://schemas.microsoft.com/office/word/2023/wordml/word16du" xmlns:w16sdtdh="http://schemas.microsoft.com/office/word/2020/wordml/sdtdatahash" xmlns:w16sdtfl="http://schemas.microsoft.com/office/word/2024/wordml/sdtformatlock" xmlns:w16se="http://schemas.microsoft.com/office/word/2015/wordml/symex" xmlns:wpg="http://schemas.microsoft.com/office/word/2010/wordprocessingGroup" xmlns:wpi="http://schemas.microsoft.com/office/word/2010/wordprocessingInk" xmlns:wne="http://schemas.microsoft.com/office/word/2006/wordml" xmlns:wps="http://schemas.microsoft.com/office/word/2010/wordprocessingShape" mc:Ignorable="w14 w15 w16se w16cid w16 w16cex w16sdtdh w16sdtfl w16du wp14">
+<w:endnotes xmlns:wpc="http://schemas.microsoft.com/office/word/2010/wordprocessingCanvas" xmlns:cx="http://schemas.microsoft.com/office/drawing/2014/chartex" xmlns:cx1="http://schemas.microsoft.com/office/drawing/2015/9/8/chartex" xmlns:cx2="http://schemas.microsoft.com/office/drawing/2015/10/21/chartex" xmlns:cx3="http://schemas.microsoft.com/office/drawing/2016/5/9/chartex" xmlns:cx4="http://schemas.microsoft.com/office/drawing/2016/5/10/chartex" xmlns:cx5="http://schemas.microsoft.com/office/drawing/2016/5/11/chartex" xmlns:cx6="http://schemas.microsoft.com/office/drawing/2016/5/12/chartex" xmlns:cx7="http://schemas.microsoft.com/office/drawing/2016/5/13/chartex" xmlns:cx8="http://schemas.microsoft.com/office/drawing/2016/5/14/chartex" xmlns:mc="http://schemas.openxmlformats.org/markup-compatibility/2006" xmlns:aink="http://schemas.microsoft.com/office/drawing/2016/ink" xmlns:am3d="http://schemas.microsoft.com/office/drawing/2017/model3d" xmlns:o="urn:schemas-microsoft-com:office:office" xmlns:r="http://schemas.openxmlformats.org/officeDocument/2006/relationships" xmlns:m="http://schemas.openxmlformats.org/officeDocument/2006/math" xmlns:v="urn:schemas-microsoft-com:vml" xmlns:wp14="http://schemas.microsoft.com/office/word/2010/wordprocessingDrawing" xmlns:wp="http://schemas.openxmlformats.org/drawingml/2006/wordprocessingDrawing" xmlns:w10="urn:schemas-microsoft-com:office:word" xmlns:w="http://schemas.openxmlformats.org/wordprocessingml/2006/main" xmlns:w14="http://schemas.microsoft.com/office/word/2010/wordml" xmlns:w15="http://schemas.microsoft.com/office/word/2012/wordml" xmlns:w16cex="http://schemas.microsoft.com/office/word/2018/wordml/cex" xmlns:w16cid="http://schemas.microsoft.com/office/word/2016/wordml/cid" xmlns:w16="http://schemas.microsoft.com/office/word/2018/wordml" xmlns:w16sdtdh="http://schemas.microsoft.com/office/word/2020/wordml/sdtdatahash" xmlns:w16se="http://schemas.microsoft.com/office/word/2015/wordml/symex" xmlns:wpg="http://schemas.microsoft.com/office/word/2010/wordprocessingGroup" xmlns:wpi="http://schemas.microsoft.com/office/word/2010/wordprocessingInk" xmlns:wne="http://schemas.microsoft.com/office/word/2006/wordml" xmlns:wps="http://schemas.microsoft.com/office/word/2010/wordprocessingShape" mc:Ignorable="w14 w15 w16se w16cid w16 w16cex w16sdtdh wp14">
   <w:endnote w:type="separator" w:id="-1">
     <w:p>
       <w:pPr>
@@ -7007,7 +7690,7 @@
 </file>
 
 <file path=word/footnotes.xml><?xml version="1.0" encoding="utf-8"?>
-<w:footnotes xmlns:wpc="http://schemas.microsoft.com/office/word/2010/wordprocessingCanvas" xmlns:cx="http://schemas.microsoft.com/office/drawing/2014/chartex" xmlns:cx1="http://schemas.microsoft.com/office/drawing/2015/9/8/chartex" xmlns:cx2="http://schemas.microsoft.com/office/drawing/2015/10/21/chartex" xmlns:cx3="http://schemas.microsoft.com/office/drawing/2016/5/9/chartex" xmlns:cx4="http://schemas.microsoft.com/office/drawing/2016/5/10/chartex" xmlns:cx5="http://schemas.microsoft.com/office/drawing/2016/5/11/chartex" xmlns:cx6="http://schemas.microsoft.com/office/drawing/2016/5/12/chartex" xmlns:cx7="http://schemas.microsoft.com/office/drawing/2016/5/13/chartex" xmlns:cx8="http://schemas.microsoft.com/office/drawing/2016/5/14/chartex" xmlns:mc="http://schemas.openxmlformats.org/markup-compatibility/2006" xmlns:aink="http://schemas.microsoft.com/office/drawing/2016/ink" xmlns:am3d="http://schemas.microsoft.com/office/drawing/2017/model3d" xmlns:o="urn:schemas-microsoft-com:office:office" xmlns:oel="http://schemas.microsoft.com/office/2019/extlst" xmlns:r="http://schemas.openxmlformats.org/officeDocument/2006/relationships" xmlns:m="http://schemas.openxmlformats.org/officeDocument/2006/math" xmlns:v="urn:schemas-microsoft-com:vml" xmlns:wp14="http://schemas.microsoft.com/office/word/2010/wordprocessingDrawing" xmlns:wp="http://schemas.openxmlformats.org/drawingml/2006/wordprocessingDrawing" xmlns:w10="urn:schemas-microsoft-com:office:word" xmlns:w="http://schemas.openxmlformats.org/wordprocessingml/2006/main" xmlns:w14="http://schemas.microsoft.com/office/word/2010/wordml" xmlns:w15="http://schemas.microsoft.com/office/word/2012/wordml" xmlns:w16cex="http://schemas.microsoft.com/office/word/2018/wordml/cex" xmlns:w16cid="http://schemas.microsoft.com/office/word/2016/wordml/cid" xmlns:w16="http://schemas.microsoft.com/office/word/2018/wordml" xmlns:w16du="http://schemas.microsoft.com/office/word/2023/wordml/word16du" xmlns:w16sdtdh="http://schemas.microsoft.com/office/word/2020/wordml/sdtdatahash" xmlns:w16sdtfl="http://schemas.microsoft.com/office/word/2024/wordml/sdtformatlock" xmlns:w16se="http://schemas.microsoft.com/office/word/2015/wordml/symex" xmlns:wpg="http://schemas.microsoft.com/office/word/2010/wordprocessingGroup" xmlns:wpi="http://schemas.microsoft.com/office/word/2010/wordprocessingInk" xmlns:wne="http://schemas.microsoft.com/office/word/2006/wordml" xmlns:wps="http://schemas.microsoft.com/office/word/2010/wordprocessingShape" mc:Ignorable="w14 w15 w16se w16cid w16 w16cex w16sdtdh w16sdtfl w16du wp14">
+<w:footnotes xmlns:wpc="http://schemas.microsoft.com/office/word/2010/wordprocessingCanvas" xmlns:cx="http://schemas.microsoft.com/office/drawing/2014/chartex" xmlns:cx1="http://schemas.microsoft.com/office/drawing/2015/9/8/chartex" xmlns:cx2="http://schemas.microsoft.com/office/drawing/2015/10/21/chartex" xmlns:cx3="http://schemas.microsoft.com/office/drawing/2016/5/9/chartex" xmlns:cx4="http://schemas.microsoft.com/office/drawing/2016/5/10/chartex" xmlns:cx5="http://schemas.microsoft.com/office/drawing/2016/5/11/chartex" xmlns:cx6="http://schemas.microsoft.com/office/drawing/2016/5/12/chartex" xmlns:cx7="http://schemas.microsoft.com/office/drawing/2016/5/13/chartex" xmlns:cx8="http://schemas.microsoft.com/office/drawing/2016/5/14/chartex" xmlns:mc="http://schemas.openxmlformats.org/markup-compatibility/2006" xmlns:aink="http://schemas.microsoft.com/office/drawing/2016/ink" xmlns:am3d="http://schemas.microsoft.com/office/drawing/2017/model3d" xmlns:o="urn:schemas-microsoft-com:office:office" xmlns:r="http://schemas.openxmlformats.org/officeDocument/2006/relationships" xmlns:m="http://schemas.openxmlformats.org/officeDocument/2006/math" xmlns:v="urn:schemas-microsoft-com:vml" xmlns:wp14="http://schemas.microsoft.com/office/word/2010/wordprocessingDrawing" xmlns:wp="http://schemas.openxmlformats.org/drawingml/2006/wordprocessingDrawing" xmlns:w10="urn:schemas-microsoft-com:office:word" xmlns:w="http://schemas.openxmlformats.org/wordprocessingml/2006/main" xmlns:w14="http://schemas.microsoft.com/office/word/2010/wordml" xmlns:w15="http://schemas.microsoft.com/office/word/2012/wordml" xmlns:w16cex="http://schemas.microsoft.com/office/word/2018/wordml/cex" xmlns:w16cid="http://schemas.microsoft.com/office/word/2016/wordml/cid" xmlns:w16="http://schemas.microsoft.com/office/word/2018/wordml" xmlns:w16sdtdh="http://schemas.microsoft.com/office/word/2020/wordml/sdtdatahash" xmlns:w16se="http://schemas.microsoft.com/office/word/2015/wordml/symex" xmlns:wpg="http://schemas.microsoft.com/office/word/2010/wordprocessingGroup" xmlns:wpi="http://schemas.microsoft.com/office/word/2010/wordprocessingInk" xmlns:wne="http://schemas.microsoft.com/office/word/2006/wordml" xmlns:wps="http://schemas.microsoft.com/office/word/2010/wordprocessingShape" mc:Ignorable="w14 w15 w16se w16cid w16 w16cex w16sdtdh wp14">
   <w:footnote w:type="separator" w:id="-1">
     <w:p>
       <w:pPr>
@@ -7032,7 +7715,7 @@
 </file>
 
 <file path=word/header1.xml><?xml version="1.0" encoding="utf-8"?>
-<w:hdr xmlns:wpc="http://schemas.microsoft.com/office/word/2010/wordprocessingCanvas" xmlns:cx="http://schemas.microsoft.com/office/drawing/2014/chartex" xmlns:cx1="http://schemas.microsoft.com/office/drawing/2015/9/8/chartex" xmlns:cx2="http://schemas.microsoft.com/office/drawing/2015/10/21/chartex" xmlns:cx3="http://schemas.microsoft.com/office/drawing/2016/5/9/chartex" xmlns:cx4="http://schemas.microsoft.com/office/drawing/2016/5/10/chartex" xmlns:cx5="http://schemas.microsoft.com/office/drawing/2016/5/11/chartex" xmlns:cx6="http://schemas.microsoft.com/office/drawing/2016/5/12/chartex" xmlns:cx7="http://schemas.microsoft.com/office/drawing/2016/5/13/chartex" xmlns:cx8="http://schemas.microsoft.com/office/drawing/2016/5/14/chartex" xmlns:mc="http://schemas.openxmlformats.org/markup-compatibility/2006" xmlns:aink="http://schemas.microsoft.com/office/drawing/2016/ink" xmlns:am3d="http://schemas.microsoft.com/office/drawing/2017/model3d" xmlns:o="urn:schemas-microsoft-com:office:office" xmlns:oel="http://schemas.microsoft.com/office/2019/extlst" xmlns:r="http://schemas.openxmlformats.org/officeDocument/2006/relationships" xmlns:m="http://schemas.openxmlformats.org/officeDocument/2006/math" xmlns:v="urn:schemas-microsoft-com:vml" xmlns:wp14="http://schemas.microsoft.com/office/word/2010/wordprocessingDrawing" xmlns:wp="http://schemas.openxmlformats.org/drawingml/2006/wordprocessingDrawing" xmlns:w10="urn:schemas-microsoft-com:office:word" xmlns:w="http://schemas.openxmlformats.org/wordprocessingml/2006/main" xmlns:w14="http://schemas.microsoft.com/office/word/2010/wordml" xmlns:w15="http://schemas.microsoft.com/office/word/2012/wordml" xmlns:w16cex="http://schemas.microsoft.com/office/word/2018/wordml/cex" xmlns:w16cid="http://schemas.microsoft.com/office/word/2016/wordml/cid" xmlns:w16="http://schemas.microsoft.com/office/word/2018/wordml" xmlns:w16du="http://schemas.microsoft.com/office/word/2023/wordml/word16du" xmlns:w16sdtdh="http://schemas.microsoft.com/office/word/2020/wordml/sdtdatahash" xmlns:w16sdtfl="http://schemas.microsoft.com/office/word/2024/wordml/sdtformatlock" xmlns:w16se="http://schemas.microsoft.com/office/word/2015/wordml/symex" xmlns:wpg="http://schemas.microsoft.com/office/word/2010/wordprocessingGroup" xmlns:wpi="http://schemas.microsoft.com/office/word/2010/wordprocessingInk" xmlns:wne="http://schemas.microsoft.com/office/word/2006/wordml" xmlns:wps="http://schemas.microsoft.com/office/word/2010/wordprocessingShape" mc:Ignorable="w14 w15 w16se w16cid w16 w16cex w16sdtdh w16sdtfl w16du wp14">
+<w:hdr xmlns:wpc="http://schemas.microsoft.com/office/word/2010/wordprocessingCanvas" xmlns:cx="http://schemas.microsoft.com/office/drawing/2014/chartex" xmlns:cx1="http://schemas.microsoft.com/office/drawing/2015/9/8/chartex" xmlns:cx2="http://schemas.microsoft.com/office/drawing/2015/10/21/chartex" xmlns:cx3="http://schemas.microsoft.com/office/drawing/2016/5/9/chartex" xmlns:cx4="http://schemas.microsoft.com/office/drawing/2016/5/10/chartex" xmlns:cx5="http://schemas.microsoft.com/office/drawing/2016/5/11/chartex" xmlns:cx6="http://schemas.microsoft.com/office/drawing/2016/5/12/chartex" xmlns:cx7="http://schemas.microsoft.com/office/drawing/2016/5/13/chartex" xmlns:cx8="http://schemas.microsoft.com/office/drawing/2016/5/14/chartex" xmlns:mc="http://schemas.openxmlformats.org/markup-compatibility/2006" xmlns:aink="http://schemas.microsoft.com/office/drawing/2016/ink" xmlns:am3d="http://schemas.microsoft.com/office/drawing/2017/model3d" xmlns:o="urn:schemas-microsoft-com:office:office" xmlns:r="http://schemas.openxmlformats.org/officeDocument/2006/relationships" xmlns:m="http://schemas.openxmlformats.org/officeDocument/2006/math" xmlns:v="urn:schemas-microsoft-com:vml" xmlns:wp14="http://schemas.microsoft.com/office/word/2010/wordprocessingDrawing" xmlns:wp="http://schemas.openxmlformats.org/drawingml/2006/wordprocessingDrawing" xmlns:w10="urn:schemas-microsoft-com:office:word" xmlns:w="http://schemas.openxmlformats.org/wordprocessingml/2006/main" xmlns:w14="http://schemas.microsoft.com/office/word/2010/wordml" xmlns:w15="http://schemas.microsoft.com/office/word/2012/wordml" xmlns:w16cex="http://schemas.microsoft.com/office/word/2018/wordml/cex" xmlns:w16cid="http://schemas.microsoft.com/office/word/2016/wordml/cid" xmlns:w16="http://schemas.microsoft.com/office/word/2018/wordml" xmlns:w16sdtdh="http://schemas.microsoft.com/office/word/2020/wordml/sdtdatahash" xmlns:w16se="http://schemas.microsoft.com/office/word/2015/wordml/symex" xmlns:wpg="http://schemas.microsoft.com/office/word/2010/wordprocessingGroup" xmlns:wpi="http://schemas.microsoft.com/office/word/2010/wordprocessingInk" xmlns:wne="http://schemas.microsoft.com/office/word/2006/wordml" xmlns:wps="http://schemas.microsoft.com/office/word/2010/wordprocessingShape" mc:Ignorable="w14 w15 w16se w16cid w16 w16cex w16sdtdh wp14">
   <w:p>
     <w:pPr>
       <w:pStyle w:val="Encabezado"/>
@@ -7060,7 +7743,7 @@
 </file>
 
 <file path=word/numbering.xml><?xml version="1.0" encoding="utf-8"?>
-<w:numbering xmlns:wpc="http://schemas.microsoft.com/office/word/2010/wordprocessingCanvas" xmlns:cx="http://schemas.microsoft.com/office/drawing/2014/chartex" xmlns:cx1="http://schemas.microsoft.com/office/drawing/2015/9/8/chartex" xmlns:cx2="http://schemas.microsoft.com/office/drawing/2015/10/21/chartex" xmlns:cx3="http://schemas.microsoft.com/office/drawing/2016/5/9/chartex" xmlns:cx4="http://schemas.microsoft.com/office/drawing/2016/5/10/chartex" xmlns:cx5="http://schemas.microsoft.com/office/drawing/2016/5/11/chartex" xmlns:cx6="http://schemas.microsoft.com/office/drawing/2016/5/12/chartex" xmlns:cx7="http://schemas.microsoft.com/office/drawing/2016/5/13/chartex" xmlns:cx8="http://schemas.microsoft.com/office/drawing/2016/5/14/chartex" xmlns:mc="http://schemas.openxmlformats.org/markup-compatibility/2006" xmlns:aink="http://schemas.microsoft.com/office/drawing/2016/ink" xmlns:am3d="http://schemas.microsoft.com/office/drawing/2017/model3d" xmlns:o="urn:schemas-microsoft-com:office:office" xmlns:oel="http://schemas.microsoft.com/office/2019/extlst" xmlns:r="http://schemas.openxmlformats.org/officeDocument/2006/relationships" xmlns:m="http://schemas.openxmlformats.org/officeDocument/2006/math" xmlns:v="urn:schemas-microsoft-com:vml" xmlns:wp14="http://schemas.microsoft.com/office/word/2010/wordprocessingDrawing" xmlns:wp="http://schemas.openxmlformats.org/drawingml/2006/wordprocessingDrawing" xmlns:w10="urn:schemas-microsoft-com:office:word" xmlns:w="http://schemas.openxmlformats.org/wordprocessingml/2006/main" xmlns:w14="http://schemas.microsoft.com/office/word/2010/wordml" xmlns:w15="http://schemas.microsoft.com/office/word/2012/wordml" xmlns:w16cex="http://schemas.microsoft.com/office/word/2018/wordml/cex" xmlns:w16cid="http://schemas.microsoft.com/office/word/2016/wordml/cid" xmlns:w16="http://schemas.microsoft.com/office/word/2018/wordml" xmlns:w16du="http://schemas.microsoft.com/office/word/2023/wordml/word16du" xmlns:w16sdtdh="http://schemas.microsoft.com/office/word/2020/wordml/sdtdatahash" xmlns:w16sdtfl="http://schemas.microsoft.com/office/word/2024/wordml/sdtformatlock" xmlns:w16se="http://schemas.microsoft.com/office/word/2015/wordml/symex" xmlns:wpg="http://schemas.microsoft.com/office/word/2010/wordprocessingGroup" xmlns:wpi="http://schemas.microsoft.com/office/word/2010/wordprocessingInk" xmlns:wne="http://schemas.microsoft.com/office/word/2006/wordml" xmlns:wps="http://schemas.microsoft.com/office/word/2010/wordprocessingShape" mc:Ignorable="w14 w15 w16se w16cid w16 w16cex w16sdtdh w16sdtfl w16du wp14">
+<w:numbering xmlns:wpc="http://schemas.microsoft.com/office/word/2010/wordprocessingCanvas" xmlns:cx="http://schemas.microsoft.com/office/drawing/2014/chartex" xmlns:cx1="http://schemas.microsoft.com/office/drawing/2015/9/8/chartex" xmlns:cx2="http://schemas.microsoft.com/office/drawing/2015/10/21/chartex" xmlns:cx3="http://schemas.microsoft.com/office/drawing/2016/5/9/chartex" xmlns:cx4="http://schemas.microsoft.com/office/drawing/2016/5/10/chartex" xmlns:cx5="http://schemas.microsoft.com/office/drawing/2016/5/11/chartex" xmlns:cx6="http://schemas.microsoft.com/office/drawing/2016/5/12/chartex" xmlns:cx7="http://schemas.microsoft.com/office/drawing/2016/5/13/chartex" xmlns:cx8="http://schemas.microsoft.com/office/drawing/2016/5/14/chartex" xmlns:mc="http://schemas.openxmlformats.org/markup-compatibility/2006" xmlns:aink="http://schemas.microsoft.com/office/drawing/2016/ink" xmlns:am3d="http://schemas.microsoft.com/office/drawing/2017/model3d" xmlns:o="urn:schemas-microsoft-com:office:office" xmlns:r="http://schemas.openxmlformats.org/officeDocument/2006/relationships" xmlns:m="http://schemas.openxmlformats.org/officeDocument/2006/math" xmlns:v="urn:schemas-microsoft-com:vml" xmlns:wp14="http://schemas.microsoft.com/office/word/2010/wordprocessingDrawing" xmlns:wp="http://schemas.openxmlformats.org/drawingml/2006/wordprocessingDrawing" xmlns:w10="urn:schemas-microsoft-com:office:word" xmlns:w="http://schemas.openxmlformats.org/wordprocessingml/2006/main" xmlns:w14="http://schemas.microsoft.com/office/word/2010/wordml" xmlns:w15="http://schemas.microsoft.com/office/word/2012/wordml" xmlns:w16cex="http://schemas.microsoft.com/office/word/2018/wordml/cex" xmlns:w16cid="http://schemas.microsoft.com/office/word/2016/wordml/cid" xmlns:w16="http://schemas.microsoft.com/office/word/2018/wordml" xmlns:w16sdtdh="http://schemas.microsoft.com/office/word/2020/wordml/sdtdatahash" xmlns:w16se="http://schemas.microsoft.com/office/word/2015/wordml/symex" xmlns:wpg="http://schemas.microsoft.com/office/word/2010/wordprocessingGroup" xmlns:wpi="http://schemas.microsoft.com/office/word/2010/wordprocessingInk" xmlns:wne="http://schemas.microsoft.com/office/word/2006/wordml" xmlns:wps="http://schemas.microsoft.com/office/word/2010/wordprocessingShape" mc:Ignorable="w14 w15 w16se w16cid w16 w16cex w16sdtdh wp14">
   <w:abstractNum w:abstractNumId="0" w15:restartNumberingAfterBreak="0">
     <w:nsid w:val="088D2FF6"/>
     <w:multiLevelType w:val="multilevel"/>
@@ -8857,53 +9540,53 @@
       </w:rPr>
     </w:lvl>
   </w:abstractNum>
-  <w:num w:numId="1" w16cid:durableId="1086730658">
+  <w:num w:numId="1">
     <w:abstractNumId w:val="1"/>
   </w:num>
-  <w:num w:numId="2" w16cid:durableId="296882468">
+  <w:num w:numId="2">
     <w:abstractNumId w:val="3"/>
   </w:num>
-  <w:num w:numId="3" w16cid:durableId="1858426933">
+  <w:num w:numId="3">
     <w:abstractNumId w:val="4"/>
   </w:num>
-  <w:num w:numId="4" w16cid:durableId="256402577">
+  <w:num w:numId="4">
     <w:abstractNumId w:val="0"/>
   </w:num>
-  <w:num w:numId="5" w16cid:durableId="1639216880">
+  <w:num w:numId="5">
     <w:abstractNumId w:val="5"/>
   </w:num>
-  <w:num w:numId="6" w16cid:durableId="863401729">
+  <w:num w:numId="6">
     <w:abstractNumId w:val="7"/>
   </w:num>
-  <w:num w:numId="7" w16cid:durableId="805663073">
+  <w:num w:numId="7">
     <w:abstractNumId w:val="9"/>
   </w:num>
-  <w:num w:numId="8" w16cid:durableId="40636739">
+  <w:num w:numId="8">
     <w:abstractNumId w:val="8"/>
   </w:num>
-  <w:num w:numId="9" w16cid:durableId="1431049003">
+  <w:num w:numId="9">
     <w:abstractNumId w:val="10"/>
   </w:num>
-  <w:num w:numId="10" w16cid:durableId="296297491">
+  <w:num w:numId="10">
     <w:abstractNumId w:val="13"/>
   </w:num>
-  <w:num w:numId="11" w16cid:durableId="13656735">
+  <w:num w:numId="11">
     <w:abstractNumId w:val="2"/>
   </w:num>
-  <w:num w:numId="12" w16cid:durableId="477573126">
+  <w:num w:numId="12">
     <w:abstractNumId w:val="11"/>
   </w:num>
-  <w:num w:numId="13" w16cid:durableId="199901872">
+  <w:num w:numId="13">
     <w:abstractNumId w:val="12"/>
   </w:num>
-  <w:num w:numId="14" w16cid:durableId="970088727">
+  <w:num w:numId="14">
     <w:abstractNumId w:val="6"/>
   </w:num>
 </w:numbering>
 </file>
 
 <file path=word/styles.xml><?xml version="1.0" encoding="utf-8"?>
-<w:styles xmlns:mc="http://schemas.openxmlformats.org/markup-compatibility/2006" xmlns:r="http://schemas.openxmlformats.org/officeDocument/2006/relationships" xmlns:w="http://schemas.openxmlformats.org/wordprocessingml/2006/main" xmlns:w14="http://schemas.microsoft.com/office/word/2010/wordml" xmlns:w15="http://schemas.microsoft.com/office/word/2012/wordml" xmlns:w16cex="http://schemas.microsoft.com/office/word/2018/wordml/cex" xmlns:w16cid="http://schemas.microsoft.com/office/word/2016/wordml/cid" xmlns:w16="http://schemas.microsoft.com/office/word/2018/wordml" xmlns:w16du="http://schemas.microsoft.com/office/word/2023/wordml/word16du" xmlns:w16sdtdh="http://schemas.microsoft.com/office/word/2020/wordml/sdtdatahash" xmlns:w16sdtfl="http://schemas.microsoft.com/office/word/2024/wordml/sdtformatlock" xmlns:w16se="http://schemas.microsoft.com/office/word/2015/wordml/symex" mc:Ignorable="w14 w15 w16se w16cid w16 w16cex w16sdtdh w16sdtfl w16du">
+<w:styles xmlns:mc="http://schemas.openxmlformats.org/markup-compatibility/2006" xmlns:r="http://schemas.openxmlformats.org/officeDocument/2006/relationships" xmlns:w="http://schemas.openxmlformats.org/wordprocessingml/2006/main" xmlns:w14="http://schemas.microsoft.com/office/word/2010/wordml" xmlns:w15="http://schemas.microsoft.com/office/word/2012/wordml" xmlns:w16cex="http://schemas.microsoft.com/office/word/2018/wordml/cex" xmlns:w16cid="http://schemas.microsoft.com/office/word/2016/wordml/cid" xmlns:w16="http://schemas.microsoft.com/office/word/2018/wordml" xmlns:w16sdtdh="http://schemas.microsoft.com/office/word/2020/wordml/sdtdatahash" xmlns:w16se="http://schemas.microsoft.com/office/word/2015/wordml/symex" mc:Ignorable="w14 w15 w16se w16cid w16 w16cex w16sdtdh">
   <w:docDefaults>
     <w:rPrDefault>
       <w:rPr>

</xml_diff>